<commit_message>
[ADD] improve the implementation
</commit_message>
<xml_diff>
--- a/assets/templates/template_runtest.docx
+++ b/assets/templates/template_runtest.docx
@@ -3237,6 +3237,7 @@
         </w:rPr>
         <w:t>Le présent rapport présente l’analyse des Run Tests réalisée à partir des données SCADA du parc éolien {{</w:t>
       </w:r>
+      <w:proofErr w:type="spellStart"/>
       <w:r>
         <w:rPr>
           <w:rFonts w:ascii="Cambria" w:eastAsia="MS Mincho" w:hAnsi="Cambria"/>
@@ -3246,6 +3247,7 @@
         </w:rPr>
         <w:t>Nom_du_parc</w:t>
       </w:r>
+      <w:proofErr w:type="spellEnd"/>
       <w:r>
         <w:rPr>
           <w:rFonts w:ascii="Cambria" w:eastAsia="MS Mincho" w:hAnsi="Cambria"/>
@@ -3292,6 +3294,7 @@
         </w:rPr>
         <w:t>{{</w:t>
       </w:r>
+      <w:proofErr w:type="spellStart"/>
       <w:r>
         <w:rPr>
           <w:rFonts w:ascii="Cambria" w:eastAsia="MS Mincho" w:hAnsi="Cambria"/>
@@ -3303,6 +3306,7 @@
         </w:rPr>
         <w:t>Nombre_WTG</w:t>
       </w:r>
+      <w:proofErr w:type="spellEnd"/>
       <w:r>
         <w:rPr>
           <w:rFonts w:ascii="Cambria" w:eastAsia="MS Mincho" w:hAnsi="Cambria"/>
@@ -3313,6 +3317,7 @@
         </w:rPr>
         <w:t>}} éoliennes de type {{</w:t>
       </w:r>
+      <w:proofErr w:type="spellStart"/>
       <w:r>
         <w:rPr>
           <w:rFonts w:ascii="Cambria" w:eastAsia="MS Mincho" w:hAnsi="Cambria"/>
@@ -3324,6 +3329,7 @@
         </w:rPr>
         <w:t>Modèle_turbine</w:t>
       </w:r>
+      <w:proofErr w:type="spellEnd"/>
       <w:r>
         <w:rPr>
           <w:rFonts w:ascii="Cambria" w:eastAsia="MS Mincho" w:hAnsi="Cambria"/>
@@ -3352,6 +3358,7 @@
         </w:rPr>
         <w:t>{{</w:t>
       </w:r>
+      <w:proofErr w:type="spellStart"/>
       <w:r>
         <w:rPr>
           <w:rFonts w:ascii="Cambria" w:eastAsia="MS Mincho" w:hAnsi="Cambria"/>
@@ -3363,6 +3370,7 @@
         </w:rPr>
         <w:t>Puissance_nominale</w:t>
       </w:r>
+      <w:proofErr w:type="spellEnd"/>
       <w:r>
         <w:rPr>
           <w:rFonts w:ascii="Cambria" w:eastAsia="MS Mincho" w:hAnsi="Cambria"/>
@@ -3524,35 +3532,64 @@
         <w:spacing w:line="276" w:lineRule="auto"/>
         <w:ind w:left="-57"/>
         <w:jc w:val="center"/>
-        <w:rPr>
-          <w:lang w:val="en-US"/>
-        </w:rPr>
       </w:pPr>
       <w:r>
         <w:rPr>
           <w:rFonts w:ascii="Cambria" w:eastAsia="MS Mincho" w:hAnsi="Cambria"/>
           <w:noProof/>
-          <w:lang w:val="en-US"/>
-        </w:rPr>
-        <w:t>{{table_list_of_client_files}}</w:t>
+        </w:rPr>
+        <w:drawing>
+          <wp:inline distT="0" distB="0" distL="0" distR="0" wp14:anchorId="7758D91F" wp14:editId="268E699B">
+            <wp:extent cx="5852667" cy="1432684"/>
+            <wp:effectExtent l="0" t="0" r="0" b="0"/>
+            <wp:docPr id="627299239" name="Image 1" descr="Une image contenant texte, Police, nombre, capture d’écran&#10;&#10;Le contenu généré par l’IA peut être incorrect."/>
+            <wp:cNvGraphicFramePr>
+              <a:graphicFrameLocks xmlns:a="http://schemas.openxmlformats.org/drawingml/2006/main" noChangeAspect="1"/>
+            </wp:cNvGraphicFramePr>
+            <a:graphic xmlns:a="http://schemas.openxmlformats.org/drawingml/2006/main">
+              <a:graphicData uri="http://schemas.openxmlformats.org/drawingml/2006/picture">
+                <pic:pic xmlns:pic="http://schemas.openxmlformats.org/drawingml/2006/picture">
+                  <pic:nvPicPr>
+                    <pic:cNvPr id="687017687" name="Image 1" descr="Une image contenant texte, Police, nombre, capture d’écran&#10;&#10;Le contenu généré par l’IA peut être incorrect."/>
+                    <pic:cNvPicPr/>
+                  </pic:nvPicPr>
+                  <pic:blipFill>
+                    <a:blip r:embed="rId20"/>
+                    <a:stretch>
+                      <a:fillRect/>
+                    </a:stretch>
+                  </pic:blipFill>
+                  <pic:spPr>
+                    <a:xfrm>
+                      <a:off x="0" y="0"/>
+                      <a:ext cx="5852667" cy="1432684"/>
+                    </a:xfrm>
+                    <a:prstGeom prst="rect">
+                      <a:avLst/>
+                    </a:prstGeom>
+                  </pic:spPr>
+                </pic:pic>
+              </a:graphicData>
+            </a:graphic>
+          </wp:inline>
+        </w:drawing>
       </w:r>
     </w:p>
     <w:p>
       <w:pPr>
         <w:pStyle w:val="Lgende"/>
+        <w:spacing w:after="0"/>
+        <w:ind w:left="-57"/>
         <w:jc w:val="center"/>
-        <w:rPr>
-          <w:rFonts w:ascii="Cambria" w:eastAsia="MS Mincho" w:hAnsi="Cambria"/>
-        </w:rPr>
-      </w:pPr>
-      <w:r>
-        <w:t xml:space="preserve">Tableau </w:t>
+      </w:pPr>
+      <w:r>
+        <w:t xml:space="preserve">Figure </w:t>
       </w:r>
       <w:r>
         <w:fldChar w:fldCharType="begin"/>
       </w:r>
       <w:r>
-        <w:instrText xml:space="preserve"> SEQ Tableau \* ARABIC </w:instrText>
+        <w:instrText xml:space="preserve"> SEQ Figure \* ARABIC </w:instrText>
       </w:r>
       <w:r>
         <w:fldChar w:fldCharType="separate"/>
@@ -3567,8 +3604,23 @@
         <w:fldChar w:fldCharType="end"/>
       </w:r>
       <w:r>
-        <w:t>Liste des fichiers transmis par le client</w:t>
-      </w:r>
+        <w:t xml:space="preserve"> </w:t>
+      </w:r>
+      <w:r>
+        <w:t>Liste des fichiers trans</w:t>
+      </w:r>
+      <w:r>
+        <w:t>mis par le client</w:t>
+      </w:r>
+    </w:p>
+    <w:p>
+      <w:pPr>
+        <w:spacing w:after="200" w:line="276" w:lineRule="auto"/>
+        <w:jc w:val="both"/>
+        <w:rPr>
+          <w:rFonts w:ascii="Cambria" w:eastAsia="MS Mincho" w:hAnsi="Cambria"/>
+        </w:rPr>
+      </w:pPr>
     </w:p>
     <w:p>
       <w:pPr>
@@ -3666,6 +3718,7 @@
         </w:rPr>
         <w:t>{</w:t>
       </w:r>
+      <w:proofErr w:type="spellStart"/>
       <w:r>
         <w:rPr>
           <w:rFonts w:ascii="Cambria" w:eastAsia="MS Mincho" w:hAnsi="Cambria"/>
@@ -3676,6 +3729,7 @@
         </w:rPr>
         <w:t>consecutive_hours_h</w:t>
       </w:r>
+      <w:proofErr w:type="spellEnd"/>
       <w:r>
         <w:rPr>
           <w:rFonts w:ascii="Cambria" w:eastAsia="MS Mincho" w:hAnsi="Cambria"/>
@@ -3780,6 +3834,7 @@
         </w:rPr>
         <w:t>{{</w:t>
       </w:r>
+      <w:proofErr w:type="spellStart"/>
       <w:r>
         <w:rPr>
           <w:rFonts w:ascii="Cambria" w:eastAsia="MS Mincho" w:hAnsi="Cambria"/>
@@ -3790,6 +3845,7 @@
         </w:rPr>
         <w:t>cut_in_to_cut_out_h</w:t>
       </w:r>
+      <w:proofErr w:type="spellEnd"/>
       <w:r>
         <w:rPr>
           <w:rFonts w:ascii="Cambria" w:eastAsia="MS Mincho" w:hAnsi="Cambria"/>
@@ -3820,6 +3876,7 @@
         </w:rPr>
         <w:t>{{</w:t>
       </w:r>
+      <w:proofErr w:type="spellStart"/>
       <w:r>
         <w:rPr>
           <w:rFonts w:ascii="Cambria" w:eastAsia="MS Mincho" w:hAnsi="Cambria"/>
@@ -3830,6 +3887,8 @@
         </w:rPr>
         <w:t>cut_in_v_min</w:t>
       </w:r>
+      <w:proofErr w:type="spellEnd"/>
+      <w:proofErr w:type="gramStart"/>
       <w:r>
         <w:rPr>
           <w:rFonts w:ascii="Cambria" w:eastAsia="MS Mincho" w:hAnsi="Cambria"/>
@@ -3850,6 +3909,7 @@
         </w:rPr>
         <w:t>-</w:t>
       </w:r>
+      <w:proofErr w:type="gramEnd"/>
       <w:r>
         <w:rPr>
           <w:rFonts w:ascii="Cambria" w:eastAsia="MS Mincho" w:hAnsi="Cambria"/>
@@ -3860,6 +3920,7 @@
         </w:rPr>
         <w:t xml:space="preserve"> {{</w:t>
       </w:r>
+      <w:proofErr w:type="spellStart"/>
       <w:r>
         <w:rPr>
           <w:rFonts w:ascii="Cambria" w:eastAsia="MS Mincho" w:hAnsi="Cambria"/>
@@ -3870,6 +3931,8 @@
         </w:rPr>
         <w:t>cut_in_v_max</w:t>
       </w:r>
+      <w:proofErr w:type="spellEnd"/>
+      <w:proofErr w:type="gramStart"/>
       <w:r>
         <w:rPr>
           <w:rFonts w:ascii="Cambria" w:eastAsia="MS Mincho" w:hAnsi="Cambria"/>
@@ -3880,6 +3943,7 @@
         </w:rPr>
         <w:t>}}-</w:t>
       </w:r>
+      <w:proofErr w:type="gramEnd"/>
       <w:r>
         <w:rPr>
           <w:rFonts w:ascii="Cambria" w:eastAsia="MS Mincho" w:hAnsi="Cambria"/>
@@ -3906,6 +3970,7 @@
         </w:rPr>
         <w:t>{{</w:t>
       </w:r>
+      <w:proofErr w:type="spellStart"/>
       <w:r>
         <w:rPr>
           <w:rFonts w:ascii="Cambria" w:eastAsia="MS Mincho" w:hAnsi="Cambria"/>
@@ -3914,6 +3979,7 @@
         </w:rPr>
         <w:t>consecutive_hours_h</w:t>
       </w:r>
+      <w:proofErr w:type="spellEnd"/>
       <w:r>
         <w:rPr>
           <w:rFonts w:ascii="Cambria" w:eastAsia="MS Mincho" w:hAnsi="Cambria"/>
@@ -3938,6 +4004,7 @@
         </w:rPr>
         <w:t>{{</w:t>
       </w:r>
+      <w:proofErr w:type="spellStart"/>
       <w:r>
         <w:rPr>
           <w:rFonts w:ascii="Cambria" w:eastAsia="MS Mincho" w:hAnsi="Cambria"/>
@@ -3946,6 +4013,7 @@
         </w:rPr>
         <w:t>cut_in_to_cut_out_h</w:t>
       </w:r>
+      <w:proofErr w:type="spellEnd"/>
       <w:r>
         <w:rPr>
           <w:rFonts w:ascii="Cambria" w:eastAsia="MS Mincho" w:hAnsi="Cambria"/>
@@ -3968,7 +4036,25 @@
           <w:sz w:val="22"/>
           <w:szCs w:val="22"/>
         </w:rPr>
-        <w:t>{{cut_in_v_min}}</w:t>
+        <w:t>{{</w:t>
+      </w:r>
+      <w:proofErr w:type="spellStart"/>
+      <w:r>
+        <w:rPr>
+          <w:rFonts w:ascii="Cambria" w:eastAsia="MS Mincho" w:hAnsi="Cambria"/>
+          <w:sz w:val="22"/>
+          <w:szCs w:val="22"/>
+        </w:rPr>
+        <w:t>cut_in_v_min</w:t>
+      </w:r>
+      <w:proofErr w:type="spellEnd"/>
+      <w:r>
+        <w:rPr>
+          <w:rFonts w:ascii="Cambria" w:eastAsia="MS Mincho" w:hAnsi="Cambria"/>
+          <w:sz w:val="22"/>
+          <w:szCs w:val="22"/>
+        </w:rPr>
+        <w:t>}}</w:t>
       </w:r>
       <w:r>
         <w:rPr>
@@ -3984,7 +4070,25 @@
           <w:sz w:val="22"/>
           <w:szCs w:val="22"/>
         </w:rPr>
-        <w:t>{{cut_in_v_max}}</w:t>
+        <w:t>{{</w:t>
+      </w:r>
+      <w:proofErr w:type="spellStart"/>
+      <w:r>
+        <w:rPr>
+          <w:rFonts w:ascii="Cambria" w:eastAsia="MS Mincho" w:hAnsi="Cambria"/>
+          <w:sz w:val="22"/>
+          <w:szCs w:val="22"/>
+        </w:rPr>
+        <w:t>cut_in_v_max</w:t>
+      </w:r>
+      <w:proofErr w:type="spellEnd"/>
+      <w:r>
+        <w:rPr>
+          <w:rFonts w:ascii="Cambria" w:eastAsia="MS Mincho" w:hAnsi="Cambria"/>
+          <w:sz w:val="22"/>
+          <w:szCs w:val="22"/>
+        </w:rPr>
+        <w:t>}}</w:t>
       </w:r>
       <w:r>
         <w:rPr>
@@ -4058,6 +4162,7 @@
         </w:rPr>
         <w:t>{{</w:t>
       </w:r>
+      <w:proofErr w:type="spellStart"/>
       <w:r>
         <w:rPr>
           <w:rFonts w:ascii="Cambria" w:eastAsia="MS Mincho" w:hAnsi="Cambria"/>
@@ -4068,6 +4173,7 @@
         </w:rPr>
         <w:t>nominal_power_h</w:t>
       </w:r>
+      <w:proofErr w:type="spellEnd"/>
       <w:r>
         <w:rPr>
           <w:rFonts w:ascii="Cambria" w:eastAsia="MS Mincho" w:hAnsi="Cambria"/>
@@ -4098,6 +4204,7 @@
         </w:rPr>
         <w:t>{{</w:t>
       </w:r>
+      <w:proofErr w:type="spellStart"/>
       <w:r>
         <w:rPr>
           <w:rFonts w:ascii="Cambria" w:eastAsia="MS Mincho" w:hAnsi="Cambria"/>
@@ -4106,8 +4213,9 @@
           <w:sz w:val="22"/>
           <w:szCs w:val="22"/>
         </w:rPr>
-        <w:t xml:space="preserve">nominal_power_pct </w:t>
-      </w:r>
+        <w:t>nominal_power_</w:t>
+      </w:r>
+      <w:proofErr w:type="gramStart"/>
       <w:r>
         <w:rPr>
           <w:rFonts w:ascii="Cambria" w:eastAsia="MS Mincho" w:hAnsi="Cambria"/>
@@ -4116,8 +4224,9 @@
           <w:sz w:val="22"/>
           <w:szCs w:val="22"/>
         </w:rPr>
-        <w:t>}}</w:t>
-      </w:r>
+        <w:t>pct</w:t>
+      </w:r>
+      <w:proofErr w:type="spellEnd"/>
       <w:r>
         <w:rPr>
           <w:rFonts w:ascii="Cambria" w:eastAsia="MS Mincho" w:hAnsi="Cambria"/>
@@ -4126,6 +4235,37 @@
           <w:sz w:val="22"/>
           <w:szCs w:val="22"/>
         </w:rPr>
+        <w:t xml:space="preserve"> </w:t>
+      </w:r>
+      <w:r>
+        <w:rPr>
+          <w:rFonts w:ascii="Cambria" w:eastAsia="MS Mincho" w:hAnsi="Cambria"/>
+          <w:b/>
+          <w:bCs/>
+          <w:sz w:val="22"/>
+          <w:szCs w:val="22"/>
+        </w:rPr>
+        <w:t>}</w:t>
+      </w:r>
+      <w:proofErr w:type="gramEnd"/>
+      <w:r>
+        <w:rPr>
+          <w:rFonts w:ascii="Cambria" w:eastAsia="MS Mincho" w:hAnsi="Cambria"/>
+          <w:b/>
+          <w:bCs/>
+          <w:sz w:val="22"/>
+          <w:szCs w:val="22"/>
+        </w:rPr>
+        <w:t>}</w:t>
+      </w:r>
+      <w:r>
+        <w:rPr>
+          <w:rFonts w:ascii="Cambria" w:eastAsia="MS Mincho" w:hAnsi="Cambria"/>
+          <w:b/>
+          <w:bCs/>
+          <w:sz w:val="22"/>
+          <w:szCs w:val="22"/>
+        </w:rPr>
         <w:t xml:space="preserve"> % ou plus de la puissance nominale :</w:t>
       </w:r>
       <w:r>
@@ -4136,6 +4276,7 @@
         </w:rPr>
         <w:t xml:space="preserve"> L'éolienne doit fonctionner pendant au moins </w:t>
       </w:r>
+      <w:proofErr w:type="gramStart"/>
       <w:r>
         <w:rPr>
           <w:rFonts w:ascii="Cambria" w:eastAsia="MS Mincho" w:hAnsi="Cambria"/>
@@ -4150,8 +4291,27 @@
           <w:sz w:val="22"/>
           <w:szCs w:val="22"/>
         </w:rPr>
-        <w:t xml:space="preserve"> nominal_power_h</w:t>
-      </w:r>
+        <w:t xml:space="preserve"> </w:t>
+      </w:r>
+      <w:proofErr w:type="spellStart"/>
+      <w:r>
+        <w:rPr>
+          <w:rFonts w:ascii="Cambria" w:eastAsia="MS Mincho" w:hAnsi="Cambria"/>
+          <w:sz w:val="22"/>
+          <w:szCs w:val="22"/>
+        </w:rPr>
+        <w:t>nominal</w:t>
+      </w:r>
+      <w:proofErr w:type="gramEnd"/>
+      <w:r>
+        <w:rPr>
+          <w:rFonts w:ascii="Cambria" w:eastAsia="MS Mincho" w:hAnsi="Cambria"/>
+          <w:sz w:val="22"/>
+          <w:szCs w:val="22"/>
+        </w:rPr>
+        <w:t>_power_h</w:t>
+      </w:r>
+      <w:proofErr w:type="spellEnd"/>
       <w:r>
         <w:rPr>
           <w:rFonts w:ascii="Cambria" w:eastAsia="MS Mincho" w:hAnsi="Cambria"/>
@@ -4176,6 +4336,7 @@
         </w:rPr>
         <w:t>{{</w:t>
       </w:r>
+      <w:proofErr w:type="spellStart"/>
       <w:r>
         <w:rPr>
           <w:rFonts w:ascii="Cambria" w:eastAsia="MS Mincho" w:hAnsi="Cambria"/>
@@ -4192,6 +4353,8 @@
         </w:rPr>
         <w:t>_pct</w:t>
       </w:r>
+      <w:proofErr w:type="spellEnd"/>
+      <w:proofErr w:type="gramStart"/>
       <w:r>
         <w:rPr>
           <w:rFonts w:ascii="Cambria" w:eastAsia="MS Mincho" w:hAnsi="Cambria"/>
@@ -4206,7 +4369,16 @@
           <w:sz w:val="22"/>
           <w:szCs w:val="22"/>
         </w:rPr>
-        <w:t xml:space="preserve">% ou plus de sa puissance nominale. </w:t>
+        <w:t>%</w:t>
+      </w:r>
+      <w:proofErr w:type="gramEnd"/>
+      <w:r>
+        <w:rPr>
+          <w:rFonts w:ascii="Cambria" w:eastAsia="MS Mincho" w:hAnsi="Cambria"/>
+          <w:sz w:val="22"/>
+          <w:szCs w:val="22"/>
+        </w:rPr>
+        <w:t xml:space="preserve"> ou plus de sa puissance nominale. </w:t>
       </w:r>
     </w:p>
     <w:p>
@@ -4232,8 +4404,10 @@
           <w:sz w:val="22"/>
           <w:szCs w:val="22"/>
         </w:rPr>
-        <w:t>Critère 4 - Confirmations locales / redémarrages (&lt;=</w:t>
-      </w:r>
+        <w:lastRenderedPageBreak/>
+        <w:t>Critère 4 - Confirmations locales / redémarrages (&lt;</w:t>
+      </w:r>
+      <w:proofErr w:type="gramStart"/>
       <w:r>
         <w:rPr>
           <w:rFonts w:ascii="Cambria" w:eastAsia="MS Mincho" w:hAnsi="Cambria"/>
@@ -4242,7 +4416,7 @@
           <w:sz w:val="22"/>
           <w:szCs w:val="22"/>
         </w:rPr>
-        <w:t>{{</w:t>
+        <w:t>=</w:t>
       </w:r>
       <w:r>
         <w:rPr>
@@ -4252,8 +4426,9 @@
           <w:sz w:val="22"/>
           <w:szCs w:val="22"/>
         </w:rPr>
-        <w:t xml:space="preserve">local_restarts_max </w:t>
-      </w:r>
+        <w:t>{</w:t>
+      </w:r>
+      <w:proofErr w:type="gramEnd"/>
       <w:r>
         <w:rPr>
           <w:rFonts w:ascii="Cambria" w:eastAsia="MS Mincho" w:hAnsi="Cambria"/>
@@ -4262,7 +4437,61 @@
           <w:sz w:val="22"/>
           <w:szCs w:val="22"/>
         </w:rPr>
-        <w:t>}}</w:t>
+        <w:t>{</w:t>
+      </w:r>
+      <w:proofErr w:type="spellStart"/>
+      <w:r>
+        <w:rPr>
+          <w:rFonts w:ascii="Cambria" w:eastAsia="MS Mincho" w:hAnsi="Cambria"/>
+          <w:b/>
+          <w:bCs/>
+          <w:sz w:val="22"/>
+          <w:szCs w:val="22"/>
+        </w:rPr>
+        <w:t>local_restarts_</w:t>
+      </w:r>
+      <w:proofErr w:type="gramStart"/>
+      <w:r>
+        <w:rPr>
+          <w:rFonts w:ascii="Cambria" w:eastAsia="MS Mincho" w:hAnsi="Cambria"/>
+          <w:b/>
+          <w:bCs/>
+          <w:sz w:val="22"/>
+          <w:szCs w:val="22"/>
+        </w:rPr>
+        <w:t>max</w:t>
+      </w:r>
+      <w:proofErr w:type="spellEnd"/>
+      <w:r>
+        <w:rPr>
+          <w:rFonts w:ascii="Cambria" w:eastAsia="MS Mincho" w:hAnsi="Cambria"/>
+          <w:b/>
+          <w:bCs/>
+          <w:sz w:val="22"/>
+          <w:szCs w:val="22"/>
+        </w:rPr>
+        <w:t xml:space="preserve"> </w:t>
+      </w:r>
+      <w:r>
+        <w:rPr>
+          <w:rFonts w:ascii="Cambria" w:eastAsia="MS Mincho" w:hAnsi="Cambria"/>
+          <w:b/>
+          <w:bCs/>
+          <w:sz w:val="22"/>
+          <w:szCs w:val="22"/>
+        </w:rPr>
+        <w:t>}</w:t>
+      </w:r>
+      <w:proofErr w:type="gramEnd"/>
+      <w:r>
+        <w:rPr>
+          <w:rFonts w:ascii="Cambria" w:eastAsia="MS Mincho" w:hAnsi="Cambria"/>
+          <w:b/>
+          <w:bCs/>
+          <w:sz w:val="22"/>
+          <w:szCs w:val="22"/>
+        </w:rPr>
+        <w:t>}</w:t>
       </w:r>
       <w:r>
         <w:rPr>
@@ -4306,8 +4535,9 @@
           <w:sz w:val="22"/>
           <w:szCs w:val="22"/>
         </w:rPr>
-        <w:t>Critère 5 - Disponibilité (&gt;=</w:t>
-      </w:r>
+        <w:t>Critère 5 - Disponibilité (&gt;</w:t>
+      </w:r>
+      <w:proofErr w:type="gramStart"/>
       <w:r>
         <w:rPr>
           <w:rFonts w:ascii="Cambria" w:eastAsia="MS Mincho" w:hAnsi="Cambria"/>
@@ -4316,7 +4546,7 @@
           <w:sz w:val="22"/>
           <w:szCs w:val="22"/>
         </w:rPr>
-        <w:t>{{</w:t>
+        <w:t>=</w:t>
       </w:r>
       <w:r>
         <w:rPr>
@@ -4326,8 +4556,9 @@
           <w:sz w:val="22"/>
           <w:szCs w:val="22"/>
         </w:rPr>
-        <w:t xml:space="preserve">availability_min_pct </w:t>
-      </w:r>
+        <w:t>{</w:t>
+      </w:r>
+      <w:proofErr w:type="gramEnd"/>
       <w:r>
         <w:rPr>
           <w:rFonts w:ascii="Cambria" w:eastAsia="MS Mincho" w:hAnsi="Cambria"/>
@@ -4336,7 +4567,61 @@
           <w:sz w:val="22"/>
           <w:szCs w:val="22"/>
         </w:rPr>
-        <w:t>}}</w:t>
+        <w:t>{</w:t>
+      </w:r>
+      <w:proofErr w:type="spellStart"/>
+      <w:r>
+        <w:rPr>
+          <w:rFonts w:ascii="Cambria" w:eastAsia="MS Mincho" w:hAnsi="Cambria"/>
+          <w:b/>
+          <w:bCs/>
+          <w:sz w:val="22"/>
+          <w:szCs w:val="22"/>
+        </w:rPr>
+        <w:t>availability_min_</w:t>
+      </w:r>
+      <w:proofErr w:type="gramStart"/>
+      <w:r>
+        <w:rPr>
+          <w:rFonts w:ascii="Cambria" w:eastAsia="MS Mincho" w:hAnsi="Cambria"/>
+          <w:b/>
+          <w:bCs/>
+          <w:sz w:val="22"/>
+          <w:szCs w:val="22"/>
+        </w:rPr>
+        <w:t>pct</w:t>
+      </w:r>
+      <w:proofErr w:type="spellEnd"/>
+      <w:r>
+        <w:rPr>
+          <w:rFonts w:ascii="Cambria" w:eastAsia="MS Mincho" w:hAnsi="Cambria"/>
+          <w:b/>
+          <w:bCs/>
+          <w:sz w:val="22"/>
+          <w:szCs w:val="22"/>
+        </w:rPr>
+        <w:t xml:space="preserve"> </w:t>
+      </w:r>
+      <w:r>
+        <w:rPr>
+          <w:rFonts w:ascii="Cambria" w:eastAsia="MS Mincho" w:hAnsi="Cambria"/>
+          <w:b/>
+          <w:bCs/>
+          <w:sz w:val="22"/>
+          <w:szCs w:val="22"/>
+        </w:rPr>
+        <w:t>}</w:t>
+      </w:r>
+      <w:proofErr w:type="gramEnd"/>
+      <w:r>
+        <w:rPr>
+          <w:rFonts w:ascii="Cambria" w:eastAsia="MS Mincho" w:hAnsi="Cambria"/>
+          <w:b/>
+          <w:bCs/>
+          <w:sz w:val="22"/>
+          <w:szCs w:val="22"/>
+        </w:rPr>
+        <w:t>}</w:t>
       </w:r>
       <w:r>
         <w:rPr>
@@ -4384,7 +4669,6 @@
           <w:sz w:val="28"/>
           <w:szCs w:val="28"/>
         </w:rPr>
-        <w:lastRenderedPageBreak/>
         <w:t>Synthèse des résultats des Run Tests</w:t>
       </w:r>
       <w:bookmarkEnd w:id="14"/>
@@ -4412,59 +4696,294 @@
         <w:t> :</w:t>
       </w:r>
     </w:p>
+    <w:tbl>
+      <w:tblPr>
+        <w:tblStyle w:val="TableauGrille4-Accentuation1"/>
+        <w:tblW w:w="0" w:type="auto"/>
+        <w:tblLook w:val="04A0" w:firstRow="1" w:lastRow="0" w:firstColumn="1" w:lastColumn="0" w:noHBand="0" w:noVBand="1"/>
+      </w:tblPr>
+      <w:tblGrid>
+        <w:gridCol w:w="1369"/>
+        <w:gridCol w:w="1960"/>
+        <w:gridCol w:w="1894"/>
+        <w:gridCol w:w="2339"/>
+        <w:gridCol w:w="2178"/>
+      </w:tblGrid>
+      <w:tr>
+        <w:trPr>
+          <w:cnfStyle w:val="100000000000" w:firstRow="1" w:lastRow="0" w:firstColumn="0" w:lastColumn="0" w:oddVBand="0" w:evenVBand="0" w:oddHBand="0" w:evenHBand="0" w:firstRowFirstColumn="0" w:firstRowLastColumn="0" w:lastRowFirstColumn="0" w:lastRowLastColumn="0"/>
+        </w:trPr>
+        <w:tc>
+          <w:tcPr>
+            <w:cnfStyle w:val="001000000000" w:firstRow="0" w:lastRow="0" w:firstColumn="1" w:lastColumn="0" w:oddVBand="0" w:evenVBand="0" w:oddHBand="0" w:evenHBand="0" w:firstRowFirstColumn="0" w:firstRowLastColumn="0" w:lastRowFirstColumn="0" w:lastRowLastColumn="0"/>
+            <w:tcW w:w="2092" w:type="dxa"/>
+          </w:tcPr>
+          <w:p>
+            <w:pPr>
+              <w:spacing w:after="200" w:line="276" w:lineRule="auto"/>
+              <w:jc w:val="both"/>
+              <w:rPr>
+                <w:rFonts w:ascii="Arial" w:eastAsia="MS Mincho" w:hAnsi="Arial" w:cs="Arial"/>
+              </w:rPr>
+            </w:pPr>
+            <w:r>
+              <w:rPr>
+                <w:rFonts w:ascii="Arial" w:eastAsia="MS Mincho" w:hAnsi="Arial" w:cs="Arial"/>
+              </w:rPr>
+              <w:t>Eolienne</w:t>
+            </w:r>
+          </w:p>
+        </w:tc>
+        <w:tc>
+          <w:tcPr>
+            <w:tcW w:w="2000" w:type="dxa"/>
+          </w:tcPr>
+          <w:p>
+            <w:pPr>
+              <w:spacing w:after="200" w:line="276" w:lineRule="auto"/>
+              <w:jc w:val="both"/>
+              <w:cnfStyle w:val="100000000000" w:firstRow="1" w:lastRow="0" w:firstColumn="0" w:lastColumn="0" w:oddVBand="0" w:evenVBand="0" w:oddHBand="0" w:evenHBand="0" w:firstRowFirstColumn="0" w:firstRowLastColumn="0" w:lastRowFirstColumn="0" w:lastRowLastColumn="0"/>
+              <w:rPr>
+                <w:rFonts w:ascii="Arial" w:eastAsia="MS Mincho" w:hAnsi="Arial" w:cs="Arial"/>
+              </w:rPr>
+            </w:pPr>
+            <w:r>
+              <w:rPr>
+                <w:rFonts w:ascii="Arial" w:eastAsia="MS Mincho" w:hAnsi="Arial" w:cs="Arial"/>
+              </w:rPr>
+              <w:t>Date début</w:t>
+            </w:r>
+          </w:p>
+        </w:tc>
+        <w:tc>
+          <w:tcPr>
+            <w:tcW w:w="1935" w:type="dxa"/>
+          </w:tcPr>
+          <w:p>
+            <w:pPr>
+              <w:spacing w:after="200" w:line="276" w:lineRule="auto"/>
+              <w:jc w:val="both"/>
+              <w:cnfStyle w:val="100000000000" w:firstRow="1" w:lastRow="0" w:firstColumn="0" w:lastColumn="0" w:oddVBand="0" w:evenVBand="0" w:oddHBand="0" w:evenHBand="0" w:firstRowFirstColumn="0" w:firstRowLastColumn="0" w:lastRowFirstColumn="0" w:lastRowLastColumn="0"/>
+              <w:rPr>
+                <w:rFonts w:ascii="Arial" w:eastAsia="MS Mincho" w:hAnsi="Arial" w:cs="Arial"/>
+              </w:rPr>
+            </w:pPr>
+            <w:r>
+              <w:rPr>
+                <w:rFonts w:ascii="Arial" w:eastAsia="MS Mincho" w:hAnsi="Arial" w:cs="Arial"/>
+              </w:rPr>
+              <w:t xml:space="preserve">Date fin </w:t>
+            </w:r>
+          </w:p>
+        </w:tc>
+        <w:tc>
+          <w:tcPr>
+            <w:tcW w:w="2033" w:type="dxa"/>
+          </w:tcPr>
+          <w:p>
+            <w:pPr>
+              <w:spacing w:after="200" w:line="276" w:lineRule="auto"/>
+              <w:jc w:val="both"/>
+              <w:cnfStyle w:val="100000000000" w:firstRow="1" w:lastRow="0" w:firstColumn="0" w:lastColumn="0" w:oddVBand="0" w:evenVBand="0" w:oddHBand="0" w:evenHBand="0" w:firstRowFirstColumn="0" w:firstRowLastColumn="0" w:lastRowFirstColumn="0" w:lastRowLastColumn="0"/>
+              <w:rPr>
+                <w:rFonts w:ascii="Arial" w:eastAsia="MS Mincho" w:hAnsi="Arial" w:cs="Arial"/>
+              </w:rPr>
+            </w:pPr>
+            <w:proofErr w:type="spellStart"/>
+            <w:r>
+              <w:rPr>
+                <w:rFonts w:ascii="Arial" w:eastAsia="MS Mincho" w:hAnsi="Arial" w:cs="Arial"/>
+              </w:rPr>
+              <w:t>Duréée</w:t>
+            </w:r>
+            <w:proofErr w:type="spellEnd"/>
+            <w:r>
+              <w:rPr>
+                <w:rFonts w:ascii="Arial" w:eastAsia="MS Mincho" w:hAnsi="Arial" w:cs="Arial"/>
+              </w:rPr>
+              <w:t xml:space="preserve"> du test [h]</w:t>
+            </w:r>
+          </w:p>
+        </w:tc>
+        <w:tc>
+          <w:tcPr>
+            <w:tcW w:w="1820" w:type="dxa"/>
+          </w:tcPr>
+          <w:p>
+            <w:pPr>
+              <w:spacing w:after="200" w:line="276" w:lineRule="auto"/>
+              <w:jc w:val="both"/>
+              <w:cnfStyle w:val="100000000000" w:firstRow="1" w:lastRow="0" w:firstColumn="0" w:lastColumn="0" w:oddVBand="0" w:evenVBand="0" w:oddHBand="0" w:evenHBand="0" w:firstRowFirstColumn="0" w:firstRowLastColumn="0" w:lastRowFirstColumn="0" w:lastRowLastColumn="0"/>
+              <w:rPr>
+                <w:rFonts w:ascii="Arial" w:eastAsia="MS Mincho" w:hAnsi="Arial" w:cs="Arial"/>
+              </w:rPr>
+            </w:pPr>
+            <w:r>
+              <w:rPr>
+                <w:rFonts w:ascii="Arial" w:eastAsia="MS Mincho" w:hAnsi="Arial" w:cs="Arial"/>
+              </w:rPr>
+              <w:t>Run Test</w:t>
+            </w:r>
+          </w:p>
+        </w:tc>
+      </w:tr>
+      <w:tr>
+        <w:trPr>
+          <w:cnfStyle w:val="000000100000" w:firstRow="0" w:lastRow="0" w:firstColumn="0" w:lastColumn="0" w:oddVBand="0" w:evenVBand="0" w:oddHBand="1" w:evenHBand="0" w:firstRowFirstColumn="0" w:firstRowLastColumn="0" w:lastRowFirstColumn="0" w:lastRowLastColumn="0"/>
+        </w:trPr>
+        <w:tc>
+          <w:tcPr>
+            <w:cnfStyle w:val="001000000000" w:firstRow="0" w:lastRow="0" w:firstColumn="1" w:lastColumn="0" w:oddVBand="0" w:evenVBand="0" w:oddHBand="0" w:evenHBand="0" w:firstRowFirstColumn="0" w:firstRowLastColumn="0" w:lastRowFirstColumn="0" w:lastRowLastColumn="0"/>
+            <w:tcW w:w="2092" w:type="dxa"/>
+          </w:tcPr>
+          <w:p>
+            <w:pPr>
+              <w:spacing w:after="200" w:line="276" w:lineRule="auto"/>
+              <w:jc w:val="center"/>
+              <w:rPr>
+                <w:rFonts w:ascii="Arial" w:eastAsia="MS Mincho" w:hAnsi="Arial" w:cs="Arial"/>
+              </w:rPr>
+            </w:pPr>
+            <w:r>
+              <w:rPr>
+                <w:rFonts w:ascii="Arial" w:eastAsia="MS Mincho" w:hAnsi="Arial" w:cs="Arial"/>
+              </w:rPr>
+              <w:t>{{</w:t>
+            </w:r>
+            <w:r>
+              <w:rPr>
+                <w:rFonts w:ascii="Arial" w:eastAsia="MS Mincho" w:hAnsi="Arial" w:cs="Arial"/>
+              </w:rPr>
+              <w:t>E1</w:t>
+            </w:r>
+            <w:r>
+              <w:rPr>
+                <w:rFonts w:ascii="Arial" w:eastAsia="MS Mincho" w:hAnsi="Arial" w:cs="Arial"/>
+              </w:rPr>
+              <w:t>}}</w:t>
+            </w:r>
+          </w:p>
+        </w:tc>
+        <w:tc>
+          <w:tcPr>
+            <w:tcW w:w="2000" w:type="dxa"/>
+          </w:tcPr>
+          <w:p>
+            <w:pPr>
+              <w:spacing w:after="200" w:line="276" w:lineRule="auto"/>
+              <w:jc w:val="center"/>
+              <w:cnfStyle w:val="000000100000" w:firstRow="0" w:lastRow="0" w:firstColumn="0" w:lastColumn="0" w:oddVBand="0" w:evenVBand="0" w:oddHBand="1" w:evenHBand="0" w:firstRowFirstColumn="0" w:firstRowLastColumn="0" w:lastRowFirstColumn="0" w:lastRowLastColumn="0"/>
+              <w:rPr>
+                <w:rFonts w:ascii="Arial" w:eastAsia="MS Mincho" w:hAnsi="Arial" w:cs="Arial"/>
+              </w:rPr>
+            </w:pPr>
+            <w:r>
+              <w:rPr>
+                <w:rFonts w:ascii="Arial" w:eastAsia="MS Mincho" w:hAnsi="Arial" w:cs="Arial"/>
+              </w:rPr>
+              <w:t>{{start_test_E1}}</w:t>
+            </w:r>
+          </w:p>
+        </w:tc>
+        <w:tc>
+          <w:tcPr>
+            <w:tcW w:w="1935" w:type="dxa"/>
+          </w:tcPr>
+          <w:p>
+            <w:pPr>
+              <w:spacing w:after="200" w:line="276" w:lineRule="auto"/>
+              <w:jc w:val="center"/>
+              <w:cnfStyle w:val="000000100000" w:firstRow="0" w:lastRow="0" w:firstColumn="0" w:lastColumn="0" w:oddVBand="0" w:evenVBand="0" w:oddHBand="1" w:evenHBand="0" w:firstRowFirstColumn="0" w:firstRowLastColumn="0" w:lastRowFirstColumn="0" w:lastRowLastColumn="0"/>
+              <w:rPr>
+                <w:rFonts w:ascii="Arial" w:eastAsia="MS Mincho" w:hAnsi="Arial" w:cs="Arial"/>
+              </w:rPr>
+            </w:pPr>
+            <w:r>
+              <w:rPr>
+                <w:rFonts w:ascii="Arial" w:eastAsia="MS Mincho" w:hAnsi="Arial" w:cs="Arial"/>
+              </w:rPr>
+              <w:t>{{end_test_E1}}</w:t>
+            </w:r>
+          </w:p>
+        </w:tc>
+        <w:tc>
+          <w:tcPr>
+            <w:tcW w:w="2033" w:type="dxa"/>
+          </w:tcPr>
+          <w:p>
+            <w:pPr>
+              <w:spacing w:after="200" w:line="276" w:lineRule="auto"/>
+              <w:jc w:val="center"/>
+              <w:cnfStyle w:val="000000100000" w:firstRow="0" w:lastRow="0" w:firstColumn="0" w:lastColumn="0" w:oddVBand="0" w:evenVBand="0" w:oddHBand="1" w:evenHBand="0" w:firstRowFirstColumn="0" w:firstRowLastColumn="0" w:lastRowFirstColumn="0" w:lastRowLastColumn="0"/>
+              <w:rPr>
+                <w:rFonts w:ascii="Arial" w:eastAsia="MS Mincho" w:hAnsi="Arial" w:cs="Arial"/>
+              </w:rPr>
+            </w:pPr>
+            <w:r>
+              <w:rPr>
+                <w:rFonts w:ascii="Arial" w:eastAsia="MS Mincho" w:hAnsi="Arial" w:cs="Arial"/>
+              </w:rPr>
+              <w:t>{{</w:t>
+            </w:r>
+            <w:proofErr w:type="spellStart"/>
+            <w:r>
+              <w:rPr>
+                <w:rFonts w:ascii="Arial" w:eastAsia="MS Mincho" w:hAnsi="Arial" w:cs="Arial"/>
+              </w:rPr>
+              <w:t>duration_in_hour</w:t>
+            </w:r>
+            <w:proofErr w:type="spellEnd"/>
+            <w:r>
+              <w:rPr>
+                <w:rFonts w:ascii="Arial" w:eastAsia="MS Mincho" w:hAnsi="Arial" w:cs="Arial"/>
+              </w:rPr>
+              <w:t>}}</w:t>
+            </w:r>
+          </w:p>
+        </w:tc>
+        <w:tc>
+          <w:tcPr>
+            <w:tcW w:w="1820" w:type="dxa"/>
+          </w:tcPr>
+          <w:p>
+            <w:pPr>
+              <w:keepNext/>
+              <w:spacing w:after="200" w:line="276" w:lineRule="auto"/>
+              <w:jc w:val="center"/>
+              <w:cnfStyle w:val="000000100000" w:firstRow="0" w:lastRow="0" w:firstColumn="0" w:lastColumn="0" w:oddVBand="0" w:evenVBand="0" w:oddHBand="1" w:evenHBand="0" w:firstRowFirstColumn="0" w:firstRowLastColumn="0" w:lastRowFirstColumn="0" w:lastRowLastColumn="0"/>
+              <w:rPr>
+                <w:rFonts w:ascii="Arial" w:eastAsia="MS Mincho" w:hAnsi="Arial" w:cs="Arial"/>
+              </w:rPr>
+            </w:pPr>
+            <w:r>
+              <w:rPr>
+                <w:rFonts w:ascii="Arial" w:eastAsia="MS Mincho" w:hAnsi="Arial" w:cs="Arial"/>
+              </w:rPr>
+              <w:t>{{</w:t>
+            </w:r>
+            <w:proofErr w:type="spellStart"/>
+            <w:r>
+              <w:rPr>
+                <w:rFonts w:ascii="Arial" w:eastAsia="MS Mincho" w:hAnsi="Arial" w:cs="Arial"/>
+              </w:rPr>
+              <w:t>status_run_test</w:t>
+            </w:r>
+            <w:proofErr w:type="spellEnd"/>
+            <w:r>
+              <w:rPr>
+                <w:rFonts w:ascii="Arial" w:eastAsia="MS Mincho" w:hAnsi="Arial" w:cs="Arial"/>
+              </w:rPr>
+              <w:t>}}</w:t>
+            </w:r>
+          </w:p>
+        </w:tc>
+      </w:tr>
+    </w:tbl>
     <w:p>
       <w:pPr>
         <w:pStyle w:val="Lgende"/>
         <w:jc w:val="center"/>
         <w:rPr>
-          <w:i w:val="0"/>
-          <w:iCs w:val="0"/>
-          <w:sz w:val="22"/>
-          <w:szCs w:val="22"/>
-        </w:rPr>
-      </w:pPr>
-      <w:r>
-        <w:rPr>
-          <w:i w:val="0"/>
-          <w:iCs w:val="0"/>
-          <w:sz w:val="22"/>
-          <w:szCs w:val="22"/>
-        </w:rPr>
-        <w:t>{{</w:t>
-      </w:r>
-      <w:r>
-        <w:rPr>
-          <w:i w:val="0"/>
-          <w:iCs w:val="0"/>
-          <w:sz w:val="22"/>
-          <w:szCs w:val="22"/>
-        </w:rPr>
-        <w:t xml:space="preserve">summary_table </w:t>
-      </w:r>
-      <w:r>
-        <w:rPr>
-          <w:i w:val="0"/>
-          <w:iCs w:val="0"/>
-          <w:sz w:val="22"/>
-          <w:szCs w:val="22"/>
-        </w:rPr>
-        <w:t xml:space="preserve"> </w:t>
-      </w:r>
-      <w:r>
-        <w:rPr>
-          <w:i w:val="0"/>
-          <w:iCs w:val="0"/>
-          <w:sz w:val="22"/>
-          <w:szCs w:val="22"/>
-        </w:rPr>
-        <w:t>}}</w:t>
-      </w:r>
-    </w:p>
-    <w:p>
-      <w:pPr>
-        <w:pStyle w:val="Lgende"/>
-        <w:jc w:val="center"/>
-        <w:rPr>
           <w:rFonts w:ascii="Cambria" w:eastAsia="MS Mincho" w:hAnsi="Cambria"/>
         </w:rPr>
       </w:pPr>
@@ -4484,7 +5003,7 @@
         <w:rPr>
           <w:noProof/>
         </w:rPr>
-        <w:t>2</w:t>
+        <w:t>1</w:t>
       </w:r>
       <w:r>
         <w:fldChar w:fldCharType="end"/>
@@ -4689,7 +5208,6 @@
     </w:p>
     <w:p>
       <w:pPr>
-        <w:jc w:val="center"/>
         <w:rPr>
           <w:rFonts w:eastAsia="MS Gothic"/>
         </w:rPr>
@@ -4698,21 +5216,200 @@
         <w:rPr>
           <w:rFonts w:eastAsia="MS Gothic"/>
         </w:rPr>
-        <w:t>{{</w:t>
-      </w:r>
-      <w:r>
-        <w:rPr>
-          <w:rFonts w:eastAsia="MS Gothic"/>
-        </w:rPr>
-        <w:t>consecutive_hours_table</w:t>
-      </w:r>
-      <w:r>
-        <w:rPr>
-          <w:rFonts w:eastAsia="MS Gothic"/>
-        </w:rPr>
-        <w:t>}}</w:t>
+        <w:tab/>
       </w:r>
     </w:p>
+    <w:tbl>
+      <w:tblPr>
+        <w:tblStyle w:val="TableauGrille4-Accentuation1"/>
+        <w:tblW w:w="9680" w:type="dxa"/>
+        <w:tblInd w:w="-5" w:type="dxa"/>
+        <w:tblLook w:val="04A0" w:firstRow="1" w:lastRow="0" w:firstColumn="1" w:lastColumn="0" w:noHBand="0" w:noVBand="1"/>
+      </w:tblPr>
+      <w:tblGrid>
+        <w:gridCol w:w="2457"/>
+        <w:gridCol w:w="2437"/>
+        <w:gridCol w:w="2409"/>
+        <w:gridCol w:w="2377"/>
+      </w:tblGrid>
+      <w:tr>
+        <w:trPr>
+          <w:cnfStyle w:val="100000000000" w:firstRow="1" w:lastRow="0" w:firstColumn="0" w:lastColumn="0" w:oddVBand="0" w:evenVBand="0" w:oddHBand="0" w:evenHBand="0" w:firstRowFirstColumn="0" w:firstRowLastColumn="0" w:lastRowFirstColumn="0" w:lastRowLastColumn="0"/>
+        </w:trPr>
+        <w:tc>
+          <w:tcPr>
+            <w:cnfStyle w:val="001000000000" w:firstRow="0" w:lastRow="0" w:firstColumn="1" w:lastColumn="0" w:oddVBand="0" w:evenVBand="0" w:oddHBand="0" w:evenHBand="0" w:firstRowFirstColumn="0" w:firstRowLastColumn="0" w:lastRowFirstColumn="0" w:lastRowLastColumn="0"/>
+            <w:tcW w:w="2457" w:type="dxa"/>
+          </w:tcPr>
+          <w:p>
+            <w:pPr>
+              <w:rPr>
+                <w:rFonts w:ascii="Arial" w:eastAsia="MS Gothic" w:hAnsi="Arial" w:cs="Arial"/>
+              </w:rPr>
+            </w:pPr>
+            <w:r>
+              <w:rPr>
+                <w:rFonts w:ascii="Arial" w:eastAsia="MS Gothic" w:hAnsi="Arial" w:cs="Arial"/>
+              </w:rPr>
+              <w:t>Eolienne</w:t>
+            </w:r>
+          </w:p>
+        </w:tc>
+        <w:tc>
+          <w:tcPr>
+            <w:tcW w:w="2437" w:type="dxa"/>
+          </w:tcPr>
+          <w:p>
+            <w:pPr>
+              <w:cnfStyle w:val="100000000000" w:firstRow="1" w:lastRow="0" w:firstColumn="0" w:lastColumn="0" w:oddVBand="0" w:evenVBand="0" w:oddHBand="0" w:evenHBand="0" w:firstRowFirstColumn="0" w:firstRowLastColumn="0" w:lastRowFirstColumn="0" w:lastRowLastColumn="0"/>
+              <w:rPr>
+                <w:rFonts w:ascii="Arial" w:eastAsia="MS Gothic" w:hAnsi="Arial" w:cs="Arial"/>
+              </w:rPr>
+            </w:pPr>
+            <w:r>
+              <w:rPr>
+                <w:rFonts w:ascii="Arial" w:eastAsia="MS Gothic" w:hAnsi="Arial" w:cs="Arial"/>
+              </w:rPr>
+              <w:t>Date début</w:t>
+            </w:r>
+          </w:p>
+        </w:tc>
+        <w:tc>
+          <w:tcPr>
+            <w:tcW w:w="2409" w:type="dxa"/>
+          </w:tcPr>
+          <w:p>
+            <w:pPr>
+              <w:cnfStyle w:val="100000000000" w:firstRow="1" w:lastRow="0" w:firstColumn="0" w:lastColumn="0" w:oddVBand="0" w:evenVBand="0" w:oddHBand="0" w:evenHBand="0" w:firstRowFirstColumn="0" w:firstRowLastColumn="0" w:lastRowFirstColumn="0" w:lastRowLastColumn="0"/>
+              <w:rPr>
+                <w:rFonts w:ascii="Arial" w:eastAsia="MS Gothic" w:hAnsi="Arial" w:cs="Arial"/>
+              </w:rPr>
+            </w:pPr>
+            <w:r>
+              <w:rPr>
+                <w:rFonts w:ascii="Arial" w:eastAsia="MS Gothic" w:hAnsi="Arial" w:cs="Arial"/>
+              </w:rPr>
+              <w:t>Date fin</w:t>
+            </w:r>
+          </w:p>
+        </w:tc>
+        <w:tc>
+          <w:tcPr>
+            <w:tcW w:w="2377" w:type="dxa"/>
+          </w:tcPr>
+          <w:p>
+            <w:pPr>
+              <w:cnfStyle w:val="100000000000" w:firstRow="1" w:lastRow="0" w:firstColumn="0" w:lastColumn="0" w:oddVBand="0" w:evenVBand="0" w:oddHBand="0" w:evenHBand="0" w:firstRowFirstColumn="0" w:firstRowLastColumn="0" w:lastRowFirstColumn="0" w:lastRowLastColumn="0"/>
+              <w:rPr>
+                <w:rFonts w:ascii="Arial" w:eastAsia="MS Gothic" w:hAnsi="Arial" w:cs="Arial"/>
+              </w:rPr>
+            </w:pPr>
+            <w:r>
+              <w:rPr>
+                <w:rFonts w:ascii="Arial" w:eastAsia="MS Gothic" w:hAnsi="Arial" w:cs="Arial"/>
+              </w:rPr>
+              <w:t>Durée du test [h]</w:t>
+            </w:r>
+          </w:p>
+        </w:tc>
+      </w:tr>
+      <w:tr>
+        <w:trPr>
+          <w:cnfStyle w:val="000000100000" w:firstRow="0" w:lastRow="0" w:firstColumn="0" w:lastColumn="0" w:oddVBand="0" w:evenVBand="0" w:oddHBand="1" w:evenHBand="0" w:firstRowFirstColumn="0" w:firstRowLastColumn="0" w:lastRowFirstColumn="0" w:lastRowLastColumn="0"/>
+        </w:trPr>
+        <w:tc>
+          <w:tcPr>
+            <w:cnfStyle w:val="001000000000" w:firstRow="0" w:lastRow="0" w:firstColumn="1" w:lastColumn="0" w:oddVBand="0" w:evenVBand="0" w:oddHBand="0" w:evenHBand="0" w:firstRowFirstColumn="0" w:firstRowLastColumn="0" w:lastRowFirstColumn="0" w:lastRowLastColumn="0"/>
+            <w:tcW w:w="2457" w:type="dxa"/>
+          </w:tcPr>
+          <w:p>
+            <w:pPr>
+              <w:rPr>
+                <w:rFonts w:ascii="Arial" w:eastAsia="MS Gothic" w:hAnsi="Arial" w:cs="Arial"/>
+              </w:rPr>
+            </w:pPr>
+            <w:r>
+              <w:rPr>
+                <w:rFonts w:ascii="Arial" w:eastAsia="MS Gothic" w:hAnsi="Arial" w:cs="Arial"/>
+              </w:rPr>
+              <w:t>{{E1}}</w:t>
+            </w:r>
+          </w:p>
+        </w:tc>
+        <w:tc>
+          <w:tcPr>
+            <w:tcW w:w="2437" w:type="dxa"/>
+          </w:tcPr>
+          <w:p>
+            <w:pPr>
+              <w:cnfStyle w:val="000000100000" w:firstRow="0" w:lastRow="0" w:firstColumn="0" w:lastColumn="0" w:oddVBand="0" w:evenVBand="0" w:oddHBand="1" w:evenHBand="0" w:firstRowFirstColumn="0" w:firstRowLastColumn="0" w:lastRowFirstColumn="0" w:lastRowLastColumn="0"/>
+              <w:rPr>
+                <w:rFonts w:ascii="Arial" w:eastAsia="MS Gothic" w:hAnsi="Arial" w:cs="Arial"/>
+              </w:rPr>
+            </w:pPr>
+            <w:r>
+              <w:rPr>
+                <w:rFonts w:ascii="Arial" w:eastAsia="MS Gothic" w:hAnsi="Arial" w:cs="Arial"/>
+              </w:rPr>
+              <w:t>{{start_test_E1}}</w:t>
+            </w:r>
+          </w:p>
+        </w:tc>
+        <w:tc>
+          <w:tcPr>
+            <w:tcW w:w="2409" w:type="dxa"/>
+          </w:tcPr>
+          <w:p>
+            <w:pPr>
+              <w:cnfStyle w:val="000000100000" w:firstRow="0" w:lastRow="0" w:firstColumn="0" w:lastColumn="0" w:oddVBand="0" w:evenVBand="0" w:oddHBand="1" w:evenHBand="0" w:firstRowFirstColumn="0" w:firstRowLastColumn="0" w:lastRowFirstColumn="0" w:lastRowLastColumn="0"/>
+              <w:rPr>
+                <w:rFonts w:ascii="Arial" w:eastAsia="MS Gothic" w:hAnsi="Arial" w:cs="Arial"/>
+              </w:rPr>
+            </w:pPr>
+            <w:r>
+              <w:rPr>
+                <w:rFonts w:ascii="Arial" w:eastAsia="MS Gothic" w:hAnsi="Arial" w:cs="Arial"/>
+              </w:rPr>
+              <w:t>{{end_test_E1}}</w:t>
+            </w:r>
+          </w:p>
+        </w:tc>
+        <w:tc>
+          <w:tcPr>
+            <w:tcW w:w="2377" w:type="dxa"/>
+          </w:tcPr>
+          <w:p>
+            <w:pPr>
+              <w:keepNext/>
+              <w:cnfStyle w:val="000000100000" w:firstRow="0" w:lastRow="0" w:firstColumn="0" w:lastColumn="0" w:oddVBand="0" w:evenVBand="0" w:oddHBand="1" w:evenHBand="0" w:firstRowFirstColumn="0" w:firstRowLastColumn="0" w:lastRowFirstColumn="0" w:lastRowLastColumn="0"/>
+              <w:rPr>
+                <w:rFonts w:ascii="Arial" w:eastAsia="MS Gothic" w:hAnsi="Arial" w:cs="Arial"/>
+              </w:rPr>
+            </w:pPr>
+            <w:r>
+              <w:rPr>
+                <w:rFonts w:ascii="Arial" w:eastAsia="MS Gothic" w:hAnsi="Arial" w:cs="Arial"/>
+              </w:rPr>
+              <w:t>{{</w:t>
+            </w:r>
+            <w:proofErr w:type="spellStart"/>
+            <w:r>
+              <w:rPr>
+                <w:rFonts w:ascii="Arial" w:eastAsia="MS Gothic" w:hAnsi="Arial" w:cs="Arial"/>
+              </w:rPr>
+              <w:t>duration_in_hours</w:t>
+            </w:r>
+            <w:proofErr w:type="spellEnd"/>
+            <w:r>
+              <w:rPr>
+                <w:rFonts w:ascii="Arial" w:eastAsia="MS Gothic" w:hAnsi="Arial" w:cs="Arial"/>
+              </w:rPr>
+              <w:t xml:space="preserve"> }}</w:t>
+            </w:r>
+          </w:p>
+        </w:tc>
+      </w:tr>
+    </w:tbl>
     <w:p>
       <w:pPr>
         <w:pStyle w:val="Lgende"/>
@@ -4737,7 +5434,7 @@
         <w:rPr>
           <w:noProof/>
         </w:rPr>
-        <w:t>3</w:t>
+        <w:t>2</w:t>
       </w:r>
       <w:r>
         <w:fldChar w:fldCharType="end"/>
@@ -4805,55 +5502,7 @@
           <w:sz w:val="22"/>
           <w:szCs w:val="22"/>
         </w:rPr>
-        <w:t xml:space="preserve">Ce critère vise à vérifier que chaque éolienne a fonctionné pendant une durée minimale de </w:t>
-      </w:r>
-      <w:r>
-        <w:rPr>
-          <w:rFonts w:ascii="Cambria" w:eastAsia="MS Mincho" w:hAnsi="Cambria" w:cs="Arial"/>
-          <w:sz w:val="22"/>
-          <w:szCs w:val="22"/>
-        </w:rPr>
-        <w:t>{{</w:t>
-      </w:r>
-      <w:r>
-        <w:rPr>
-          <w:rFonts w:ascii="Cambria" w:eastAsia="MS Mincho" w:hAnsi="Cambria"/>
-          <w:sz w:val="22"/>
-          <w:szCs w:val="22"/>
-        </w:rPr>
-        <w:t xml:space="preserve"> </w:t>
-      </w:r>
-      <w:r>
-        <w:rPr>
-          <w:rFonts w:ascii="Cambria" w:eastAsia="MS Mincho" w:hAnsi="Cambria"/>
-          <w:sz w:val="22"/>
-          <w:szCs w:val="22"/>
-        </w:rPr>
-        <w:t>consecutive_hours_h</w:t>
-      </w:r>
-      <w:r>
-        <w:rPr>
-          <w:rFonts w:ascii="Cambria" w:eastAsia="MS Mincho" w:hAnsi="Cambria" w:cs="Arial"/>
-          <w:sz w:val="22"/>
-          <w:szCs w:val="22"/>
-        </w:rPr>
-        <w:t xml:space="preserve"> </w:t>
-      </w:r>
-      <w:r>
-        <w:rPr>
-          <w:rFonts w:ascii="Cambria" w:eastAsia="MS Mincho" w:hAnsi="Cambria" w:cs="Arial"/>
-          <w:sz w:val="22"/>
-          <w:szCs w:val="22"/>
-        </w:rPr>
-        <w:t xml:space="preserve">}} </w:t>
-      </w:r>
-      <w:r>
-        <w:rPr>
-          <w:rFonts w:ascii="Cambria" w:eastAsia="MS Mincho" w:hAnsi="Cambria" w:cs="Arial"/>
-          <w:sz w:val="22"/>
-          <w:szCs w:val="22"/>
-        </w:rPr>
-        <w:t>heures dans la plage de vitesse de vent définie pour les Run Tests.</w:t>
+        <w:t>Ce critère vise à vérifier que chaque éolienne a fonctionné pendant une durée minimale de 60 heures dans la plage de vitesse de vent définie pour les Run Tests.</w:t>
       </w:r>
     </w:p>
     <w:p>
@@ -4938,53 +5587,221 @@
         <w:t xml:space="preserve"> </w:t>
       </w:r>
     </w:p>
+    <w:tbl>
+      <w:tblPr>
+        <w:tblStyle w:val="TableauGrille4-Accentuation1"/>
+        <w:tblpPr w:leftFromText="141" w:rightFromText="141" w:vertAnchor="text" w:horzAnchor="margin" w:tblpXSpec="center" w:tblpY="227"/>
+        <w:tblW w:w="0" w:type="auto"/>
+        <w:tblLook w:val="04A0" w:firstRow="1" w:lastRow="0" w:firstColumn="1" w:lastColumn="0" w:noHBand="0" w:noVBand="1"/>
+      </w:tblPr>
+      <w:tblGrid>
+        <w:gridCol w:w="1902"/>
+        <w:gridCol w:w="2607"/>
+        <w:gridCol w:w="2603"/>
+        <w:gridCol w:w="2628"/>
+      </w:tblGrid>
+      <w:tr>
+        <w:trPr>
+          <w:cnfStyle w:val="100000000000" w:firstRow="1" w:lastRow="0" w:firstColumn="0" w:lastColumn="0" w:oddVBand="0" w:evenVBand="0" w:oddHBand="0" w:evenHBand="0" w:firstRowFirstColumn="0" w:firstRowLastColumn="0" w:lastRowFirstColumn="0" w:lastRowLastColumn="0"/>
+        </w:trPr>
+        <w:tc>
+          <w:tcPr>
+            <w:cnfStyle w:val="001000000000" w:firstRow="0" w:lastRow="0" w:firstColumn="1" w:lastColumn="0" w:oddVBand="0" w:evenVBand="0" w:oddHBand="0" w:evenHBand="0" w:firstRowFirstColumn="0" w:firstRowLastColumn="0" w:lastRowFirstColumn="0" w:lastRowLastColumn="0"/>
+            <w:tcW w:w="1946" w:type="dxa"/>
+            <w:vAlign w:val="center"/>
+          </w:tcPr>
+          <w:p>
+            <w:pPr>
+              <w:jc w:val="center"/>
+              <w:rPr>
+                <w:rFonts w:ascii="Arial" w:eastAsia="MS Gothic" w:hAnsi="Arial" w:cs="Arial"/>
+              </w:rPr>
+            </w:pPr>
+            <w:r>
+              <w:rPr>
+                <w:rFonts w:ascii="Arial" w:eastAsia="MS Gothic" w:hAnsi="Arial" w:cs="Arial"/>
+              </w:rPr>
+              <w:t>Eolienne</w:t>
+            </w:r>
+          </w:p>
+        </w:tc>
+        <w:tc>
+          <w:tcPr>
+            <w:tcW w:w="2650" w:type="dxa"/>
+            <w:vAlign w:val="center"/>
+          </w:tcPr>
+          <w:p>
+            <w:pPr>
+              <w:jc w:val="center"/>
+              <w:cnfStyle w:val="100000000000" w:firstRow="1" w:lastRow="0" w:firstColumn="0" w:lastColumn="0" w:oddVBand="0" w:evenVBand="0" w:oddHBand="0" w:evenHBand="0" w:firstRowFirstColumn="0" w:firstRowLastColumn="0" w:lastRowFirstColumn="0" w:lastRowLastColumn="0"/>
+              <w:rPr>
+                <w:rFonts w:ascii="Arial" w:eastAsia="MS Gothic" w:hAnsi="Arial" w:cs="Arial"/>
+              </w:rPr>
+            </w:pPr>
+            <w:r>
+              <w:rPr>
+                <w:rFonts w:ascii="Arial" w:eastAsia="MS Gothic" w:hAnsi="Arial" w:cs="Arial"/>
+              </w:rPr>
+              <w:t>Date début</w:t>
+            </w:r>
+          </w:p>
+        </w:tc>
+        <w:tc>
+          <w:tcPr>
+            <w:tcW w:w="2650" w:type="dxa"/>
+            <w:vAlign w:val="center"/>
+          </w:tcPr>
+          <w:p>
+            <w:pPr>
+              <w:jc w:val="center"/>
+              <w:cnfStyle w:val="100000000000" w:firstRow="1" w:lastRow="0" w:firstColumn="0" w:lastColumn="0" w:oddVBand="0" w:evenVBand="0" w:oddHBand="0" w:evenHBand="0" w:firstRowFirstColumn="0" w:firstRowLastColumn="0" w:lastRowFirstColumn="0" w:lastRowLastColumn="0"/>
+              <w:rPr>
+                <w:rFonts w:ascii="Arial" w:eastAsia="MS Gothic" w:hAnsi="Arial" w:cs="Arial"/>
+              </w:rPr>
+            </w:pPr>
+            <w:r>
+              <w:rPr>
+                <w:rFonts w:ascii="Arial" w:eastAsia="MS Gothic" w:hAnsi="Arial" w:cs="Arial"/>
+              </w:rPr>
+              <w:t>Date fin</w:t>
+            </w:r>
+          </w:p>
+        </w:tc>
+        <w:tc>
+          <w:tcPr>
+            <w:tcW w:w="2650" w:type="dxa"/>
+            <w:vAlign w:val="center"/>
+          </w:tcPr>
+          <w:p>
+            <w:pPr>
+              <w:jc w:val="center"/>
+              <w:cnfStyle w:val="100000000000" w:firstRow="1" w:lastRow="0" w:firstColumn="0" w:lastColumn="0" w:oddVBand="0" w:evenVBand="0" w:oddHBand="0" w:evenHBand="0" w:firstRowFirstColumn="0" w:firstRowLastColumn="0" w:lastRowFirstColumn="0" w:lastRowLastColumn="0"/>
+              <w:rPr>
+                <w:rFonts w:ascii="Arial" w:eastAsia="MS Gothic" w:hAnsi="Arial" w:cs="Arial"/>
+              </w:rPr>
+            </w:pPr>
+            <w:r>
+              <w:rPr>
+                <w:rFonts w:ascii="Arial" w:eastAsia="MS Gothic" w:hAnsi="Arial" w:cs="Arial"/>
+              </w:rPr>
+              <w:t>Durée du test [h]</w:t>
+            </w:r>
+          </w:p>
+        </w:tc>
+      </w:tr>
+      <w:tr>
+        <w:trPr>
+          <w:cnfStyle w:val="000000100000" w:firstRow="0" w:lastRow="0" w:firstColumn="0" w:lastColumn="0" w:oddVBand="0" w:evenVBand="0" w:oddHBand="1" w:evenHBand="0" w:firstRowFirstColumn="0" w:firstRowLastColumn="0" w:lastRowFirstColumn="0" w:lastRowLastColumn="0"/>
+        </w:trPr>
+        <w:tc>
+          <w:tcPr>
+            <w:cnfStyle w:val="001000000000" w:firstRow="0" w:lastRow="0" w:firstColumn="1" w:lastColumn="0" w:oddVBand="0" w:evenVBand="0" w:oddHBand="0" w:evenHBand="0" w:firstRowFirstColumn="0" w:firstRowLastColumn="0" w:lastRowFirstColumn="0" w:lastRowLastColumn="0"/>
+            <w:tcW w:w="1946" w:type="dxa"/>
+            <w:vAlign w:val="center"/>
+          </w:tcPr>
+          <w:p>
+            <w:pPr>
+              <w:jc w:val="center"/>
+              <w:rPr>
+                <w:rFonts w:ascii="Arial" w:eastAsia="MS Gothic" w:hAnsi="Arial" w:cs="Arial"/>
+              </w:rPr>
+            </w:pPr>
+            <w:r>
+              <w:rPr>
+                <w:rFonts w:ascii="Arial" w:eastAsia="MS Gothic" w:hAnsi="Arial" w:cs="Arial"/>
+              </w:rPr>
+              <w:t>{{E1}}</w:t>
+            </w:r>
+          </w:p>
+        </w:tc>
+        <w:tc>
+          <w:tcPr>
+            <w:tcW w:w="2650" w:type="dxa"/>
+            <w:vAlign w:val="center"/>
+          </w:tcPr>
+          <w:p>
+            <w:pPr>
+              <w:jc w:val="center"/>
+              <w:cnfStyle w:val="000000100000" w:firstRow="0" w:lastRow="0" w:firstColumn="0" w:lastColumn="0" w:oddVBand="0" w:evenVBand="0" w:oddHBand="1" w:evenHBand="0" w:firstRowFirstColumn="0" w:firstRowLastColumn="0" w:lastRowFirstColumn="0" w:lastRowLastColumn="0"/>
+              <w:rPr>
+                <w:rFonts w:ascii="Arial" w:eastAsia="MS Gothic" w:hAnsi="Arial" w:cs="Arial"/>
+              </w:rPr>
+            </w:pPr>
+            <w:r>
+              <w:rPr>
+                <w:rFonts w:ascii="Arial" w:eastAsia="MS Gothic" w:hAnsi="Arial" w:cs="Arial"/>
+              </w:rPr>
+              <w:t>{{start_test_E1}}</w:t>
+            </w:r>
+          </w:p>
+        </w:tc>
+        <w:tc>
+          <w:tcPr>
+            <w:tcW w:w="2650" w:type="dxa"/>
+            <w:vAlign w:val="center"/>
+          </w:tcPr>
+          <w:p>
+            <w:pPr>
+              <w:jc w:val="center"/>
+              <w:cnfStyle w:val="000000100000" w:firstRow="0" w:lastRow="0" w:firstColumn="0" w:lastColumn="0" w:oddVBand="0" w:evenVBand="0" w:oddHBand="1" w:evenHBand="0" w:firstRowFirstColumn="0" w:firstRowLastColumn="0" w:lastRowFirstColumn="0" w:lastRowLastColumn="0"/>
+              <w:rPr>
+                <w:rFonts w:ascii="Arial" w:eastAsia="MS Gothic" w:hAnsi="Arial" w:cs="Arial"/>
+              </w:rPr>
+            </w:pPr>
+            <w:r>
+              <w:rPr>
+                <w:rFonts w:ascii="Arial" w:eastAsia="MS Gothic" w:hAnsi="Arial" w:cs="Arial"/>
+              </w:rPr>
+              <w:t>{{end_test_E1}}</w:t>
+            </w:r>
+          </w:p>
+        </w:tc>
+        <w:tc>
+          <w:tcPr>
+            <w:tcW w:w="2650" w:type="dxa"/>
+            <w:vAlign w:val="center"/>
+          </w:tcPr>
+          <w:p>
+            <w:pPr>
+              <w:keepNext/>
+              <w:jc w:val="center"/>
+              <w:cnfStyle w:val="000000100000" w:firstRow="0" w:lastRow="0" w:firstColumn="0" w:lastColumn="0" w:oddVBand="0" w:evenVBand="0" w:oddHBand="1" w:evenHBand="0" w:firstRowFirstColumn="0" w:firstRowLastColumn="0" w:lastRowFirstColumn="0" w:lastRowLastColumn="0"/>
+              <w:rPr>
+                <w:rFonts w:ascii="Arial" w:eastAsia="MS Gothic" w:hAnsi="Arial" w:cs="Arial"/>
+              </w:rPr>
+            </w:pPr>
+            <w:r>
+              <w:rPr>
+                <w:rFonts w:ascii="Arial" w:eastAsia="MS Gothic" w:hAnsi="Arial" w:cs="Arial"/>
+              </w:rPr>
+              <w:t>{{</w:t>
+            </w:r>
+            <w:proofErr w:type="spellStart"/>
+            <w:r>
+              <w:rPr>
+                <w:rFonts w:ascii="Arial" w:eastAsia="MS Gothic" w:hAnsi="Arial" w:cs="Arial"/>
+              </w:rPr>
+              <w:t>duration_in_hours</w:t>
+            </w:r>
+            <w:proofErr w:type="spellEnd"/>
+            <w:r>
+              <w:rPr>
+                <w:rFonts w:ascii="Arial" w:eastAsia="MS Gothic" w:hAnsi="Arial" w:cs="Arial"/>
+              </w:rPr>
+              <w:t xml:space="preserve"> }}</w:t>
+            </w:r>
+          </w:p>
+        </w:tc>
+      </w:tr>
+    </w:tbl>
     <w:p>
       <w:pPr>
         <w:pStyle w:val="Lgende"/>
         <w:jc w:val="center"/>
         <w:rPr>
-          <w:i w:val="0"/>
-          <w:iCs w:val="0"/>
           <w:noProof/>
-          <w:lang w:val="en-US"/>
-        </w:rPr>
-      </w:pPr>
-      <w:r>
-        <w:rPr>
-          <w:i w:val="0"/>
-          <w:iCs w:val="0"/>
-          <w:noProof/>
-          <w:lang w:val="en-US"/>
-        </w:rPr>
-        <w:t>{{</w:t>
-      </w:r>
-      <w:r>
-        <w:rPr>
-          <w:i w:val="0"/>
-          <w:iCs w:val="0"/>
-          <w:noProof/>
-          <w:lang w:val="en-US"/>
-        </w:rPr>
-        <w:t xml:space="preserve">cut_in_cut_out_table </w:t>
-      </w:r>
-      <w:r>
-        <w:rPr>
-          <w:i w:val="0"/>
-          <w:iCs w:val="0"/>
-          <w:noProof/>
-          <w:lang w:val="en-US"/>
-        </w:rPr>
-        <w:t xml:space="preserve"> </w:t>
-      </w:r>
-      <w:r>
-        <w:rPr>
-          <w:i w:val="0"/>
-          <w:iCs w:val="0"/>
-          <w:noProof/>
-          <w:lang w:val="en-US"/>
-        </w:rPr>
-        <w:t>}}</w:t>
-      </w:r>
+        </w:rPr>
+      </w:pPr>
     </w:p>
     <w:p>
       <w:pPr>
@@ -5013,7 +5830,7 @@
         <w:rPr>
           <w:noProof/>
         </w:rPr>
-        <w:t>4</w:t>
+        <w:t>3</w:t>
       </w:r>
       <w:r>
         <w:fldChar w:fldCharType="end"/>
@@ -5044,6 +5861,7 @@
           <w:szCs w:val="22"/>
           <w:highlight w:val="green"/>
         </w:rPr>
+        <w:lastRenderedPageBreak/>
         <w:t>O</w:t>
       </w:r>
       <w:r>
@@ -5082,7 +5900,27 @@
           <w:szCs w:val="22"/>
           <w:highlight w:val="green"/>
         </w:rPr>
-        <w:t>, la durée cumulée de fonctionnement observée étaninférieure au seuil requis (cas de non-validation).</w:t>
+        <w:t xml:space="preserve">, la durée cumulée de fonctionnement observée </w:t>
+      </w:r>
+      <w:proofErr w:type="spellStart"/>
+      <w:r>
+        <w:rPr>
+          <w:rFonts w:ascii="Cambria" w:eastAsia="MS Mincho" w:hAnsi="Cambria" w:cs="Arial"/>
+          <w:sz w:val="22"/>
+          <w:szCs w:val="22"/>
+          <w:highlight w:val="green"/>
+        </w:rPr>
+        <w:t>étaninférieure</w:t>
+      </w:r>
+      <w:proofErr w:type="spellEnd"/>
+      <w:r>
+        <w:rPr>
+          <w:rFonts w:ascii="Cambria" w:eastAsia="MS Mincho" w:hAnsi="Cambria" w:cs="Arial"/>
+          <w:sz w:val="22"/>
+          <w:szCs w:val="22"/>
+          <w:highlight w:val="green"/>
+        </w:rPr>
+        <w:t xml:space="preserve"> au seuil requis (cas de non-validation).</w:t>
       </w:r>
     </w:p>
     <w:p>
@@ -5176,44 +6014,186 @@
         <w:t>Le tableau suivant présente la vitesse de vent maximale observée et la puissance maximale produite pendant les périodes de Run Test.</w:t>
       </w:r>
     </w:p>
-    <w:p>
-      <w:pPr>
-        <w:keepNext/>
-        <w:spacing w:after="200" w:line="276" w:lineRule="auto"/>
-        <w:ind w:left="720"/>
-        <w:jc w:val="center"/>
-        <w:rPr>
-          <w:rFonts w:ascii="Cambria" w:eastAsia="MS Mincho" w:hAnsi="Cambria" w:cs="Arial"/>
-          <w:sz w:val="22"/>
-          <w:szCs w:val="22"/>
-        </w:rPr>
-      </w:pPr>
-      <w:r>
-        <w:rPr>
-          <w:rFonts w:ascii="Cambria" w:eastAsia="MS Mincho" w:hAnsi="Cambria" w:cs="Arial"/>
-          <w:sz w:val="22"/>
-          <w:szCs w:val="22"/>
-        </w:rPr>
-        <w:t>{{</w:t>
-      </w:r>
-      <w:r>
-        <w:rPr>
-          <w:rFonts w:ascii="Cambria" w:eastAsia="MS Mincho" w:hAnsi="Cambria" w:cs="Arial"/>
-          <w:sz w:val="22"/>
-          <w:szCs w:val="22"/>
-        </w:rPr>
-        <w:t xml:space="preserve">nominal_power_values_table </w:t>
-      </w:r>
-      <w:r>
-        <w:rPr>
-          <w:rFonts w:ascii="Cambria" w:eastAsia="MS Mincho" w:hAnsi="Cambria" w:cs="Arial"/>
-          <w:sz w:val="22"/>
-          <w:szCs w:val="22"/>
-        </w:rPr>
-        <w:t>}}</w:t>
-      </w:r>
-    </w:p>
     <w:p/>
+    <w:tbl>
+      <w:tblPr>
+        <w:tblStyle w:val="TableauGrille4-Accentuation1"/>
+        <w:tblW w:w="0" w:type="auto"/>
+        <w:tblLook w:val="04A0" w:firstRow="1" w:lastRow="0" w:firstColumn="1" w:lastColumn="0" w:noHBand="0" w:noVBand="1"/>
+      </w:tblPr>
+      <w:tblGrid>
+        <w:gridCol w:w="2059"/>
+        <w:gridCol w:w="2205"/>
+        <w:gridCol w:w="2764"/>
+        <w:gridCol w:w="2712"/>
+      </w:tblGrid>
+      <w:tr>
+        <w:trPr>
+          <w:cnfStyle w:val="100000000000" w:firstRow="1" w:lastRow="0" w:firstColumn="0" w:lastColumn="0" w:oddVBand="0" w:evenVBand="0" w:oddHBand="0" w:evenHBand="0" w:firstRowFirstColumn="0" w:firstRowLastColumn="0" w:lastRowFirstColumn="0" w:lastRowLastColumn="0"/>
+        </w:trPr>
+        <w:tc>
+          <w:tcPr>
+            <w:cnfStyle w:val="001000000000" w:firstRow="0" w:lastRow="0" w:firstColumn="1" w:lastColumn="0" w:oddVBand="0" w:evenVBand="0" w:oddHBand="0" w:evenHBand="0" w:firstRowFirstColumn="0" w:firstRowLastColumn="0" w:lastRowFirstColumn="0" w:lastRowLastColumn="0"/>
+            <w:tcW w:w="2273" w:type="dxa"/>
+          </w:tcPr>
+          <w:p>
+            <w:pPr>
+              <w:rPr>
+                <w:rFonts w:ascii="Arial" w:eastAsia="MS Gothic" w:hAnsi="Arial" w:cs="Arial"/>
+              </w:rPr>
+            </w:pPr>
+            <w:r>
+              <w:rPr>
+                <w:rFonts w:ascii="Arial" w:eastAsia="MS Gothic" w:hAnsi="Arial" w:cs="Arial"/>
+              </w:rPr>
+              <w:t>Eolienne</w:t>
+            </w:r>
+          </w:p>
+        </w:tc>
+        <w:tc>
+          <w:tcPr>
+            <w:tcW w:w="2172" w:type="dxa"/>
+          </w:tcPr>
+          <w:p>
+            <w:pPr>
+              <w:cnfStyle w:val="100000000000" w:firstRow="1" w:lastRow="0" w:firstColumn="0" w:lastColumn="0" w:oddVBand="0" w:evenVBand="0" w:oddHBand="0" w:evenHBand="0" w:firstRowFirstColumn="0" w:firstRowLastColumn="0" w:lastRowFirstColumn="0" w:lastRowLastColumn="0"/>
+              <w:rPr>
+                <w:rFonts w:ascii="Arial" w:eastAsia="MS Gothic" w:hAnsi="Arial" w:cs="Arial"/>
+              </w:rPr>
+            </w:pPr>
+            <w:r>
+              <w:rPr>
+                <w:rFonts w:ascii="Arial" w:eastAsia="MS Gothic" w:hAnsi="Arial" w:cs="Arial"/>
+              </w:rPr>
+              <w:t>Vitesse de vent maximal</w:t>
+            </w:r>
+          </w:p>
+        </w:tc>
+        <w:tc>
+          <w:tcPr>
+            <w:tcW w:w="2907" w:type="dxa"/>
+          </w:tcPr>
+          <w:p>
+            <w:pPr>
+              <w:cnfStyle w:val="100000000000" w:firstRow="1" w:lastRow="0" w:firstColumn="0" w:lastColumn="0" w:oddVBand="0" w:evenVBand="0" w:oddHBand="0" w:evenHBand="0" w:firstRowFirstColumn="0" w:firstRowLastColumn="0" w:lastRowFirstColumn="0" w:lastRowLastColumn="0"/>
+              <w:rPr>
+                <w:rFonts w:ascii="Arial" w:eastAsia="MS Gothic" w:hAnsi="Arial" w:cs="Arial"/>
+              </w:rPr>
+            </w:pPr>
+            <w:r>
+              <w:rPr>
+                <w:rFonts w:ascii="Arial" w:eastAsia="MS Gothic" w:hAnsi="Arial" w:cs="Arial"/>
+              </w:rPr>
+              <w:t>Puissance maximal</w:t>
+            </w:r>
+          </w:p>
+        </w:tc>
+        <w:tc>
+          <w:tcPr>
+            <w:tcW w:w="2544" w:type="dxa"/>
+          </w:tcPr>
+          <w:p>
+            <w:pPr>
+              <w:cnfStyle w:val="100000000000" w:firstRow="1" w:lastRow="0" w:firstColumn="0" w:lastColumn="0" w:oddVBand="0" w:evenVBand="0" w:oddHBand="0" w:evenHBand="0" w:firstRowFirstColumn="0" w:firstRowLastColumn="0" w:lastRowFirstColumn="0" w:lastRowLastColumn="0"/>
+              <w:rPr>
+                <w:rFonts w:ascii="Arial" w:eastAsia="MS Gothic" w:hAnsi="Arial" w:cs="Arial"/>
+              </w:rPr>
+            </w:pPr>
+            <w:proofErr w:type="spellStart"/>
+            <w:r>
+              <w:rPr>
+                <w:rFonts w:ascii="Arial" w:eastAsia="MS Gothic" w:hAnsi="Arial" w:cs="Arial"/>
+              </w:rPr>
+              <w:t>Status</w:t>
+            </w:r>
+            <w:proofErr w:type="spellEnd"/>
+          </w:p>
+        </w:tc>
+      </w:tr>
+      <w:tr>
+        <w:trPr>
+          <w:cnfStyle w:val="000000100000" w:firstRow="0" w:lastRow="0" w:firstColumn="0" w:lastColumn="0" w:oddVBand="0" w:evenVBand="0" w:oddHBand="1" w:evenHBand="0" w:firstRowFirstColumn="0" w:firstRowLastColumn="0" w:lastRowFirstColumn="0" w:lastRowLastColumn="0"/>
+        </w:trPr>
+        <w:tc>
+          <w:tcPr>
+            <w:cnfStyle w:val="001000000000" w:firstRow="0" w:lastRow="0" w:firstColumn="1" w:lastColumn="0" w:oddVBand="0" w:evenVBand="0" w:oddHBand="0" w:evenHBand="0" w:firstRowFirstColumn="0" w:firstRowLastColumn="0" w:lastRowFirstColumn="0" w:lastRowLastColumn="0"/>
+            <w:tcW w:w="2273" w:type="dxa"/>
+          </w:tcPr>
+          <w:p>
+            <w:pPr>
+              <w:rPr>
+                <w:rFonts w:ascii="Arial" w:eastAsia="MS Gothic" w:hAnsi="Arial" w:cs="Arial"/>
+              </w:rPr>
+            </w:pPr>
+            <w:r>
+              <w:rPr>
+                <w:rFonts w:ascii="Arial" w:eastAsia="MS Gothic" w:hAnsi="Arial" w:cs="Arial"/>
+              </w:rPr>
+              <w:t>{{E1}}</w:t>
+            </w:r>
+          </w:p>
+        </w:tc>
+        <w:tc>
+          <w:tcPr>
+            <w:tcW w:w="2172" w:type="dxa"/>
+          </w:tcPr>
+          <w:p>
+            <w:pPr>
+              <w:cnfStyle w:val="000000100000" w:firstRow="0" w:lastRow="0" w:firstColumn="0" w:lastColumn="0" w:oddVBand="0" w:evenVBand="0" w:oddHBand="1" w:evenHBand="0" w:firstRowFirstColumn="0" w:firstRowLastColumn="0" w:lastRowFirstColumn="0" w:lastRowLastColumn="0"/>
+              <w:rPr>
+                <w:rFonts w:ascii="Arial" w:eastAsia="MS Gothic" w:hAnsi="Arial" w:cs="Arial"/>
+              </w:rPr>
+            </w:pPr>
+            <w:r>
+              <w:rPr>
+                <w:rFonts w:ascii="Arial" w:eastAsia="MS Gothic" w:hAnsi="Arial" w:cs="Arial"/>
+              </w:rPr>
+              <w:t>{{E1_max_speed}}</w:t>
+            </w:r>
+          </w:p>
+        </w:tc>
+        <w:tc>
+          <w:tcPr>
+            <w:tcW w:w="2907" w:type="dxa"/>
+          </w:tcPr>
+          <w:p>
+            <w:pPr>
+              <w:keepNext/>
+              <w:cnfStyle w:val="000000100000" w:firstRow="0" w:lastRow="0" w:firstColumn="0" w:lastColumn="0" w:oddVBand="0" w:evenVBand="0" w:oddHBand="1" w:evenHBand="0" w:firstRowFirstColumn="0" w:firstRowLastColumn="0" w:lastRowFirstColumn="0" w:lastRowLastColumn="0"/>
+              <w:rPr>
+                <w:rFonts w:ascii="Arial" w:eastAsia="MS Gothic" w:hAnsi="Arial" w:cs="Arial"/>
+              </w:rPr>
+            </w:pPr>
+            <w:r>
+              <w:rPr>
+                <w:rFonts w:ascii="Arial" w:eastAsia="MS Gothic" w:hAnsi="Arial" w:cs="Arial"/>
+              </w:rPr>
+              <w:t>{{E1_max_power}}</w:t>
+            </w:r>
+          </w:p>
+        </w:tc>
+        <w:tc>
+          <w:tcPr>
+            <w:tcW w:w="2544" w:type="dxa"/>
+          </w:tcPr>
+          <w:p>
+            <w:pPr>
+              <w:keepNext/>
+              <w:cnfStyle w:val="000000100000" w:firstRow="0" w:lastRow="0" w:firstColumn="0" w:lastColumn="0" w:oddVBand="0" w:evenVBand="0" w:oddHBand="1" w:evenHBand="0" w:firstRowFirstColumn="0" w:firstRowLastColumn="0" w:lastRowFirstColumn="0" w:lastRowLastColumn="0"/>
+              <w:rPr>
+                <w:rFonts w:ascii="Arial" w:eastAsia="MS Gothic" w:hAnsi="Arial" w:cs="Arial"/>
+              </w:rPr>
+            </w:pPr>
+            <w:r>
+              <w:rPr>
+                <w:rFonts w:ascii="Arial" w:eastAsia="MS Gothic" w:hAnsi="Arial" w:cs="Arial"/>
+              </w:rPr>
+              <w:t>{{E1_status_message}}</w:t>
+            </w:r>
+          </w:p>
+        </w:tc>
+      </w:tr>
+    </w:tbl>
     <w:p>
       <w:pPr>
         <w:pStyle w:val="Lgende"/>
@@ -5223,7 +6203,6 @@
         </w:rPr>
       </w:pPr>
       <w:r>
-        <w:lastRenderedPageBreak/>
         <w:t xml:space="preserve">Tableau </w:t>
       </w:r>
       <w:r>
@@ -5239,7 +6218,7 @@
         <w:rPr>
           <w:noProof/>
         </w:rPr>
-        <w:t>5</w:t>
+        <w:t>4</w:t>
       </w:r>
       <w:r>
         <w:fldChar w:fldCharType="end"/>
@@ -5305,6 +6284,7 @@
         </w:rPr>
         <w:t xml:space="preserve">L'éolienne doit fonctionner pendant au moins 3 heures à une puissance égale ou supérieure à </w:t>
       </w:r>
+      <w:proofErr w:type="gramStart"/>
       <w:r>
         <w:rPr>
           <w:rFonts w:ascii="Cambria" w:eastAsia="MS Mincho" w:hAnsi="Cambria" w:cs="Arial"/>
@@ -5323,13 +6303,32 @@
         </w:rPr>
         <w:t xml:space="preserve"> </w:t>
       </w:r>
-      <w:r>
-        <w:rPr>
-          <w:rFonts w:ascii="Cambria" w:eastAsia="MS Mincho" w:hAnsi="Cambria"/>
-          <w:sz w:val="22"/>
-          <w:szCs w:val="22"/>
-        </w:rPr>
-        <w:t>nominal_power_pct}}</w:t>
+      <w:proofErr w:type="spellStart"/>
+      <w:r>
+        <w:rPr>
+          <w:rFonts w:ascii="Cambria" w:eastAsia="MS Mincho" w:hAnsi="Cambria"/>
+          <w:sz w:val="22"/>
+          <w:szCs w:val="22"/>
+        </w:rPr>
+        <w:t>nominal</w:t>
+      </w:r>
+      <w:proofErr w:type="gramEnd"/>
+      <w:r>
+        <w:rPr>
+          <w:rFonts w:ascii="Cambria" w:eastAsia="MS Mincho" w:hAnsi="Cambria"/>
+          <w:sz w:val="22"/>
+          <w:szCs w:val="22"/>
+        </w:rPr>
+        <w:t>_power_pct</w:t>
+      </w:r>
+      <w:proofErr w:type="spellEnd"/>
+      <w:r>
+        <w:rPr>
+          <w:rFonts w:ascii="Cambria" w:eastAsia="MS Mincho" w:hAnsi="Cambria"/>
+          <w:sz w:val="22"/>
+          <w:szCs w:val="22"/>
+        </w:rPr>
+        <w:t>}}</w:t>
       </w:r>
       <w:r>
         <w:rPr>
@@ -5353,7 +6352,25 @@
           <w:sz w:val="22"/>
           <w:szCs w:val="22"/>
         </w:rPr>
-        <w:t>la puissance nominale de {{nominal_power_h}} MW dans l'analyse.</w:t>
+        <w:t>la puissance nominale de {{</w:t>
+      </w:r>
+      <w:proofErr w:type="spellStart"/>
+      <w:r>
+        <w:rPr>
+          <w:rFonts w:ascii="Cambria" w:eastAsia="MS Mincho" w:hAnsi="Cambria" w:cs="Arial"/>
+          <w:sz w:val="22"/>
+          <w:szCs w:val="22"/>
+        </w:rPr>
+        <w:t>nominal_power_h</w:t>
+      </w:r>
+      <w:proofErr w:type="spellEnd"/>
+      <w:r>
+        <w:rPr>
+          <w:rFonts w:ascii="Cambria" w:eastAsia="MS Mincho" w:hAnsi="Cambria" w:cs="Arial"/>
+          <w:sz w:val="22"/>
+          <w:szCs w:val="22"/>
+        </w:rPr>
+        <w:t>}} MW dans l'analyse.</w:t>
       </w:r>
     </w:p>
     <w:p>
@@ -5384,13 +6401,23 @@
         </w:rPr>
         <w:t>({{</w:t>
       </w:r>
-      <w:r>
-        <w:rPr>
-          <w:rFonts w:ascii="Cambria" w:eastAsia="MS Mincho" w:hAnsi="Cambria"/>
-          <w:sz w:val="22"/>
-          <w:szCs w:val="22"/>
-        </w:rPr>
-        <w:t>nominal_power_pct}}</w:t>
+      <w:proofErr w:type="spellStart"/>
+      <w:r>
+        <w:rPr>
+          <w:rFonts w:ascii="Cambria" w:eastAsia="MS Mincho" w:hAnsi="Cambria"/>
+          <w:sz w:val="22"/>
+          <w:szCs w:val="22"/>
+        </w:rPr>
+        <w:t>nominal_power_pct</w:t>
+      </w:r>
+      <w:proofErr w:type="spellEnd"/>
+      <w:r>
+        <w:rPr>
+          <w:rFonts w:ascii="Cambria" w:eastAsia="MS Mincho" w:hAnsi="Cambria"/>
+          <w:sz w:val="22"/>
+          <w:szCs w:val="22"/>
+        </w:rPr>
+        <w:t>}}</w:t>
       </w:r>
       <w:r>
         <w:rPr>
@@ -5398,59 +6425,254 @@
           <w:sz w:val="22"/>
           <w:szCs w:val="22"/>
         </w:rPr>
-        <w:t xml:space="preserve"> % de la puissance nominale) pendant le RunTest :</w:t>
+        <w:t xml:space="preserve"> % de la puissance nominale) pendant le </w:t>
+      </w:r>
+      <w:proofErr w:type="spellStart"/>
+      <w:r>
+        <w:rPr>
+          <w:rFonts w:ascii="Cambria" w:eastAsia="MS Mincho" w:hAnsi="Cambria" w:cs="Arial"/>
+          <w:sz w:val="22"/>
+          <w:szCs w:val="22"/>
+        </w:rPr>
+        <w:t>RunTest</w:t>
+      </w:r>
+      <w:proofErr w:type="spellEnd"/>
+      <w:r>
+        <w:rPr>
+          <w:rFonts w:ascii="Cambria" w:eastAsia="MS Mincho" w:hAnsi="Cambria" w:cs="Arial"/>
+          <w:sz w:val="22"/>
+          <w:szCs w:val="22"/>
+        </w:rPr>
+        <w:t xml:space="preserve"> :</w:t>
       </w:r>
     </w:p>
-    <w:p>
-      <w:pPr>
-        <w:keepNext/>
-        <w:spacing w:after="200" w:line="276" w:lineRule="auto"/>
-        <w:ind w:left="720"/>
-        <w:jc w:val="center"/>
-        <w:rPr>
-          <w:rFonts w:ascii="Cambria" w:eastAsia="MS Mincho" w:hAnsi="Cambria" w:cs="Arial"/>
-          <w:sz w:val="22"/>
-          <w:szCs w:val="22"/>
-          <w:lang w:val="en-US"/>
-        </w:rPr>
-      </w:pPr>
-      <w:r>
-        <w:rPr>
-          <w:rFonts w:ascii="Cambria" w:eastAsia="MS Mincho" w:hAnsi="Cambria" w:cs="Arial"/>
-          <w:sz w:val="22"/>
-          <w:szCs w:val="22"/>
-          <w:lang w:val="en-US"/>
-        </w:rPr>
-        <w:t>{{</w:t>
-      </w:r>
-      <w:r>
-        <w:rPr>
-          <w:rFonts w:ascii="Cambria" w:eastAsia="MS Mincho" w:hAnsi="Cambria" w:cs="Arial"/>
-          <w:sz w:val="22"/>
-          <w:szCs w:val="22"/>
-          <w:lang w:val="en-US"/>
-        </w:rPr>
-        <w:t xml:space="preserve">nominal_power_duration_table </w:t>
-      </w:r>
-      <w:r>
-        <w:rPr>
-          <w:rFonts w:ascii="Cambria" w:eastAsia="MS Mincho" w:hAnsi="Cambria" w:cs="Arial"/>
-          <w:sz w:val="22"/>
-          <w:szCs w:val="22"/>
-          <w:lang w:val="en-US"/>
-        </w:rPr>
-        <w:t xml:space="preserve"> </w:t>
-      </w:r>
-      <w:r>
-        <w:rPr>
-          <w:rFonts w:ascii="Cambria" w:eastAsia="MS Mincho" w:hAnsi="Cambria" w:cs="Arial"/>
-          <w:sz w:val="22"/>
-          <w:szCs w:val="22"/>
-          <w:lang w:val="en-US"/>
-        </w:rPr>
-        <w:t>}}</w:t>
-      </w:r>
-    </w:p>
+    <w:tbl>
+      <w:tblPr>
+        <w:tblStyle w:val="TableauGrille4-Accentuation1"/>
+        <w:tblW w:w="0" w:type="auto"/>
+        <w:tblLook w:val="04A0" w:firstRow="1" w:lastRow="0" w:firstColumn="1" w:lastColumn="0" w:noHBand="0" w:noVBand="1"/>
+      </w:tblPr>
+      <w:tblGrid>
+        <w:gridCol w:w="1139"/>
+        <w:gridCol w:w="2244"/>
+        <w:gridCol w:w="3842"/>
+        <w:gridCol w:w="2515"/>
+      </w:tblGrid>
+      <w:tr>
+        <w:trPr>
+          <w:cnfStyle w:val="100000000000" w:firstRow="1" w:lastRow="0" w:firstColumn="0" w:lastColumn="0" w:oddVBand="0" w:evenVBand="0" w:oddHBand="0" w:evenHBand="0" w:firstRowFirstColumn="0" w:firstRowLastColumn="0" w:lastRowFirstColumn="0" w:lastRowLastColumn="0"/>
+        </w:trPr>
+        <w:tc>
+          <w:tcPr>
+            <w:cnfStyle w:val="001000000000" w:firstRow="0" w:lastRow="0" w:firstColumn="1" w:lastColumn="0" w:oddVBand="0" w:evenVBand="0" w:oddHBand="0" w:evenHBand="0" w:firstRowFirstColumn="0" w:firstRowLastColumn="0" w:lastRowFirstColumn="0" w:lastRowLastColumn="0"/>
+            <w:tcW w:w="2273" w:type="dxa"/>
+          </w:tcPr>
+          <w:p>
+            <w:pPr>
+              <w:rPr>
+                <w:rFonts w:ascii="Arial" w:eastAsia="MS Gothic" w:hAnsi="Arial" w:cs="Arial"/>
+              </w:rPr>
+            </w:pPr>
+            <w:r>
+              <w:rPr>
+                <w:rFonts w:ascii="Arial" w:eastAsia="MS Gothic" w:hAnsi="Arial" w:cs="Arial"/>
+              </w:rPr>
+              <w:t>Eolienne</w:t>
+            </w:r>
+          </w:p>
+        </w:tc>
+        <w:tc>
+          <w:tcPr>
+            <w:tcW w:w="2172" w:type="dxa"/>
+          </w:tcPr>
+          <w:p>
+            <w:pPr>
+              <w:cnfStyle w:val="100000000000" w:firstRow="1" w:lastRow="0" w:firstColumn="0" w:lastColumn="0" w:oddVBand="0" w:evenVBand="0" w:oddHBand="0" w:evenHBand="0" w:firstRowFirstColumn="0" w:firstRowLastColumn="0" w:lastRowFirstColumn="0" w:lastRowLastColumn="0"/>
+              <w:rPr>
+                <w:rFonts w:ascii="Arial" w:eastAsia="MS Gothic" w:hAnsi="Arial" w:cs="Arial"/>
+              </w:rPr>
+            </w:pPr>
+            <w:r>
+              <w:rPr>
+                <w:rFonts w:ascii="Arial" w:eastAsia="MS Gothic" w:hAnsi="Arial" w:cs="Arial"/>
+              </w:rPr>
+              <w:t>Durée du Test</w:t>
+            </w:r>
+          </w:p>
+        </w:tc>
+        <w:tc>
+          <w:tcPr>
+            <w:tcW w:w="2907" w:type="dxa"/>
+          </w:tcPr>
+          <w:p>
+            <w:pPr>
+              <w:cnfStyle w:val="100000000000" w:firstRow="1" w:lastRow="0" w:firstColumn="0" w:lastColumn="0" w:oddVBand="0" w:evenVBand="0" w:oddHBand="0" w:evenHBand="0" w:firstRowFirstColumn="0" w:firstRowLastColumn="0" w:lastRowFirstColumn="0" w:lastRowLastColumn="0"/>
+              <w:rPr>
+                <w:rFonts w:ascii="Arial" w:eastAsia="MS Gothic" w:hAnsi="Arial" w:cs="Arial"/>
+              </w:rPr>
+            </w:pPr>
+            <w:r>
+              <w:rPr>
+                <w:rFonts w:ascii="Arial" w:eastAsia="MS Gothic" w:hAnsi="Arial" w:cs="Arial"/>
+              </w:rPr>
+              <w:t>Opération (&gt;= {{</w:t>
+            </w:r>
+            <w:proofErr w:type="spellStart"/>
+            <w:r>
+              <w:rPr>
+                <w:rFonts w:ascii="Arial" w:eastAsia="MS Gothic" w:hAnsi="Arial" w:cs="Arial"/>
+              </w:rPr>
+              <w:t>nominal_power_</w:t>
+            </w:r>
+            <w:proofErr w:type="gramStart"/>
+            <w:r>
+              <w:rPr>
+                <w:rFonts w:ascii="Arial" w:eastAsia="MS Gothic" w:hAnsi="Arial" w:cs="Arial"/>
+              </w:rPr>
+              <w:t>pct</w:t>
+            </w:r>
+            <w:proofErr w:type="spellEnd"/>
+            <w:r>
+              <w:rPr>
+                <w:rFonts w:ascii="Arial" w:eastAsia="MS Gothic" w:hAnsi="Arial" w:cs="Arial"/>
+              </w:rPr>
+              <w:t xml:space="preserve"> </w:t>
+            </w:r>
+            <w:r>
+              <w:rPr>
+                <w:rFonts w:ascii="Arial" w:eastAsia="MS Gothic" w:hAnsi="Arial" w:cs="Arial"/>
+              </w:rPr>
+              <w:t>}}%</w:t>
+            </w:r>
+            <w:proofErr w:type="gramEnd"/>
+            <w:r>
+              <w:rPr>
+                <w:rFonts w:ascii="Arial" w:eastAsia="MS Gothic" w:hAnsi="Arial" w:cs="Arial"/>
+              </w:rPr>
+              <w:t>) puissance nominale</w:t>
+            </w:r>
+          </w:p>
+        </w:tc>
+        <w:tc>
+          <w:tcPr>
+            <w:tcW w:w="2544" w:type="dxa"/>
+          </w:tcPr>
+          <w:p>
+            <w:pPr>
+              <w:cnfStyle w:val="100000000000" w:firstRow="1" w:lastRow="0" w:firstColumn="0" w:lastColumn="0" w:oddVBand="0" w:evenVBand="0" w:oddHBand="0" w:evenHBand="0" w:firstRowFirstColumn="0" w:firstRowLastColumn="0" w:lastRowFirstColumn="0" w:lastRowLastColumn="0"/>
+              <w:rPr>
+                <w:rFonts w:ascii="Arial" w:eastAsia="MS Gothic" w:hAnsi="Arial" w:cs="Arial"/>
+              </w:rPr>
+            </w:pPr>
+            <w:proofErr w:type="spellStart"/>
+            <w:r>
+              <w:rPr>
+                <w:rFonts w:ascii="Arial" w:eastAsia="MS Gothic" w:hAnsi="Arial" w:cs="Arial"/>
+              </w:rPr>
+              <w:t>Status</w:t>
+            </w:r>
+            <w:proofErr w:type="spellEnd"/>
+          </w:p>
+        </w:tc>
+      </w:tr>
+      <w:tr>
+        <w:trPr>
+          <w:cnfStyle w:val="000000100000" w:firstRow="0" w:lastRow="0" w:firstColumn="0" w:lastColumn="0" w:oddVBand="0" w:evenVBand="0" w:oddHBand="1" w:evenHBand="0" w:firstRowFirstColumn="0" w:firstRowLastColumn="0" w:lastRowFirstColumn="0" w:lastRowLastColumn="0"/>
+        </w:trPr>
+        <w:tc>
+          <w:tcPr>
+            <w:cnfStyle w:val="001000000000" w:firstRow="0" w:lastRow="0" w:firstColumn="1" w:lastColumn="0" w:oddVBand="0" w:evenVBand="0" w:oddHBand="0" w:evenHBand="0" w:firstRowFirstColumn="0" w:firstRowLastColumn="0" w:lastRowFirstColumn="0" w:lastRowLastColumn="0"/>
+            <w:tcW w:w="2273" w:type="dxa"/>
+          </w:tcPr>
+          <w:p>
+            <w:pPr>
+              <w:rPr>
+                <w:rFonts w:ascii="Arial" w:eastAsia="MS Gothic" w:hAnsi="Arial" w:cs="Arial"/>
+              </w:rPr>
+            </w:pPr>
+            <w:r>
+              <w:rPr>
+                <w:rFonts w:ascii="Arial" w:eastAsia="MS Gothic" w:hAnsi="Arial" w:cs="Arial"/>
+              </w:rPr>
+              <w:t>{{E1}}</w:t>
+            </w:r>
+          </w:p>
+        </w:tc>
+        <w:tc>
+          <w:tcPr>
+            <w:tcW w:w="2172" w:type="dxa"/>
+          </w:tcPr>
+          <w:p>
+            <w:pPr>
+              <w:cnfStyle w:val="000000100000" w:firstRow="0" w:lastRow="0" w:firstColumn="0" w:lastColumn="0" w:oddVBand="0" w:evenVBand="0" w:oddHBand="1" w:evenHBand="0" w:firstRowFirstColumn="0" w:firstRowLastColumn="0" w:lastRowFirstColumn="0" w:lastRowLastColumn="0"/>
+              <w:rPr>
+                <w:rFonts w:ascii="Arial" w:eastAsia="MS Gothic" w:hAnsi="Arial" w:cs="Arial"/>
+              </w:rPr>
+            </w:pPr>
+            <w:r>
+              <w:rPr>
+                <w:rFonts w:ascii="Arial" w:eastAsia="MS Gothic" w:hAnsi="Arial" w:cs="Arial"/>
+              </w:rPr>
+              <w:t>{{E1_max_</w:t>
+            </w:r>
+            <w:r>
+              <w:rPr>
+                <w:rFonts w:ascii="Arial" w:eastAsia="MS Gothic" w:hAnsi="Arial" w:cs="Arial"/>
+              </w:rPr>
+              <w:t>duration</w:t>
+            </w:r>
+            <w:r>
+              <w:rPr>
+                <w:rFonts w:ascii="Arial" w:eastAsia="MS Gothic" w:hAnsi="Arial" w:cs="Arial"/>
+              </w:rPr>
+              <w:t>}}</w:t>
+            </w:r>
+          </w:p>
+        </w:tc>
+        <w:tc>
+          <w:tcPr>
+            <w:tcW w:w="2907" w:type="dxa"/>
+          </w:tcPr>
+          <w:p>
+            <w:pPr>
+              <w:keepNext/>
+              <w:cnfStyle w:val="000000100000" w:firstRow="0" w:lastRow="0" w:firstColumn="0" w:lastColumn="0" w:oddVBand="0" w:evenVBand="0" w:oddHBand="1" w:evenHBand="0" w:firstRowFirstColumn="0" w:firstRowLastColumn="0" w:lastRowFirstColumn="0" w:lastRowLastColumn="0"/>
+              <w:rPr>
+                <w:rFonts w:ascii="Arial" w:eastAsia="MS Gothic" w:hAnsi="Arial" w:cs="Arial"/>
+                <w:lang w:val="en-US"/>
+              </w:rPr>
+            </w:pPr>
+            <w:r>
+              <w:rPr>
+                <w:rFonts w:ascii="Arial" w:eastAsia="MS Gothic" w:hAnsi="Arial" w:cs="Arial"/>
+                <w:lang w:val="en-US"/>
+              </w:rPr>
+              <w:t>{{E1_duration_above_target_power}}</w:t>
+            </w:r>
+          </w:p>
+        </w:tc>
+        <w:tc>
+          <w:tcPr>
+            <w:tcW w:w="2544" w:type="dxa"/>
+          </w:tcPr>
+          <w:p>
+            <w:pPr>
+              <w:keepNext/>
+              <w:cnfStyle w:val="000000100000" w:firstRow="0" w:lastRow="0" w:firstColumn="0" w:lastColumn="0" w:oddVBand="0" w:evenVBand="0" w:oddHBand="1" w:evenHBand="0" w:firstRowFirstColumn="0" w:firstRowLastColumn="0" w:lastRowFirstColumn="0" w:lastRowLastColumn="0"/>
+              <w:rPr>
+                <w:rFonts w:ascii="Arial" w:eastAsia="MS Gothic" w:hAnsi="Arial" w:cs="Arial"/>
+              </w:rPr>
+            </w:pPr>
+            <w:r>
+              <w:rPr>
+                <w:rFonts w:ascii="Arial" w:eastAsia="MS Gothic" w:hAnsi="Arial" w:cs="Arial"/>
+              </w:rPr>
+              <w:t>{{E1_status_message}}</w:t>
+            </w:r>
+          </w:p>
+        </w:tc>
+      </w:tr>
+    </w:tbl>
     <w:p>
       <w:pPr>
         <w:pStyle w:val="Lgende"/>
@@ -5477,7 +6699,7 @@
         <w:rPr>
           <w:noProof/>
         </w:rPr>
-        <w:t>6</w:t>
+        <w:t>5</w:t>
       </w:r>
       <w:r>
         <w:fldChar w:fldCharType="end"/>
@@ -5582,7 +6804,19 @@
           <w:szCs w:val="22"/>
           <w:highlight w:val="green"/>
         </w:rPr>
-        <w:t>n’atteignent pas la puissance nominale</w:t>
+        <w:t xml:space="preserve">n’atteignent pas la puissance </w:t>
+      </w:r>
+      <w:r>
+        <w:rPr>
+          <w:rFonts w:ascii="Cambria" w:eastAsia="MS Mincho" w:hAnsi="Cambria" w:cs="Arial"/>
+          <w:b/>
+          <w:bCs/>
+          <w:sz w:val="22"/>
+          <w:szCs w:val="22"/>
+          <w:highlight w:val="green"/>
+        </w:rPr>
+        <w:lastRenderedPageBreak/>
+        <w:t>nominale</w:t>
       </w:r>
       <w:r>
         <w:rPr>
@@ -5682,8 +6916,9 @@
           <w:sz w:val="22"/>
           <w:szCs w:val="22"/>
         </w:rPr>
-        <w:t>{{local_restarts_max }}</w:t>
-      </w:r>
+        <w:t>{{</w:t>
+      </w:r>
+      <w:proofErr w:type="spellStart"/>
       <w:r>
         <w:rPr>
           <w:rFonts w:ascii="Cambria" w:eastAsia="MS Mincho" w:hAnsi="Cambria"/>
@@ -5692,6 +6927,49 @@
           <w:sz w:val="22"/>
           <w:szCs w:val="22"/>
         </w:rPr>
+        <w:t>local_restarts_</w:t>
+      </w:r>
+      <w:proofErr w:type="gramStart"/>
+      <w:r>
+        <w:rPr>
+          <w:rFonts w:ascii="Cambria" w:eastAsia="MS Mincho" w:hAnsi="Cambria"/>
+          <w:b/>
+          <w:bCs/>
+          <w:sz w:val="22"/>
+          <w:szCs w:val="22"/>
+        </w:rPr>
+        <w:t>max</w:t>
+      </w:r>
+      <w:proofErr w:type="spellEnd"/>
+      <w:r>
+        <w:rPr>
+          <w:rFonts w:ascii="Cambria" w:eastAsia="MS Mincho" w:hAnsi="Cambria"/>
+          <w:b/>
+          <w:bCs/>
+          <w:sz w:val="22"/>
+          <w:szCs w:val="22"/>
+        </w:rPr>
+        <w:t xml:space="preserve"> }</w:t>
+      </w:r>
+      <w:proofErr w:type="gramEnd"/>
+      <w:r>
+        <w:rPr>
+          <w:rFonts w:ascii="Cambria" w:eastAsia="MS Mincho" w:hAnsi="Cambria"/>
+          <w:b/>
+          <w:bCs/>
+          <w:sz w:val="22"/>
+          <w:szCs w:val="22"/>
+        </w:rPr>
+        <w:t>}</w:t>
+      </w:r>
+      <w:r>
+        <w:rPr>
+          <w:rFonts w:ascii="Cambria" w:eastAsia="MS Mincho" w:hAnsi="Cambria"/>
+          <w:b/>
+          <w:bCs/>
+          <w:sz w:val="22"/>
+          <w:szCs w:val="22"/>
+        </w:rPr>
         <w:t xml:space="preserve"> défaillance(s) </w:t>
       </w:r>
       <w:r>
@@ -5703,50 +6981,209 @@
         <w:t>nécessitant un redémarrage manuel pendant les périodes de Run Test.</w:t>
       </w:r>
     </w:p>
+    <w:tbl>
+      <w:tblPr>
+        <w:tblStyle w:val="TableauGrille4-Accentuation1"/>
+        <w:tblW w:w="0" w:type="auto"/>
+        <w:tblLook w:val="04A0" w:firstRow="1" w:lastRow="0" w:firstColumn="1" w:lastColumn="0" w:noHBand="0" w:noVBand="1"/>
+      </w:tblPr>
+      <w:tblGrid>
+        <w:gridCol w:w="3214"/>
+        <w:gridCol w:w="3273"/>
+        <w:gridCol w:w="3253"/>
+      </w:tblGrid>
+      <w:tr>
+        <w:trPr>
+          <w:cnfStyle w:val="100000000000" w:firstRow="1" w:lastRow="0" w:firstColumn="0" w:lastColumn="0" w:oddVBand="0" w:evenVBand="0" w:oddHBand="0" w:evenHBand="0" w:firstRowFirstColumn="0" w:firstRowLastColumn="0" w:lastRowFirstColumn="0" w:lastRowLastColumn="0"/>
+        </w:trPr>
+        <w:tc>
+          <w:tcPr>
+            <w:cnfStyle w:val="001000000000" w:firstRow="0" w:lastRow="0" w:firstColumn="1" w:lastColumn="0" w:oddVBand="0" w:evenVBand="0" w:oddHBand="0" w:evenHBand="0" w:firstRowFirstColumn="0" w:firstRowLastColumn="0" w:lastRowFirstColumn="0" w:lastRowLastColumn="0"/>
+            <w:tcW w:w="3293" w:type="dxa"/>
+          </w:tcPr>
+          <w:p>
+            <w:pPr>
+              <w:keepNext/>
+              <w:spacing w:after="200" w:line="276" w:lineRule="auto"/>
+              <w:jc w:val="both"/>
+              <w:rPr>
+                <w:rFonts w:ascii="Arial" w:eastAsia="MS Mincho" w:hAnsi="Arial" w:cs="Arial"/>
+                <w:sz w:val="22"/>
+                <w:szCs w:val="22"/>
+              </w:rPr>
+            </w:pPr>
+            <w:r>
+              <w:rPr>
+                <w:rFonts w:ascii="Arial" w:eastAsia="MS Mincho" w:hAnsi="Arial" w:cs="Arial"/>
+                <w:sz w:val="22"/>
+                <w:szCs w:val="22"/>
+              </w:rPr>
+              <w:t>Eolienne</w:t>
+            </w:r>
+          </w:p>
+        </w:tc>
+        <w:tc>
+          <w:tcPr>
+            <w:tcW w:w="3293" w:type="dxa"/>
+          </w:tcPr>
+          <w:p>
+            <w:pPr>
+              <w:keepNext/>
+              <w:spacing w:after="200" w:line="276" w:lineRule="auto"/>
+              <w:jc w:val="both"/>
+              <w:cnfStyle w:val="100000000000" w:firstRow="1" w:lastRow="0" w:firstColumn="0" w:lastColumn="0" w:oddVBand="0" w:evenVBand="0" w:oddHBand="0" w:evenHBand="0" w:firstRowFirstColumn="0" w:firstRowLastColumn="0" w:lastRowFirstColumn="0" w:lastRowLastColumn="0"/>
+              <w:rPr>
+                <w:rFonts w:ascii="Arial" w:eastAsia="MS Mincho" w:hAnsi="Arial" w:cs="Arial"/>
+                <w:sz w:val="22"/>
+                <w:szCs w:val="22"/>
+              </w:rPr>
+            </w:pPr>
+            <w:r>
+              <w:rPr>
+                <w:rFonts w:ascii="Arial" w:eastAsia="MS Mincho" w:hAnsi="Arial" w:cs="Arial"/>
+                <w:sz w:val="22"/>
+                <w:szCs w:val="22"/>
+              </w:rPr>
+              <w:t>Nombre de Start/Stop</w:t>
+            </w:r>
+          </w:p>
+        </w:tc>
+        <w:tc>
+          <w:tcPr>
+            <w:tcW w:w="3294" w:type="dxa"/>
+          </w:tcPr>
+          <w:p>
+            <w:pPr>
+              <w:keepNext/>
+              <w:spacing w:after="200" w:line="276" w:lineRule="auto"/>
+              <w:jc w:val="both"/>
+              <w:cnfStyle w:val="100000000000" w:firstRow="1" w:lastRow="0" w:firstColumn="0" w:lastColumn="0" w:oddVBand="0" w:evenVBand="0" w:oddHBand="0" w:evenHBand="0" w:firstRowFirstColumn="0" w:firstRowLastColumn="0" w:lastRowFirstColumn="0" w:lastRowLastColumn="0"/>
+              <w:rPr>
+                <w:rFonts w:ascii="Arial" w:eastAsia="MS Mincho" w:hAnsi="Arial" w:cs="Arial"/>
+                <w:sz w:val="22"/>
+                <w:szCs w:val="22"/>
+              </w:rPr>
+            </w:pPr>
+            <w:proofErr w:type="spellStart"/>
+            <w:r>
+              <w:rPr>
+                <w:rFonts w:ascii="Arial" w:eastAsia="MS Mincho" w:hAnsi="Arial" w:cs="Arial"/>
+                <w:sz w:val="22"/>
+                <w:szCs w:val="22"/>
+              </w:rPr>
+              <w:t>Status</w:t>
+            </w:r>
+            <w:proofErr w:type="spellEnd"/>
+          </w:p>
+        </w:tc>
+      </w:tr>
+      <w:tr>
+        <w:trPr>
+          <w:cnfStyle w:val="000000100000" w:firstRow="0" w:lastRow="0" w:firstColumn="0" w:lastColumn="0" w:oddVBand="0" w:evenVBand="0" w:oddHBand="1" w:evenHBand="0" w:firstRowFirstColumn="0" w:firstRowLastColumn="0" w:lastRowFirstColumn="0" w:lastRowLastColumn="0"/>
+        </w:trPr>
+        <w:tc>
+          <w:tcPr>
+            <w:cnfStyle w:val="001000000000" w:firstRow="0" w:lastRow="0" w:firstColumn="1" w:lastColumn="0" w:oddVBand="0" w:evenVBand="0" w:oddHBand="0" w:evenHBand="0" w:firstRowFirstColumn="0" w:firstRowLastColumn="0" w:lastRowFirstColumn="0" w:lastRowLastColumn="0"/>
+            <w:tcW w:w="3293" w:type="dxa"/>
+          </w:tcPr>
+          <w:p>
+            <w:pPr>
+              <w:keepNext/>
+              <w:spacing w:after="200" w:line="276" w:lineRule="auto"/>
+              <w:jc w:val="both"/>
+              <w:rPr>
+                <w:rFonts w:ascii="Arial" w:eastAsia="MS Mincho" w:hAnsi="Arial" w:cs="Arial"/>
+                <w:sz w:val="22"/>
+                <w:szCs w:val="22"/>
+              </w:rPr>
+            </w:pPr>
+            <w:r>
+              <w:rPr>
+                <w:rFonts w:ascii="Arial" w:eastAsia="MS Mincho" w:hAnsi="Arial" w:cs="Arial"/>
+                <w:sz w:val="22"/>
+                <w:szCs w:val="22"/>
+              </w:rPr>
+              <w:t>{{E1}}</w:t>
+            </w:r>
+          </w:p>
+        </w:tc>
+        <w:tc>
+          <w:tcPr>
+            <w:tcW w:w="3293" w:type="dxa"/>
+          </w:tcPr>
+          <w:p>
+            <w:pPr>
+              <w:keepNext/>
+              <w:spacing w:after="200" w:line="276" w:lineRule="auto"/>
+              <w:jc w:val="both"/>
+              <w:cnfStyle w:val="000000100000" w:firstRow="0" w:lastRow="0" w:firstColumn="0" w:lastColumn="0" w:oddVBand="0" w:evenVBand="0" w:oddHBand="1" w:evenHBand="0" w:firstRowFirstColumn="0" w:firstRowLastColumn="0" w:lastRowFirstColumn="0" w:lastRowLastColumn="0"/>
+              <w:rPr>
+                <w:rFonts w:ascii="Arial" w:eastAsia="MS Mincho" w:hAnsi="Arial" w:cs="Arial"/>
+                <w:sz w:val="22"/>
+                <w:szCs w:val="22"/>
+              </w:rPr>
+            </w:pPr>
+            <w:r>
+              <w:rPr>
+                <w:rFonts w:ascii="Arial" w:eastAsia="MS Mincho" w:hAnsi="Arial" w:cs="Arial"/>
+                <w:sz w:val="22"/>
+                <w:szCs w:val="22"/>
+              </w:rPr>
+              <w:t>{{E1_number_start_stop}}</w:t>
+            </w:r>
+          </w:p>
+        </w:tc>
+        <w:tc>
+          <w:tcPr>
+            <w:tcW w:w="3294" w:type="dxa"/>
+          </w:tcPr>
+          <w:p>
+            <w:pPr>
+              <w:keepNext/>
+              <w:spacing w:after="200" w:line="276" w:lineRule="auto"/>
+              <w:jc w:val="both"/>
+              <w:cnfStyle w:val="000000100000" w:firstRow="0" w:lastRow="0" w:firstColumn="0" w:lastColumn="0" w:oddVBand="0" w:evenVBand="0" w:oddHBand="1" w:evenHBand="0" w:firstRowFirstColumn="0" w:firstRowLastColumn="0" w:lastRowFirstColumn="0" w:lastRowLastColumn="0"/>
+              <w:rPr>
+                <w:rFonts w:ascii="Arial" w:eastAsia="MS Mincho" w:hAnsi="Arial" w:cs="Arial"/>
+                <w:sz w:val="22"/>
+                <w:szCs w:val="22"/>
+              </w:rPr>
+            </w:pPr>
+            <w:r>
+              <w:rPr>
+                <w:rFonts w:ascii="Arial" w:eastAsia="MS Mincho" w:hAnsi="Arial" w:cs="Arial"/>
+                <w:sz w:val="22"/>
+                <w:szCs w:val="22"/>
+              </w:rPr>
+              <w:t>{{</w:t>
+            </w:r>
+            <w:proofErr w:type="spellStart"/>
+            <w:r>
+              <w:rPr>
+                <w:rFonts w:ascii="Arial" w:eastAsia="MS Mincho" w:hAnsi="Arial" w:cs="Arial"/>
+                <w:sz w:val="22"/>
+                <w:szCs w:val="22"/>
+              </w:rPr>
+              <w:t>start_stop_status</w:t>
+            </w:r>
+            <w:proofErr w:type="spellEnd"/>
+            <w:r>
+              <w:rPr>
+                <w:rFonts w:ascii="Arial" w:eastAsia="MS Mincho" w:hAnsi="Arial" w:cs="Arial"/>
+                <w:sz w:val="22"/>
+                <w:szCs w:val="22"/>
+              </w:rPr>
+              <w:t>}}</w:t>
+            </w:r>
+          </w:p>
+        </w:tc>
+      </w:tr>
+    </w:tbl>
     <w:p>
       <w:pPr>
         <w:pStyle w:val="Lgende"/>
         <w:jc w:val="center"/>
         <w:rPr>
-          <w:i w:val="0"/>
-          <w:iCs w:val="0"/>
-          <w:sz w:val="22"/>
-          <w:szCs w:val="22"/>
-        </w:rPr>
-      </w:pPr>
-      <w:r>
-        <w:rPr>
-          <w:i w:val="0"/>
-          <w:iCs w:val="0"/>
-          <w:sz w:val="22"/>
-          <w:szCs w:val="22"/>
-        </w:rPr>
-        <w:t>{{</w:t>
-      </w:r>
-      <w:r>
-        <w:rPr>
-          <w:i w:val="0"/>
-          <w:iCs w:val="0"/>
-          <w:sz w:val="22"/>
-          <w:szCs w:val="22"/>
-        </w:rPr>
-        <w:t>autonomous_operation_table</w:t>
-      </w:r>
-      <w:r>
-        <w:rPr>
-          <w:i w:val="0"/>
-          <w:iCs w:val="0"/>
-          <w:sz w:val="22"/>
-          <w:szCs w:val="22"/>
-        </w:rPr>
-        <w:t>}}</w:t>
-      </w:r>
-    </w:p>
-    <w:p>
-      <w:pPr>
-        <w:pStyle w:val="Lgende"/>
-        <w:jc w:val="center"/>
-        <w:rPr>
           <w:rFonts w:ascii="Cambria" w:eastAsia="MS Mincho" w:hAnsi="Cambria" w:cs="Arial"/>
           <w:sz w:val="22"/>
           <w:szCs w:val="22"/>
@@ -5768,7 +7205,7 @@
         <w:rPr>
           <w:noProof/>
         </w:rPr>
-        <w:t>7</w:t>
+        <w:t>6</w:t>
       </w:r>
       <w:r>
         <w:fldChar w:fldCharType="end"/>
@@ -5795,7 +7232,6 @@
           <w:sz w:val="22"/>
           <w:szCs w:val="22"/>
         </w:rPr>
-        <w:lastRenderedPageBreak/>
         <w:t>La figure suivante illustre les événements correspondant à une intervention manuelle.</w:t>
       </w:r>
     </w:p>
@@ -6330,41 +7766,429 @@
     </w:p>
     <w:p>
       <w:pPr>
-        <w:keepNext/>
-        <w:spacing w:line="276" w:lineRule="auto"/>
-        <w:ind w:left="720"/>
+        <w:pStyle w:val="Lgende"/>
+        <w:spacing w:after="0"/>
         <w:jc w:val="center"/>
-        <w:rPr>
-          <w:rFonts w:ascii="Cambria" w:eastAsia="MS Mincho" w:hAnsi="Cambria" w:cs="Arial"/>
-          <w:sz w:val="22"/>
-          <w:szCs w:val="22"/>
-        </w:rPr>
-      </w:pPr>
-      <w:r>
-        <w:rPr>
-          <w:rFonts w:ascii="Cambria" w:eastAsia="MS Mincho" w:hAnsi="Cambria" w:cs="Arial"/>
-          <w:sz w:val="22"/>
-          <w:szCs w:val="22"/>
-        </w:rPr>
-        <w:t>{{</w:t>
-      </w:r>
-      <w:r>
-        <w:rPr>
-          <w:rFonts w:ascii="Cambria" w:eastAsia="MS Mincho" w:hAnsi="Cambria" w:cs="Arial"/>
-          <w:sz w:val="22"/>
-          <w:szCs w:val="22"/>
-        </w:rPr>
-        <w:t xml:space="preserve">availability_table </w:t>
-      </w:r>
-      <w:r>
-        <w:rPr>
-          <w:rFonts w:ascii="Cambria" w:eastAsia="MS Mincho" w:hAnsi="Cambria" w:cs="Arial"/>
-          <w:sz w:val="22"/>
-          <w:szCs w:val="22"/>
-        </w:rPr>
-        <w:t>}}</w:t>
-      </w:r>
+      </w:pPr>
     </w:p>
+    <w:tbl>
+      <w:tblPr>
+        <w:tblStyle w:val="TableauGrille4-Accentuation1"/>
+        <w:tblW w:w="0" w:type="auto"/>
+        <w:tblLayout w:type="fixed"/>
+        <w:tblLook w:val="04A0" w:firstRow="1" w:lastRow="0" w:firstColumn="1" w:lastColumn="0" w:noHBand="0" w:noVBand="1"/>
+      </w:tblPr>
+      <w:tblGrid>
+        <w:gridCol w:w="1134"/>
+        <w:gridCol w:w="1218"/>
+        <w:gridCol w:w="3042"/>
+        <w:gridCol w:w="2529"/>
+        <w:gridCol w:w="1973"/>
+      </w:tblGrid>
+      <w:tr>
+        <w:trPr>
+          <w:cnfStyle w:val="100000000000" w:firstRow="1" w:lastRow="0" w:firstColumn="0" w:lastColumn="0" w:oddVBand="0" w:evenVBand="0" w:oddHBand="0" w:evenHBand="0" w:firstRowFirstColumn="0" w:firstRowLastColumn="0" w:lastRowFirstColumn="0" w:lastRowLastColumn="0"/>
+        </w:trPr>
+        <w:tc>
+          <w:tcPr>
+            <w:cnfStyle w:val="001000000000" w:firstRow="0" w:lastRow="0" w:firstColumn="1" w:lastColumn="0" w:oddVBand="0" w:evenVBand="0" w:oddHBand="0" w:evenHBand="0" w:firstRowFirstColumn="0" w:firstRowLastColumn="0" w:lastRowFirstColumn="0" w:lastRowLastColumn="0"/>
+            <w:tcW w:w="1134" w:type="dxa"/>
+          </w:tcPr>
+          <w:p>
+            <w:pPr>
+              <w:pStyle w:val="Lgende"/>
+              <w:spacing w:after="0"/>
+              <w:jc w:val="center"/>
+              <w:rPr>
+                <w:rFonts w:ascii="Arial" w:eastAsia="MS Mincho" w:hAnsi="Arial" w:cs="Arial"/>
+                <w:i w:val="0"/>
+                <w:iCs w:val="0"/>
+                <w:color w:val="FFFFFF" w:themeColor="background1"/>
+                <w:sz w:val="22"/>
+                <w:szCs w:val="22"/>
+              </w:rPr>
+            </w:pPr>
+            <w:r>
+              <w:rPr>
+                <w:rFonts w:ascii="Arial" w:eastAsia="MS Mincho" w:hAnsi="Arial" w:cs="Arial"/>
+                <w:i w:val="0"/>
+                <w:iCs w:val="0"/>
+                <w:color w:val="FFFFFF" w:themeColor="background1"/>
+                <w:sz w:val="22"/>
+                <w:szCs w:val="22"/>
+              </w:rPr>
+              <w:lastRenderedPageBreak/>
+              <w:t>Eoli</w:t>
+            </w:r>
+            <w:r>
+              <w:rPr>
+                <w:rFonts w:ascii="Arial" w:eastAsia="MS Mincho" w:hAnsi="Arial" w:cs="Arial"/>
+                <w:i w:val="0"/>
+                <w:iCs w:val="0"/>
+                <w:color w:val="FFFFFF" w:themeColor="background1"/>
+                <w:sz w:val="22"/>
+                <w:szCs w:val="22"/>
+              </w:rPr>
+              <w:t>enne</w:t>
+            </w:r>
+          </w:p>
+        </w:tc>
+        <w:tc>
+          <w:tcPr>
+            <w:tcW w:w="1218" w:type="dxa"/>
+          </w:tcPr>
+          <w:p>
+            <w:pPr>
+              <w:pStyle w:val="Lgende"/>
+              <w:spacing w:after="0"/>
+              <w:jc w:val="center"/>
+              <w:cnfStyle w:val="100000000000" w:firstRow="1" w:lastRow="0" w:firstColumn="0" w:lastColumn="0" w:oddVBand="0" w:evenVBand="0" w:oddHBand="0" w:evenHBand="0" w:firstRowFirstColumn="0" w:firstRowLastColumn="0" w:lastRowFirstColumn="0" w:lastRowLastColumn="0"/>
+              <w:rPr>
+                <w:rFonts w:ascii="Arial" w:eastAsia="MS Mincho" w:hAnsi="Arial" w:cs="Arial"/>
+                <w:i w:val="0"/>
+                <w:iCs w:val="0"/>
+                <w:color w:val="FFFFFF" w:themeColor="background1"/>
+                <w:sz w:val="22"/>
+                <w:szCs w:val="22"/>
+              </w:rPr>
+            </w:pPr>
+            <w:r>
+              <w:rPr>
+                <w:rFonts w:ascii="Arial" w:eastAsia="MS Mincho" w:hAnsi="Arial" w:cs="Arial"/>
+                <w:i w:val="0"/>
+                <w:iCs w:val="0"/>
+                <w:color w:val="FFFFFF" w:themeColor="background1"/>
+                <w:sz w:val="22"/>
+                <w:szCs w:val="22"/>
+              </w:rPr>
+              <w:t>Durée du test</w:t>
+            </w:r>
+          </w:p>
+        </w:tc>
+        <w:tc>
+          <w:tcPr>
+            <w:tcW w:w="3042" w:type="dxa"/>
+          </w:tcPr>
+          <w:p>
+            <w:pPr>
+              <w:pStyle w:val="Lgende"/>
+              <w:spacing w:after="0"/>
+              <w:jc w:val="center"/>
+              <w:cnfStyle w:val="100000000000" w:firstRow="1" w:lastRow="0" w:firstColumn="0" w:lastColumn="0" w:oddVBand="0" w:evenVBand="0" w:oddHBand="0" w:evenHBand="0" w:firstRowFirstColumn="0" w:firstRowLastColumn="0" w:lastRowFirstColumn="0" w:lastRowLastColumn="0"/>
+              <w:rPr>
+                <w:rFonts w:ascii="Arial" w:eastAsia="MS Mincho" w:hAnsi="Arial" w:cs="Arial"/>
+                <w:i w:val="0"/>
+                <w:iCs w:val="0"/>
+                <w:color w:val="FFFFFF" w:themeColor="background1"/>
+                <w:sz w:val="22"/>
+                <w:szCs w:val="22"/>
+              </w:rPr>
+            </w:pPr>
+            <w:r>
+              <w:rPr>
+                <w:rFonts w:ascii="Arial" w:eastAsia="MS Mincho" w:hAnsi="Arial" w:cs="Arial"/>
+                <w:i w:val="0"/>
+                <w:iCs w:val="0"/>
+                <w:color w:val="FFFFFF" w:themeColor="background1"/>
+                <w:sz w:val="22"/>
+                <w:szCs w:val="22"/>
+              </w:rPr>
+              <w:t>Temps d’arrêt non autorisé [h]</w:t>
+            </w:r>
+          </w:p>
+        </w:tc>
+        <w:tc>
+          <w:tcPr>
+            <w:tcW w:w="2529" w:type="dxa"/>
+          </w:tcPr>
+          <w:p>
+            <w:pPr>
+              <w:pStyle w:val="Lgende"/>
+              <w:spacing w:after="0"/>
+              <w:jc w:val="center"/>
+              <w:cnfStyle w:val="100000000000" w:firstRow="1" w:lastRow="0" w:firstColumn="0" w:lastColumn="0" w:oddVBand="0" w:evenVBand="0" w:oddHBand="0" w:evenHBand="0" w:firstRowFirstColumn="0" w:firstRowLastColumn="0" w:lastRowFirstColumn="0" w:lastRowLastColumn="0"/>
+              <w:rPr>
+                <w:rFonts w:ascii="Arial" w:eastAsia="MS Mincho" w:hAnsi="Arial" w:cs="Arial"/>
+                <w:i w:val="0"/>
+                <w:iCs w:val="0"/>
+                <w:color w:val="FFFFFF" w:themeColor="background1"/>
+                <w:sz w:val="22"/>
+                <w:szCs w:val="22"/>
+              </w:rPr>
+            </w:pPr>
+            <w:r>
+              <w:rPr>
+                <w:rFonts w:ascii="Arial" w:eastAsia="MS Mincho" w:hAnsi="Arial" w:cs="Arial"/>
+                <w:i w:val="0"/>
+                <w:iCs w:val="0"/>
+                <w:color w:val="FFFFFF" w:themeColor="background1"/>
+                <w:sz w:val="22"/>
+                <w:szCs w:val="22"/>
+              </w:rPr>
+              <w:t>Disponibilité</w:t>
+            </w:r>
+          </w:p>
+        </w:tc>
+        <w:tc>
+          <w:tcPr>
+            <w:tcW w:w="1973" w:type="dxa"/>
+          </w:tcPr>
+          <w:p>
+            <w:pPr>
+              <w:pStyle w:val="Lgende"/>
+              <w:spacing w:after="0"/>
+              <w:jc w:val="center"/>
+              <w:cnfStyle w:val="100000000000" w:firstRow="1" w:lastRow="0" w:firstColumn="0" w:lastColumn="0" w:oddVBand="0" w:evenVBand="0" w:oddHBand="0" w:evenHBand="0" w:firstRowFirstColumn="0" w:firstRowLastColumn="0" w:lastRowFirstColumn="0" w:lastRowLastColumn="0"/>
+              <w:rPr>
+                <w:rFonts w:ascii="Arial" w:eastAsia="MS Mincho" w:hAnsi="Arial" w:cs="Arial"/>
+                <w:i w:val="0"/>
+                <w:iCs w:val="0"/>
+                <w:color w:val="FFFFFF" w:themeColor="background1"/>
+                <w:sz w:val="22"/>
+                <w:szCs w:val="22"/>
+              </w:rPr>
+            </w:pPr>
+            <w:proofErr w:type="spellStart"/>
+            <w:r>
+              <w:rPr>
+                <w:rFonts w:ascii="Arial" w:eastAsia="MS Mincho" w:hAnsi="Arial" w:cs="Arial"/>
+                <w:i w:val="0"/>
+                <w:iCs w:val="0"/>
+                <w:color w:val="FFFFFF" w:themeColor="background1"/>
+                <w:sz w:val="22"/>
+                <w:szCs w:val="22"/>
+              </w:rPr>
+              <w:t>Status</w:t>
+            </w:r>
+            <w:proofErr w:type="spellEnd"/>
+          </w:p>
+        </w:tc>
+      </w:tr>
+      <w:tr>
+        <w:trPr>
+          <w:cnfStyle w:val="000000100000" w:firstRow="0" w:lastRow="0" w:firstColumn="0" w:lastColumn="0" w:oddVBand="0" w:evenVBand="0" w:oddHBand="1" w:evenHBand="0" w:firstRowFirstColumn="0" w:firstRowLastColumn="0" w:lastRowFirstColumn="0" w:lastRowLastColumn="0"/>
+        </w:trPr>
+        <w:tc>
+          <w:tcPr>
+            <w:cnfStyle w:val="001000000000" w:firstRow="0" w:lastRow="0" w:firstColumn="1" w:lastColumn="0" w:oddVBand="0" w:evenVBand="0" w:oddHBand="0" w:evenHBand="0" w:firstRowFirstColumn="0" w:firstRowLastColumn="0" w:lastRowFirstColumn="0" w:lastRowLastColumn="0"/>
+            <w:tcW w:w="1134" w:type="dxa"/>
+          </w:tcPr>
+          <w:p>
+            <w:pPr>
+              <w:pStyle w:val="Lgende"/>
+              <w:spacing w:after="0"/>
+              <w:jc w:val="center"/>
+              <w:rPr>
+                <w:rFonts w:ascii="Arial" w:eastAsia="MS Mincho" w:hAnsi="Arial" w:cs="Arial"/>
+                <w:i w:val="0"/>
+                <w:iCs w:val="0"/>
+                <w:color w:val="auto"/>
+                <w:sz w:val="22"/>
+                <w:szCs w:val="22"/>
+              </w:rPr>
+            </w:pPr>
+            <w:r>
+              <w:rPr>
+                <w:rFonts w:ascii="Arial" w:eastAsia="MS Mincho" w:hAnsi="Arial" w:cs="Arial"/>
+                <w:i w:val="0"/>
+                <w:iCs w:val="0"/>
+                <w:color w:val="auto"/>
+                <w:sz w:val="22"/>
+                <w:szCs w:val="22"/>
+              </w:rPr>
+              <w:t>{{E1}}</w:t>
+            </w:r>
+          </w:p>
+        </w:tc>
+        <w:tc>
+          <w:tcPr>
+            <w:tcW w:w="1218" w:type="dxa"/>
+          </w:tcPr>
+          <w:p>
+            <w:pPr>
+              <w:pStyle w:val="Lgende"/>
+              <w:spacing w:after="0"/>
+              <w:jc w:val="center"/>
+              <w:cnfStyle w:val="000000100000" w:firstRow="0" w:lastRow="0" w:firstColumn="0" w:lastColumn="0" w:oddVBand="0" w:evenVBand="0" w:oddHBand="1" w:evenHBand="0" w:firstRowFirstColumn="0" w:firstRowLastColumn="0" w:lastRowFirstColumn="0" w:lastRowLastColumn="0"/>
+              <w:rPr>
+                <w:rFonts w:ascii="Arial" w:eastAsia="MS Mincho" w:hAnsi="Arial" w:cs="Arial"/>
+                <w:i w:val="0"/>
+                <w:iCs w:val="0"/>
+                <w:color w:val="auto"/>
+                <w:sz w:val="22"/>
+                <w:szCs w:val="22"/>
+              </w:rPr>
+            </w:pPr>
+            <w:r>
+              <w:rPr>
+                <w:rFonts w:ascii="Arial" w:eastAsia="MS Mincho" w:hAnsi="Arial" w:cs="Arial"/>
+                <w:i w:val="0"/>
+                <w:iCs w:val="0"/>
+                <w:color w:val="auto"/>
+                <w:sz w:val="22"/>
+                <w:szCs w:val="22"/>
+              </w:rPr>
+              <w:t>{{E1_duration}}</w:t>
+            </w:r>
+          </w:p>
+        </w:tc>
+        <w:tc>
+          <w:tcPr>
+            <w:tcW w:w="3042" w:type="dxa"/>
+          </w:tcPr>
+          <w:p>
+            <w:pPr>
+              <w:pStyle w:val="Lgende"/>
+              <w:spacing w:after="0"/>
+              <w:jc w:val="center"/>
+              <w:cnfStyle w:val="000000100000" w:firstRow="0" w:lastRow="0" w:firstColumn="0" w:lastColumn="0" w:oddVBand="0" w:evenVBand="0" w:oddHBand="1" w:evenHBand="0" w:firstRowFirstColumn="0" w:firstRowLastColumn="0" w:lastRowFirstColumn="0" w:lastRowLastColumn="0"/>
+              <w:rPr>
+                <w:rFonts w:ascii="Arial" w:eastAsia="MS Mincho" w:hAnsi="Arial" w:cs="Arial"/>
+                <w:i w:val="0"/>
+                <w:iCs w:val="0"/>
+                <w:color w:val="auto"/>
+                <w:sz w:val="22"/>
+                <w:szCs w:val="22"/>
+                <w:lang w:val="en-US"/>
+              </w:rPr>
+            </w:pPr>
+            <w:r>
+              <w:rPr>
+                <w:rFonts w:ascii="Arial" w:eastAsia="MS Mincho" w:hAnsi="Arial" w:cs="Arial"/>
+                <w:i w:val="0"/>
+                <w:iCs w:val="0"/>
+                <w:color w:val="auto"/>
+                <w:sz w:val="22"/>
+                <w:szCs w:val="22"/>
+                <w:lang w:val="en-US"/>
+              </w:rPr>
+              <w:t>{{E1_hours_above_nominal_power}}</w:t>
+            </w:r>
+          </w:p>
+        </w:tc>
+        <w:tc>
+          <w:tcPr>
+            <w:tcW w:w="2529" w:type="dxa"/>
+          </w:tcPr>
+          <w:p>
+            <w:pPr>
+              <w:pStyle w:val="Lgende"/>
+              <w:spacing w:after="0"/>
+              <w:jc w:val="center"/>
+              <w:cnfStyle w:val="000000100000" w:firstRow="0" w:lastRow="0" w:firstColumn="0" w:lastColumn="0" w:oddVBand="0" w:evenVBand="0" w:oddHBand="1" w:evenHBand="0" w:firstRowFirstColumn="0" w:firstRowLastColumn="0" w:lastRowFirstColumn="0" w:lastRowLastColumn="0"/>
+              <w:rPr>
+                <w:rFonts w:ascii="Arial" w:eastAsia="MS Mincho" w:hAnsi="Arial" w:cs="Arial"/>
+                <w:i w:val="0"/>
+                <w:iCs w:val="0"/>
+                <w:color w:val="auto"/>
+                <w:sz w:val="22"/>
+                <w:szCs w:val="22"/>
+                <w:lang w:val="en-US"/>
+              </w:rPr>
+            </w:pPr>
+            <w:r>
+              <w:rPr>
+                <w:rFonts w:ascii="Arial" w:eastAsia="MS Mincho" w:hAnsi="Arial" w:cs="Arial"/>
+                <w:i w:val="0"/>
+                <w:iCs w:val="0"/>
+                <w:color w:val="auto"/>
+                <w:sz w:val="22"/>
+                <w:szCs w:val="22"/>
+                <w:lang w:val="en-US"/>
+              </w:rPr>
+              <w:t>{{</w:t>
+            </w:r>
+            <w:proofErr w:type="spellStart"/>
+            <w:r>
+              <w:rPr>
+                <w:rFonts w:ascii="Arial" w:eastAsia="MS Mincho" w:hAnsi="Arial" w:cs="Arial"/>
+                <w:i w:val="0"/>
+                <w:iCs w:val="0"/>
+                <w:color w:val="auto"/>
+                <w:sz w:val="22"/>
+                <w:szCs w:val="22"/>
+                <w:lang w:val="en-US"/>
+              </w:rPr>
+              <w:t>percentage_of_disponibily</w:t>
+            </w:r>
+            <w:proofErr w:type="spellEnd"/>
+            <w:r>
+              <w:rPr>
+                <w:rFonts w:ascii="Arial" w:eastAsia="MS Mincho" w:hAnsi="Arial" w:cs="Arial"/>
+                <w:i w:val="0"/>
+                <w:iCs w:val="0"/>
+                <w:color w:val="auto"/>
+                <w:sz w:val="22"/>
+                <w:szCs w:val="22"/>
+                <w:lang w:val="en-US"/>
+              </w:rPr>
+              <w:t>}}</w:t>
+            </w:r>
+          </w:p>
+        </w:tc>
+        <w:tc>
+          <w:tcPr>
+            <w:tcW w:w="1973" w:type="dxa"/>
+          </w:tcPr>
+          <w:p>
+            <w:pPr>
+              <w:pStyle w:val="Lgende"/>
+              <w:keepNext/>
+              <w:spacing w:after="0"/>
+              <w:jc w:val="center"/>
+              <w:cnfStyle w:val="000000100000" w:firstRow="0" w:lastRow="0" w:firstColumn="0" w:lastColumn="0" w:oddVBand="0" w:evenVBand="0" w:oddHBand="1" w:evenHBand="0" w:firstRowFirstColumn="0" w:firstRowLastColumn="0" w:lastRowFirstColumn="0" w:lastRowLastColumn="0"/>
+              <w:rPr>
+                <w:rFonts w:ascii="Arial" w:eastAsia="MS Mincho" w:hAnsi="Arial" w:cs="Arial"/>
+                <w:i w:val="0"/>
+                <w:iCs w:val="0"/>
+                <w:color w:val="auto"/>
+                <w:sz w:val="22"/>
+                <w:szCs w:val="22"/>
+                <w:lang w:val="en-US"/>
+              </w:rPr>
+            </w:pPr>
+            <w:r>
+              <w:rPr>
+                <w:rFonts w:ascii="Arial" w:eastAsia="MS Mincho" w:hAnsi="Arial" w:cs="Arial"/>
+                <w:i w:val="0"/>
+                <w:iCs w:val="0"/>
+                <w:color w:val="auto"/>
+                <w:sz w:val="22"/>
+                <w:szCs w:val="22"/>
+                <w:lang w:val="en-US"/>
+              </w:rPr>
+              <w:t>{{</w:t>
+            </w:r>
+            <w:proofErr w:type="spellStart"/>
+            <w:r>
+              <w:rPr>
+                <w:rFonts w:ascii="Arial" w:eastAsia="MS Mincho" w:hAnsi="Arial" w:cs="Arial"/>
+                <w:i w:val="0"/>
+                <w:iCs w:val="0"/>
+                <w:color w:val="auto"/>
+                <w:sz w:val="22"/>
+                <w:szCs w:val="22"/>
+                <w:lang w:val="en-US"/>
+              </w:rPr>
+              <w:t>status_disponibilty</w:t>
+            </w:r>
+            <w:proofErr w:type="spellEnd"/>
+            <w:r>
+              <w:rPr>
+                <w:rFonts w:ascii="Arial" w:eastAsia="MS Mincho" w:hAnsi="Arial" w:cs="Arial"/>
+                <w:i w:val="0"/>
+                <w:iCs w:val="0"/>
+                <w:color w:val="auto"/>
+                <w:sz w:val="22"/>
+                <w:szCs w:val="22"/>
+                <w:lang w:val="en-US"/>
+              </w:rPr>
+              <w:t>}}</w:t>
+            </w:r>
+          </w:p>
+        </w:tc>
+      </w:tr>
+    </w:tbl>
     <w:p>
       <w:pPr>
         <w:pStyle w:val="Lgende"/>
@@ -6392,7 +8216,7 @@
         <w:rPr>
           <w:noProof/>
         </w:rPr>
-        <w:t>8</w:t>
+        <w:t>7</w:t>
       </w:r>
       <w:r>
         <w:fldChar w:fldCharType="end"/>
@@ -6589,11 +8413,187 @@
           <w:rFonts w:eastAsia="MS Mincho"/>
         </w:rPr>
       </w:pPr>
+      <w:proofErr w:type="spellStart"/>
       <w:r>
         <w:rPr>
           <w:rFonts w:eastAsia="MS Mincho"/>
         </w:rPr>
-        <w:t xml:space="preserve">L’analyse des Run Tests a été réalisée à partir des données SCADA, des journaux d’événements et de la documentation contractuelle définissant les critères de validation. </w:t>
+        <w:t>L’analyse</w:t>
+      </w:r>
+      <w:proofErr w:type="spellEnd"/>
+      <w:r>
+        <w:rPr>
+          <w:rFonts w:eastAsia="MS Mincho"/>
+        </w:rPr>
+        <w:t xml:space="preserve"> des Run Tests a </w:t>
+      </w:r>
+      <w:proofErr w:type="spellStart"/>
+      <w:r>
+        <w:rPr>
+          <w:rFonts w:eastAsia="MS Mincho"/>
+        </w:rPr>
+        <w:t>été</w:t>
+      </w:r>
+      <w:proofErr w:type="spellEnd"/>
+      <w:r>
+        <w:rPr>
+          <w:rFonts w:eastAsia="MS Mincho"/>
+        </w:rPr>
+        <w:t xml:space="preserve"> </w:t>
+      </w:r>
+      <w:proofErr w:type="spellStart"/>
+      <w:r>
+        <w:rPr>
+          <w:rFonts w:eastAsia="MS Mincho"/>
+        </w:rPr>
+        <w:t>réalisée</w:t>
+      </w:r>
+      <w:proofErr w:type="spellEnd"/>
+      <w:r>
+        <w:rPr>
+          <w:rFonts w:eastAsia="MS Mincho"/>
+        </w:rPr>
+        <w:t xml:space="preserve"> à </w:t>
+      </w:r>
+      <w:proofErr w:type="spellStart"/>
+      <w:r>
+        <w:rPr>
+          <w:rFonts w:eastAsia="MS Mincho"/>
+        </w:rPr>
+        <w:t>partir</w:t>
+      </w:r>
+      <w:proofErr w:type="spellEnd"/>
+      <w:r>
+        <w:rPr>
+          <w:rFonts w:eastAsia="MS Mincho"/>
+        </w:rPr>
+        <w:t xml:space="preserve"> des </w:t>
+      </w:r>
+      <w:proofErr w:type="spellStart"/>
+      <w:r>
+        <w:rPr>
+          <w:rFonts w:eastAsia="MS Mincho"/>
+        </w:rPr>
+        <w:t>données</w:t>
+      </w:r>
+      <w:proofErr w:type="spellEnd"/>
+      <w:r>
+        <w:rPr>
+          <w:rFonts w:eastAsia="MS Mincho"/>
+        </w:rPr>
+        <w:t xml:space="preserve"> SCADA, des </w:t>
+      </w:r>
+      <w:proofErr w:type="spellStart"/>
+      <w:r>
+        <w:rPr>
+          <w:rFonts w:eastAsia="MS Mincho"/>
+        </w:rPr>
+        <w:t>journaux</w:t>
+      </w:r>
+      <w:proofErr w:type="spellEnd"/>
+      <w:r>
+        <w:rPr>
+          <w:rFonts w:eastAsia="MS Mincho"/>
+        </w:rPr>
+        <w:t xml:space="preserve"> </w:t>
+      </w:r>
+      <w:proofErr w:type="spellStart"/>
+      <w:r>
+        <w:rPr>
+          <w:rFonts w:eastAsia="MS Mincho"/>
+        </w:rPr>
+        <w:t>d’événements</w:t>
+      </w:r>
+      <w:proofErr w:type="spellEnd"/>
+      <w:r>
+        <w:rPr>
+          <w:rFonts w:eastAsia="MS Mincho"/>
+        </w:rPr>
+        <w:t xml:space="preserve"> et de la </w:t>
+      </w:r>
+      <w:proofErr w:type="spellStart"/>
+      <w:r>
+        <w:rPr>
+          <w:rFonts w:eastAsia="MS Mincho"/>
+        </w:rPr>
+        <w:t>documentation</w:t>
+      </w:r>
+      <w:proofErr w:type="spellEnd"/>
+      <w:r>
+        <w:rPr>
+          <w:rFonts w:eastAsia="MS Mincho"/>
+        </w:rPr>
+        <w:t xml:space="preserve"> </w:t>
+      </w:r>
+      <w:proofErr w:type="spellStart"/>
+      <w:r>
+        <w:rPr>
+          <w:rFonts w:eastAsia="MS Mincho"/>
+        </w:rPr>
+        <w:t>contractuelle</w:t>
+      </w:r>
+      <w:proofErr w:type="spellEnd"/>
+      <w:r>
+        <w:rPr>
+          <w:rFonts w:eastAsia="MS Mincho"/>
+        </w:rPr>
+        <w:t xml:space="preserve"> </w:t>
+      </w:r>
+      <w:proofErr w:type="spellStart"/>
+      <w:r>
+        <w:rPr>
+          <w:rFonts w:eastAsia="MS Mincho"/>
+        </w:rPr>
+        <w:t>définissant</w:t>
+      </w:r>
+      <w:proofErr w:type="spellEnd"/>
+      <w:r>
+        <w:rPr>
+          <w:rFonts w:eastAsia="MS Mincho"/>
+        </w:rPr>
+        <w:t xml:space="preserve"> </w:t>
+      </w:r>
+      <w:proofErr w:type="spellStart"/>
+      <w:r>
+        <w:rPr>
+          <w:rFonts w:eastAsia="MS Mincho"/>
+        </w:rPr>
+        <w:t>les</w:t>
+      </w:r>
+      <w:proofErr w:type="spellEnd"/>
+      <w:r>
+        <w:rPr>
+          <w:rFonts w:eastAsia="MS Mincho"/>
+        </w:rPr>
+        <w:t xml:space="preserve"> </w:t>
+      </w:r>
+      <w:proofErr w:type="spellStart"/>
+      <w:r>
+        <w:rPr>
+          <w:rFonts w:eastAsia="MS Mincho"/>
+        </w:rPr>
+        <w:t>critères</w:t>
+      </w:r>
+      <w:proofErr w:type="spellEnd"/>
+      <w:r>
+        <w:rPr>
+          <w:rFonts w:eastAsia="MS Mincho"/>
+        </w:rPr>
+        <w:t xml:space="preserve"> de </w:t>
+      </w:r>
+      <w:proofErr w:type="spellStart"/>
+      <w:r>
+        <w:rPr>
+          <w:rFonts w:eastAsia="MS Mincho"/>
+        </w:rPr>
+        <w:t>validation</w:t>
+      </w:r>
+      <w:proofErr w:type="spellEnd"/>
+      <w:r>
+        <w:rPr>
+          <w:rFonts w:eastAsia="MS Mincho"/>
+        </w:rPr>
+        <w:t xml:space="preserve">. </w:t>
       </w:r>
     </w:p>
     <w:p>
@@ -6610,7 +8610,6 @@
           <w:rFonts w:eastAsia="MS Mincho"/>
           <w:lang w:val="fr-FR"/>
         </w:rPr>
-        <w:lastRenderedPageBreak/>
         <w:t>Les analyses ont porté sur les éléments suivants :</w:t>
       </w:r>
     </w:p>
@@ -6841,8 +8840,21 @@
           <w:sz w:val="28"/>
           <w:szCs w:val="28"/>
         </w:rPr>
-        <w:t>Power Curve</w:t>
-      </w:r>
+        <w:t xml:space="preserve">Power </w:t>
+      </w:r>
+      <w:proofErr w:type="spellStart"/>
+      <w:r>
+        <w:rPr>
+          <w:rFonts w:ascii="Calibri" w:eastAsia="MS Gothic" w:hAnsi="Calibri" w:cs="Times New Roman"/>
+          <w:b/>
+          <w:bCs/>
+          <w:color w:val="4F81BD"/>
+          <w:sz w:val="28"/>
+          <w:szCs w:val="28"/>
+        </w:rPr>
+        <w:t>Curve</w:t>
+      </w:r>
+      <w:proofErr w:type="spellEnd"/>
     </w:p>
     <w:tbl>
       <w:tblPr>
@@ -6879,7 +8891,21 @@
               <w:rPr>
                 <w:rFonts w:eastAsia="MS Mincho"/>
               </w:rPr>
-              <w:t>{{power_curve}}</w:t>
+              <w:t>{{</w:t>
+            </w:r>
+            <w:proofErr w:type="spellStart"/>
+            <w:r>
+              <w:rPr>
+                <w:rFonts w:eastAsia="MS Mincho"/>
+              </w:rPr>
+              <w:t>power_curve</w:t>
+            </w:r>
+            <w:proofErr w:type="spellEnd"/>
+            <w:r>
+              <w:rPr>
+                <w:rFonts w:eastAsia="MS Mincho"/>
+              </w:rPr>
+              <w:t>}}</w:t>
             </w:r>
           </w:p>
         </w:tc>
@@ -6962,7 +8988,21 @@
               <w:rPr>
                 <w:rFonts w:eastAsia="MS Mincho"/>
               </w:rPr>
-              <w:t>{{wind_rose}}</w:t>
+              <w:t>{{</w:t>
+            </w:r>
+            <w:proofErr w:type="spellStart"/>
+            <w:r>
+              <w:rPr>
+                <w:rFonts w:eastAsia="MS Mincho"/>
+              </w:rPr>
+              <w:t>wind_rose</w:t>
+            </w:r>
+            <w:proofErr w:type="spellEnd"/>
+            <w:r>
+              <w:rPr>
+                <w:rFonts w:eastAsia="MS Mincho"/>
+              </w:rPr>
+              <w:t>}}</w:t>
             </w:r>
           </w:p>
         </w:tc>
@@ -7048,7 +9088,21 @@
               <w:rPr>
                 <w:rFonts w:eastAsia="MS Mincho"/>
               </w:rPr>
-              <w:t>{{histogram_wind}}</w:t>
+              <w:t>{{</w:t>
+            </w:r>
+            <w:proofErr w:type="spellStart"/>
+            <w:r>
+              <w:rPr>
+                <w:rFonts w:eastAsia="MS Mincho"/>
+              </w:rPr>
+              <w:t>histogram_wind</w:t>
+            </w:r>
+            <w:proofErr w:type="spellEnd"/>
+            <w:r>
+              <w:rPr>
+                <w:rFonts w:eastAsia="MS Mincho"/>
+              </w:rPr>
+              <w:t>}}</w:t>
             </w:r>
           </w:p>
         </w:tc>
@@ -7075,6 +9129,7 @@
           <w:szCs w:val="28"/>
         </w:rPr>
       </w:pPr>
+      <w:proofErr w:type="spellStart"/>
       <w:r>
         <w:rPr>
           <w:rFonts w:ascii="Calibri" w:eastAsia="MS Gothic" w:hAnsi="Calibri" w:cs="Times New Roman"/>
@@ -7086,6 +9141,7 @@
         </w:rPr>
         <w:t>Heatmap</w:t>
       </w:r>
+      <w:proofErr w:type="spellEnd"/>
     </w:p>
     <w:tbl>
       <w:tblPr>
@@ -7124,7 +9180,21 @@
               <w:rPr>
                 <w:rFonts w:eastAsia="MS Mincho"/>
               </w:rPr>
-              <w:t>{{heatmap}}</w:t>
+              <w:t>{{</w:t>
+            </w:r>
+            <w:proofErr w:type="spellStart"/>
+            <w:r>
+              <w:rPr>
+                <w:rFonts w:eastAsia="MS Mincho"/>
+              </w:rPr>
+              <w:t>heatmap</w:t>
+            </w:r>
+            <w:proofErr w:type="spellEnd"/>
+            <w:r>
+              <w:rPr>
+                <w:rFonts w:eastAsia="MS Mincho"/>
+              </w:rPr>
+              <w:t>}}</w:t>
             </w:r>
           </w:p>
         </w:tc>
@@ -7181,8 +9251,8 @@
       </w:r>
     </w:p>
     <w:sectPr>
-      <w:headerReference w:type="default" r:id="rId20"/>
-      <w:footerReference w:type="default" r:id="rId21"/>
+      <w:headerReference w:type="default" r:id="rId21"/>
+      <w:footerReference w:type="default" r:id="rId22"/>
       <w:pgSz w:w="11910" w:h="16840"/>
       <w:pgMar w:top="1440" w:right="1080" w:bottom="1440" w:left="1080" w:header="0" w:footer="0" w:gutter="0"/>
       <w:cols w:space="720"/>
@@ -9944,7 +12014,6 @@
   <w:style w:type="character" w:default="1" w:styleId="Policepardfaut">
     <w:name w:val="Default Paragraph Font"/>
     <w:uiPriority w:val="1"/>
-    <w:semiHidden/>
     <w:unhideWhenUsed/>
   </w:style>
   <w:style w:type="table" w:default="1" w:styleId="TableauNormal">

</xml_diff>

<commit_message>
[CHANGE] improve the word generation document
</commit_message>
<xml_diff>
--- a/assets/templates/template_runtest.docx
+++ b/assets/templates/template_runtest.docx
@@ -394,79 +394,8 @@
                                   <w:sz w:val="32"/>
                                   <w:szCs w:val="32"/>
                                 </w:rPr>
-                                <w:t xml:space="preserve">Expertise </w:t>
+                                <w:t>Expertise en énergie renouvelable</w:t>
                               </w:r>
-                              <w:proofErr w:type="spellStart"/>
-                              <w:r>
-                                <w:rPr>
-                                  <w:rFonts w:asciiTheme="majorHAnsi" w:hAnsiTheme="majorHAnsi" w:cstheme="majorHAnsi"/>
-                                  <w:b/>
-                                  <w:bCs/>
-                                  <w:color w:val="FFFFFF" w:themeColor="background1"/>
-                                  <w:spacing w:val="120"/>
-                                  <w:kern w:val="24"/>
-                                  <w:sz w:val="32"/>
-                                  <w:szCs w:val="32"/>
-                                </w:rPr>
-                                <w:t>en</w:t>
-                              </w:r>
-                              <w:proofErr w:type="spellEnd"/>
-                              <w:r>
-                                <w:rPr>
-                                  <w:rFonts w:asciiTheme="majorHAnsi" w:hAnsiTheme="majorHAnsi" w:cstheme="majorHAnsi"/>
-                                  <w:b/>
-                                  <w:bCs/>
-                                  <w:color w:val="FFFFFF" w:themeColor="background1"/>
-                                  <w:spacing w:val="120"/>
-                                  <w:kern w:val="24"/>
-                                  <w:sz w:val="32"/>
-                                  <w:szCs w:val="32"/>
-                                </w:rPr>
-                                <w:t xml:space="preserve"> </w:t>
-                              </w:r>
-                              <w:proofErr w:type="spellStart"/>
-                              <w:r>
-                                <w:rPr>
-                                  <w:rFonts w:asciiTheme="majorHAnsi" w:hAnsiTheme="majorHAnsi" w:cstheme="majorHAnsi"/>
-                                  <w:b/>
-                                  <w:bCs/>
-                                  <w:color w:val="FFFFFF" w:themeColor="background1"/>
-                                  <w:spacing w:val="120"/>
-                                  <w:kern w:val="24"/>
-                                  <w:sz w:val="32"/>
-                                  <w:szCs w:val="32"/>
-                                </w:rPr>
-                                <w:t>énergie</w:t>
-                              </w:r>
-                              <w:proofErr w:type="spellEnd"/>
-                              <w:r>
-                                <w:rPr>
-                                  <w:rFonts w:asciiTheme="majorHAnsi" w:hAnsiTheme="majorHAnsi" w:cstheme="majorHAnsi"/>
-                                  <w:b/>
-                                  <w:bCs/>
-                                  <w:color w:val="FFFFFF" w:themeColor="background1"/>
-                                  <w:spacing w:val="120"/>
-                                  <w:kern w:val="24"/>
-                                  <w:sz w:val="32"/>
-                                  <w:szCs w:val="32"/>
-                                </w:rPr>
-                                <w:t xml:space="preserve"> </w:t>
-                              </w:r>
-                              <w:proofErr w:type="spellStart"/>
-                              <w:r>
-                                <w:rPr>
-                                  <w:rFonts w:asciiTheme="majorHAnsi" w:hAnsiTheme="majorHAnsi" w:cstheme="majorHAnsi"/>
-                                  <w:b/>
-                                  <w:bCs/>
-                                  <w:color w:val="FFFFFF" w:themeColor="background1"/>
-                                  <w:spacing w:val="120"/>
-                                  <w:kern w:val="24"/>
-                                  <w:sz w:val="32"/>
-                                  <w:szCs w:val="32"/>
-                                </w:rPr>
-                                <w:t>renouvelable</w:t>
-                              </w:r>
-                              <w:proofErr w:type="spellEnd"/>
                             </w:p>
                             <w:p>
                               <w:pPr>
@@ -552,79 +481,8 @@
                             <w:sz w:val="32"/>
                             <w:szCs w:val="32"/>
                           </w:rPr>
-                          <w:t xml:space="preserve">Expertise </w:t>
+                          <w:t>Expertise en énergie renouvelable</w:t>
                         </w:r>
-                        <w:proofErr w:type="spellStart"/>
-                        <w:r>
-                          <w:rPr>
-                            <w:rFonts w:asciiTheme="majorHAnsi" w:hAnsiTheme="majorHAnsi" w:cstheme="majorHAnsi"/>
-                            <w:b/>
-                            <w:bCs/>
-                            <w:color w:val="FFFFFF" w:themeColor="background1"/>
-                            <w:spacing w:val="120"/>
-                            <w:kern w:val="24"/>
-                            <w:sz w:val="32"/>
-                            <w:szCs w:val="32"/>
-                          </w:rPr>
-                          <w:t>en</w:t>
-                        </w:r>
-                        <w:proofErr w:type="spellEnd"/>
-                        <w:r>
-                          <w:rPr>
-                            <w:rFonts w:asciiTheme="majorHAnsi" w:hAnsiTheme="majorHAnsi" w:cstheme="majorHAnsi"/>
-                            <w:b/>
-                            <w:bCs/>
-                            <w:color w:val="FFFFFF" w:themeColor="background1"/>
-                            <w:spacing w:val="120"/>
-                            <w:kern w:val="24"/>
-                            <w:sz w:val="32"/>
-                            <w:szCs w:val="32"/>
-                          </w:rPr>
-                          <w:t xml:space="preserve"> </w:t>
-                        </w:r>
-                        <w:proofErr w:type="spellStart"/>
-                        <w:r>
-                          <w:rPr>
-                            <w:rFonts w:asciiTheme="majorHAnsi" w:hAnsiTheme="majorHAnsi" w:cstheme="majorHAnsi"/>
-                            <w:b/>
-                            <w:bCs/>
-                            <w:color w:val="FFFFFF" w:themeColor="background1"/>
-                            <w:spacing w:val="120"/>
-                            <w:kern w:val="24"/>
-                            <w:sz w:val="32"/>
-                            <w:szCs w:val="32"/>
-                          </w:rPr>
-                          <w:t>énergie</w:t>
-                        </w:r>
-                        <w:proofErr w:type="spellEnd"/>
-                        <w:r>
-                          <w:rPr>
-                            <w:rFonts w:asciiTheme="majorHAnsi" w:hAnsiTheme="majorHAnsi" w:cstheme="majorHAnsi"/>
-                            <w:b/>
-                            <w:bCs/>
-                            <w:color w:val="FFFFFF" w:themeColor="background1"/>
-                            <w:spacing w:val="120"/>
-                            <w:kern w:val="24"/>
-                            <w:sz w:val="32"/>
-                            <w:szCs w:val="32"/>
-                          </w:rPr>
-                          <w:t xml:space="preserve"> </w:t>
-                        </w:r>
-                        <w:proofErr w:type="spellStart"/>
-                        <w:r>
-                          <w:rPr>
-                            <w:rFonts w:asciiTheme="majorHAnsi" w:hAnsiTheme="majorHAnsi" w:cstheme="majorHAnsi"/>
-                            <w:b/>
-                            <w:bCs/>
-                            <w:color w:val="FFFFFF" w:themeColor="background1"/>
-                            <w:spacing w:val="120"/>
-                            <w:kern w:val="24"/>
-                            <w:sz w:val="32"/>
-                            <w:szCs w:val="32"/>
-                          </w:rPr>
-                          <w:t>renouvelable</w:t>
-                        </w:r>
-                        <w:proofErr w:type="spellEnd"/>
                       </w:p>
                       <w:p>
                         <w:pPr>
@@ -789,18 +647,8 @@
                 <w:bCs/>
                 <w:szCs w:val="28"/>
               </w:rPr>
-              <w:t xml:space="preserve">Date </w:t>
+              <w:t>Date d’émission</w:t>
             </w:r>
-            <w:proofErr w:type="spellStart"/>
-            <w:r>
-              <w:rPr>
-                <w:b/>
-                <w:bCs/>
-                <w:szCs w:val="28"/>
-              </w:rPr>
-              <w:t>d’émission</w:t>
-            </w:r>
-            <w:proofErr w:type="spellEnd"/>
           </w:p>
         </w:tc>
         <w:tc>
@@ -841,7 +689,6 @@
                 <w:szCs w:val="28"/>
               </w:rPr>
             </w:pPr>
-            <w:proofErr w:type="spellStart"/>
             <w:r>
               <w:rPr>
                 <w:b/>
@@ -850,7 +697,6 @@
               </w:rPr>
               <w:t>Rédacteur</w:t>
             </w:r>
-            <w:proofErr w:type="spellEnd"/>
           </w:p>
         </w:tc>
         <w:tc>
@@ -867,7 +713,6 @@
                 <w:szCs w:val="28"/>
               </w:rPr>
             </w:pPr>
-            <w:proofErr w:type="spellStart"/>
             <w:r>
               <w:rPr>
                 <w:b/>
@@ -876,7 +721,6 @@
               </w:rPr>
               <w:t>Vérificateur</w:t>
             </w:r>
-            <w:proofErr w:type="spellEnd"/>
           </w:p>
         </w:tc>
         <w:tc>
@@ -893,7 +737,6 @@
                 <w:szCs w:val="28"/>
               </w:rPr>
             </w:pPr>
-            <w:proofErr w:type="spellStart"/>
             <w:r>
               <w:rPr>
                 <w:b/>
@@ -902,7 +745,6 @@
               </w:rPr>
               <w:t>Approbateur</w:t>
             </w:r>
-            <w:proofErr w:type="spellEnd"/>
           </w:p>
         </w:tc>
       </w:tr>
@@ -3332,23 +3174,7 @@
           <w:rFonts w:ascii="Cambria" w:hAnsi="Cambria"/>
           <w:lang w:val="fr-FR"/>
         </w:rPr>
-        <w:t>Le présent rapport présente l’analyse des Run Tests réalisée à partir des données SCADA du parc éolien {{</w:t>
-      </w:r>
-      <w:proofErr w:type="spellStart"/>
-      <w:r>
-        <w:rPr>
-          <w:rFonts w:ascii="Cambria" w:hAnsi="Cambria"/>
-          <w:lang w:val="fr-FR"/>
-        </w:rPr>
-        <w:t>Nom_du_parc</w:t>
-      </w:r>
-      <w:proofErr w:type="spellEnd"/>
-      <w:r>
-        <w:rPr>
-          <w:rFonts w:ascii="Cambria" w:hAnsi="Cambria"/>
-          <w:lang w:val="fr-FR"/>
-        </w:rPr>
-        <w:t xml:space="preserve">}}. </w:t>
+        <w:t xml:space="preserve">Le présent rapport présente l’analyse des Run Tests réalisée à partir des données SCADA du parc éolien {{Nom_du_parc}}. </w:t>
       </w:r>
     </w:p>
     <w:p>
@@ -3371,43 +3197,7 @@
           <w:b/>
           <w:lang w:val="fr-FR"/>
         </w:rPr>
-        <w:t>{{</w:t>
-      </w:r>
-      <w:proofErr w:type="spellStart"/>
-      <w:r>
-        <w:rPr>
-          <w:rFonts w:ascii="Cambria" w:hAnsi="Cambria"/>
-          <w:b/>
-          <w:lang w:val="fr-FR"/>
-        </w:rPr>
-        <w:t>Nombre_WTG</w:t>
-      </w:r>
-      <w:proofErr w:type="spellEnd"/>
-      <w:r>
-        <w:rPr>
-          <w:rFonts w:ascii="Cambria" w:hAnsi="Cambria"/>
-          <w:b/>
-          <w:lang w:val="fr-FR"/>
-        </w:rPr>
-        <w:t>}} éoliennes de type {{</w:t>
-      </w:r>
-      <w:proofErr w:type="spellStart"/>
-      <w:r>
-        <w:rPr>
-          <w:rFonts w:ascii="Cambria" w:hAnsi="Cambria"/>
-          <w:b/>
-          <w:lang w:val="fr-FR"/>
-        </w:rPr>
-        <w:t>Modèle_turbine</w:t>
-      </w:r>
-      <w:proofErr w:type="spellEnd"/>
-      <w:r>
-        <w:rPr>
-          <w:rFonts w:ascii="Cambria" w:hAnsi="Cambria"/>
-          <w:b/>
-          <w:lang w:val="fr-FR"/>
-        </w:rPr>
-        <w:t>}}</w:t>
+        <w:t>{{Nombre_WTG}} éoliennes de type {{Modèle_turbine}}</w:t>
       </w:r>
       <w:r>
         <w:rPr>
@@ -3422,25 +3212,7 @@
           <w:b/>
           <w:lang w:val="fr-FR"/>
         </w:rPr>
-        <w:t>{{</w:t>
-      </w:r>
-      <w:proofErr w:type="spellStart"/>
-      <w:r>
-        <w:rPr>
-          <w:rFonts w:ascii="Cambria" w:hAnsi="Cambria"/>
-          <w:b/>
-          <w:lang w:val="fr-FR"/>
-        </w:rPr>
-        <w:t>Puissance_nominale</w:t>
-      </w:r>
-      <w:proofErr w:type="spellEnd"/>
-      <w:r>
-        <w:rPr>
-          <w:rFonts w:ascii="Cambria" w:hAnsi="Cambria"/>
-          <w:b/>
-          <w:lang w:val="fr-FR"/>
-        </w:rPr>
-        <w:t>}}</w:t>
+        <w:t>{{Puissance_nominale}}</w:t>
       </w:r>
       <w:r>
         <w:rPr>
@@ -3607,25 +3379,7 @@
           <w:b/>
           <w:lang w:val="fr-FR"/>
         </w:rPr>
-        <w:t>Critère 1 - Minimum de {{</w:t>
-      </w:r>
-      <w:proofErr w:type="spellStart"/>
-      <w:r>
-        <w:rPr>
-          <w:rFonts w:ascii="Cambria" w:hAnsi="Cambria"/>
-          <w:b/>
-          <w:lang w:val="fr-FR"/>
-        </w:rPr>
-        <w:t>consecutive_hours_h</w:t>
-      </w:r>
-      <w:proofErr w:type="spellEnd"/>
-      <w:r>
-        <w:rPr>
-          <w:rFonts w:ascii="Cambria" w:hAnsi="Cambria"/>
-          <w:b/>
-          <w:lang w:val="fr-FR"/>
-        </w:rPr>
-        <w:t>}} heures consécutives :</w:t>
+        <w:t>Critère 1 - Minimum de {{consecutive_hours_h}} heures consécutives :</w:t>
       </w:r>
       <w:r>
         <w:rPr>
@@ -3648,152 +3402,14 @@
           <w:b/>
           <w:lang w:val="fr-FR"/>
         </w:rPr>
-        <w:t>Critère 2 – {{</w:t>
-      </w:r>
-      <w:proofErr w:type="spellStart"/>
-      <w:r>
-        <w:rPr>
-          <w:rFonts w:ascii="Cambria" w:hAnsi="Cambria"/>
-          <w:b/>
-          <w:lang w:val="fr-FR"/>
-        </w:rPr>
-        <w:t>cut_in_to_cut_out_h</w:t>
-      </w:r>
-      <w:proofErr w:type="spellEnd"/>
-      <w:r>
-        <w:rPr>
-          <w:rFonts w:ascii="Cambria" w:hAnsi="Cambria"/>
-          <w:b/>
-          <w:lang w:val="fr-FR"/>
-        </w:rPr>
-        <w:t>}} heures dans la plage de vitesse du vent comprise entre la vitesse de démarrage et la vitesse d'arrêt ({{</w:t>
-      </w:r>
-      <w:proofErr w:type="spellStart"/>
-      <w:r>
-        <w:rPr>
-          <w:rFonts w:ascii="Cambria" w:hAnsi="Cambria"/>
-          <w:b/>
-          <w:lang w:val="fr-FR"/>
-        </w:rPr>
-        <w:t>cut_in_v_min</w:t>
-      </w:r>
-      <w:proofErr w:type="spellEnd"/>
-      <w:proofErr w:type="gramStart"/>
-      <w:r>
-        <w:rPr>
-          <w:rFonts w:ascii="Cambria" w:hAnsi="Cambria"/>
-          <w:b/>
-          <w:lang w:val="fr-FR"/>
-        </w:rPr>
-        <w:t>}}-</w:t>
-      </w:r>
-      <w:proofErr w:type="gramEnd"/>
-      <w:r>
-        <w:rPr>
-          <w:rFonts w:ascii="Cambria" w:hAnsi="Cambria"/>
-          <w:b/>
-          <w:lang w:val="fr-FR"/>
-        </w:rPr>
-        <w:t xml:space="preserve"> {{</w:t>
-      </w:r>
-      <w:proofErr w:type="spellStart"/>
-      <w:r>
-        <w:rPr>
-          <w:rFonts w:ascii="Cambria" w:hAnsi="Cambria"/>
-          <w:b/>
-          <w:lang w:val="fr-FR"/>
-        </w:rPr>
-        <w:t>cut_in_v_max</w:t>
-      </w:r>
-      <w:proofErr w:type="spellEnd"/>
-      <w:proofErr w:type="gramStart"/>
-      <w:r>
-        <w:rPr>
-          <w:rFonts w:ascii="Cambria" w:hAnsi="Cambria"/>
-          <w:b/>
-          <w:lang w:val="fr-FR"/>
-        </w:rPr>
-        <w:t>}}-</w:t>
-      </w:r>
-      <w:proofErr w:type="gramEnd"/>
-      <w:r>
-        <w:rPr>
-          <w:rFonts w:ascii="Cambria" w:hAnsi="Cambria"/>
-          <w:b/>
-          <w:lang w:val="fr-FR"/>
-        </w:rPr>
-        <w:t xml:space="preserve"> m/s) :</w:t>
+        <w:t>Critère 2 – {{cut_in_to_cut_out_h}} heures dans la plage de vitesse du vent comprise entre la vitesse de démarrage et la vitesse d'arrêt ({{cut_in_v_min}}- {{cut_in_v_max}}- m/s) :</w:t>
       </w:r>
       <w:r>
         <w:rPr>
           <w:rFonts w:ascii="Cambria" w:hAnsi="Cambria"/>
           <w:lang w:val="fr-FR"/>
         </w:rPr>
-        <w:t xml:space="preserve"> au cours de la période de {{</w:t>
-      </w:r>
-      <w:proofErr w:type="spellStart"/>
-      <w:r>
-        <w:rPr>
-          <w:rFonts w:ascii="Cambria" w:hAnsi="Cambria"/>
-          <w:lang w:val="fr-FR"/>
-        </w:rPr>
-        <w:t>consecutive_hours_h</w:t>
-      </w:r>
-      <w:proofErr w:type="spellEnd"/>
-      <w:r>
-        <w:rPr>
-          <w:rFonts w:ascii="Cambria" w:hAnsi="Cambria"/>
-          <w:lang w:val="fr-FR"/>
-        </w:rPr>
-        <w:t>}} heures, l'éolienne doit fonctionner pendant au moins {{</w:t>
-      </w:r>
-      <w:proofErr w:type="spellStart"/>
-      <w:r>
-        <w:rPr>
-          <w:rFonts w:ascii="Cambria" w:hAnsi="Cambria"/>
-          <w:lang w:val="fr-FR"/>
-        </w:rPr>
-        <w:t>cut_in_to_cut_out_h</w:t>
-      </w:r>
-      <w:proofErr w:type="spellEnd"/>
-      <w:r>
-        <w:rPr>
-          <w:rFonts w:ascii="Cambria" w:hAnsi="Cambria"/>
-          <w:lang w:val="fr-FR"/>
-        </w:rPr>
-        <w:t>}} heures avec des vitesses de vent comprises entre la vitesse de démarrage ({{</w:t>
-      </w:r>
-      <w:proofErr w:type="spellStart"/>
-      <w:r>
-        <w:rPr>
-          <w:rFonts w:ascii="Cambria" w:hAnsi="Cambria"/>
-          <w:lang w:val="fr-FR"/>
-        </w:rPr>
-        <w:t>cut_in_v_min</w:t>
-      </w:r>
-      <w:proofErr w:type="spellEnd"/>
-      <w:r>
-        <w:rPr>
-          <w:rFonts w:ascii="Cambria" w:hAnsi="Cambria"/>
-          <w:lang w:val="fr-FR"/>
-        </w:rPr>
-        <w:t>}} m/s) et la vitesse d'arrêt ({{</w:t>
-      </w:r>
-      <w:proofErr w:type="spellStart"/>
-      <w:r>
-        <w:rPr>
-          <w:rFonts w:ascii="Cambria" w:hAnsi="Cambria"/>
-          <w:lang w:val="fr-FR"/>
-        </w:rPr>
-        <w:t>cut_in_v_max</w:t>
-      </w:r>
-      <w:proofErr w:type="spellEnd"/>
-      <w:r>
-        <w:rPr>
-          <w:rFonts w:ascii="Cambria" w:hAnsi="Cambria"/>
-          <w:lang w:val="fr-FR"/>
-        </w:rPr>
-        <w:t xml:space="preserve">}} m/s). </w:t>
+        <w:t xml:space="preserve"> au cours de la période de {{consecutive_hours_h}} heures, l'éolienne doit fonctionner pendant au moins {{cut_in_to_cut_out_h}} heures avec des vitesses de vent comprises entre la vitesse de démarrage ({{cut_in_v_min}} m/s) et la vitesse d'arrêt ({{cut_in_v_max}} m/s). </w:t>
       </w:r>
     </w:p>
     <w:p>
@@ -3809,125 +3425,14 @@
           <w:b/>
           <w:lang w:val="fr-FR"/>
         </w:rPr>
-        <w:t>Critère 3 – {{</w:t>
-      </w:r>
-      <w:proofErr w:type="spellStart"/>
-      <w:r>
-        <w:rPr>
-          <w:rFonts w:ascii="Cambria" w:hAnsi="Cambria"/>
-          <w:b/>
-          <w:lang w:val="fr-FR"/>
-        </w:rPr>
-        <w:t>nominal_power_h</w:t>
-      </w:r>
-      <w:proofErr w:type="spellEnd"/>
-      <w:r>
-        <w:rPr>
-          <w:rFonts w:ascii="Cambria" w:hAnsi="Cambria"/>
-          <w:b/>
-          <w:lang w:val="fr-FR"/>
-        </w:rPr>
-        <w:t>}} heures à {{</w:t>
-      </w:r>
-      <w:proofErr w:type="spellStart"/>
-      <w:r>
-        <w:rPr>
-          <w:rFonts w:ascii="Cambria" w:hAnsi="Cambria"/>
-          <w:b/>
-          <w:lang w:val="fr-FR"/>
-        </w:rPr>
-        <w:t>nominal_power_</w:t>
-      </w:r>
-      <w:proofErr w:type="gramStart"/>
-      <w:r>
-        <w:rPr>
-          <w:rFonts w:ascii="Cambria" w:hAnsi="Cambria"/>
-          <w:b/>
-          <w:lang w:val="fr-FR"/>
-        </w:rPr>
-        <w:t>pct</w:t>
-      </w:r>
-      <w:proofErr w:type="spellEnd"/>
-      <w:r>
-        <w:rPr>
-          <w:rFonts w:ascii="Cambria" w:hAnsi="Cambria"/>
-          <w:b/>
-          <w:lang w:val="fr-FR"/>
-        </w:rPr>
-        <w:t xml:space="preserve"> }</w:t>
-      </w:r>
-      <w:proofErr w:type="gramEnd"/>
-      <w:r>
-        <w:rPr>
-          <w:rFonts w:ascii="Cambria" w:hAnsi="Cambria"/>
-          <w:b/>
-          <w:lang w:val="fr-FR"/>
-        </w:rPr>
-        <w:t>} % ou plus de la puissance nominale :</w:t>
+        <w:t>Critère 3 – {{nominal_power_h}} heures à {{nominal_power_pct }} % ou plus de la puissance nominale :</w:t>
       </w:r>
       <w:r>
         <w:rPr>
           <w:rFonts w:ascii="Cambria" w:hAnsi="Cambria"/>
           <w:lang w:val="fr-FR"/>
         </w:rPr>
-        <w:t xml:space="preserve"> L'éolienne doit fonctionner pendant au moins </w:t>
-      </w:r>
-      <w:proofErr w:type="gramStart"/>
-      <w:r>
-        <w:rPr>
-          <w:rFonts w:ascii="Cambria" w:hAnsi="Cambria"/>
-          <w:lang w:val="fr-FR"/>
-        </w:rPr>
-        <w:t xml:space="preserve">{{ </w:t>
-      </w:r>
-      <w:proofErr w:type="spellStart"/>
-      <w:r>
-        <w:rPr>
-          <w:rFonts w:ascii="Cambria" w:hAnsi="Cambria"/>
-          <w:lang w:val="fr-FR"/>
-        </w:rPr>
-        <w:t>nominal</w:t>
-      </w:r>
-      <w:proofErr w:type="gramEnd"/>
-      <w:r>
-        <w:rPr>
-          <w:rFonts w:ascii="Cambria" w:hAnsi="Cambria"/>
-          <w:lang w:val="fr-FR"/>
-        </w:rPr>
-        <w:t>_power_h</w:t>
-      </w:r>
-      <w:proofErr w:type="spellEnd"/>
-      <w:r>
-        <w:rPr>
-          <w:rFonts w:ascii="Cambria" w:hAnsi="Cambria"/>
-          <w:lang w:val="fr-FR"/>
-        </w:rPr>
-        <w:t>}} heures à {{</w:t>
-      </w:r>
-      <w:proofErr w:type="spellStart"/>
-      <w:r>
-        <w:rPr>
-          <w:rFonts w:ascii="Cambria" w:hAnsi="Cambria"/>
-          <w:lang w:val="fr-FR"/>
-        </w:rPr>
-        <w:t>nominal_power_pct</w:t>
-      </w:r>
-      <w:proofErr w:type="spellEnd"/>
-      <w:proofErr w:type="gramStart"/>
-      <w:r>
-        <w:rPr>
-          <w:rFonts w:ascii="Cambria" w:hAnsi="Cambria"/>
-          <w:lang w:val="fr-FR"/>
-        </w:rPr>
-        <w:t>}}%</w:t>
-      </w:r>
-      <w:proofErr w:type="gramEnd"/>
-      <w:r>
-        <w:rPr>
-          <w:rFonts w:ascii="Cambria" w:hAnsi="Cambria"/>
-          <w:lang w:val="fr-FR"/>
-        </w:rPr>
-        <w:t xml:space="preserve"> ou plus de sa puissance nominale. </w:t>
+        <w:t xml:space="preserve"> L'éolienne doit fonctionner pendant au moins {{ nominal_power_h}} heures à {{nominal_power_pct}}% ou plus de sa puissance nominale. </w:t>
       </w:r>
     </w:p>
     <w:p>
@@ -3944,61 +3449,7 @@
           <w:lang w:val="fr-FR"/>
         </w:rPr>
         <w:lastRenderedPageBreak/>
-        <w:t>Critère 4 - Confirmations locales / redémarrages (&lt;</w:t>
-      </w:r>
-      <w:proofErr w:type="gramStart"/>
-      <w:r>
-        <w:rPr>
-          <w:rFonts w:ascii="Cambria" w:hAnsi="Cambria"/>
-          <w:b/>
-          <w:lang w:val="fr-FR"/>
-        </w:rPr>
-        <w:t>={</w:t>
-      </w:r>
-      <w:proofErr w:type="gramEnd"/>
-      <w:r>
-        <w:rPr>
-          <w:rFonts w:ascii="Cambria" w:hAnsi="Cambria"/>
-          <w:b/>
-          <w:lang w:val="fr-FR"/>
-        </w:rPr>
-        <w:t>{</w:t>
-      </w:r>
-      <w:proofErr w:type="spellStart"/>
-      <w:r>
-        <w:rPr>
-          <w:rFonts w:ascii="Cambria" w:hAnsi="Cambria"/>
-          <w:b/>
-          <w:lang w:val="fr-FR"/>
-        </w:rPr>
-        <w:t>local_restarts_</w:t>
-      </w:r>
-      <w:proofErr w:type="gramStart"/>
-      <w:r>
-        <w:rPr>
-          <w:rFonts w:ascii="Cambria" w:hAnsi="Cambria"/>
-          <w:b/>
-          <w:lang w:val="fr-FR"/>
-        </w:rPr>
-        <w:t>max</w:t>
-      </w:r>
-      <w:proofErr w:type="spellEnd"/>
-      <w:r>
-        <w:rPr>
-          <w:rFonts w:ascii="Cambria" w:hAnsi="Cambria"/>
-          <w:b/>
-          <w:lang w:val="fr-FR"/>
-        </w:rPr>
-        <w:t xml:space="preserve"> }</w:t>
-      </w:r>
-      <w:proofErr w:type="gramEnd"/>
-      <w:r>
-        <w:rPr>
-          <w:rFonts w:ascii="Cambria" w:hAnsi="Cambria"/>
-          <w:b/>
-          <w:lang w:val="fr-FR"/>
-        </w:rPr>
-        <w:t>}) :</w:t>
+        <w:t>Critère 4 - Confirmations locales / redémarrages (&lt;={{local_restarts_max }}) :</w:t>
       </w:r>
       <w:r>
         <w:rPr>
@@ -4021,61 +3472,7 @@
           <w:b/>
           <w:lang w:val="fr-FR"/>
         </w:rPr>
-        <w:t>Critère 5 - Disponibilité (&gt;</w:t>
-      </w:r>
-      <w:proofErr w:type="gramStart"/>
-      <w:r>
-        <w:rPr>
-          <w:rFonts w:ascii="Cambria" w:hAnsi="Cambria"/>
-          <w:b/>
-          <w:lang w:val="fr-FR"/>
-        </w:rPr>
-        <w:t>={</w:t>
-      </w:r>
-      <w:proofErr w:type="gramEnd"/>
-      <w:r>
-        <w:rPr>
-          <w:rFonts w:ascii="Cambria" w:hAnsi="Cambria"/>
-          <w:b/>
-          <w:lang w:val="fr-FR"/>
-        </w:rPr>
-        <w:t>{</w:t>
-      </w:r>
-      <w:proofErr w:type="spellStart"/>
-      <w:r>
-        <w:rPr>
-          <w:rFonts w:ascii="Cambria" w:hAnsi="Cambria"/>
-          <w:b/>
-          <w:lang w:val="fr-FR"/>
-        </w:rPr>
-        <w:t>availability_min_</w:t>
-      </w:r>
-      <w:proofErr w:type="gramStart"/>
-      <w:r>
-        <w:rPr>
-          <w:rFonts w:ascii="Cambria" w:hAnsi="Cambria"/>
-          <w:b/>
-          <w:lang w:val="fr-FR"/>
-        </w:rPr>
-        <w:t>pct</w:t>
-      </w:r>
-      <w:proofErr w:type="spellEnd"/>
-      <w:r>
-        <w:rPr>
-          <w:rFonts w:ascii="Cambria" w:hAnsi="Cambria"/>
-          <w:b/>
-          <w:lang w:val="fr-FR"/>
-        </w:rPr>
-        <w:t xml:space="preserve"> }</w:t>
-      </w:r>
-      <w:proofErr w:type="gramEnd"/>
-      <w:r>
-        <w:rPr>
-          <w:rFonts w:ascii="Cambria" w:hAnsi="Cambria"/>
-          <w:b/>
-          <w:lang w:val="fr-FR"/>
-        </w:rPr>
-        <w:t>} %) :</w:t>
+        <w:t>Critère 5 - Disponibilité (&gt;={{availability_min_pct }} %) :</w:t>
       </w:r>
       <w:r>
         <w:rPr>
@@ -4137,23 +3534,7 @@
           <w:color w:val="FFFFFF"/>
           <w:sz w:val="2"/>
         </w:rPr>
-        <w:t>[</w:t>
-      </w:r>
-      <w:proofErr w:type="gramStart"/>
-      <w:r>
-        <w:rPr>
-          <w:color w:val="FFFFFF"/>
-          <w:sz w:val="2"/>
-        </w:rPr>
-        <w:t>TABLE:SUMMARY</w:t>
-      </w:r>
-      <w:proofErr w:type="gramEnd"/>
-      <w:r>
-        <w:rPr>
-          <w:color w:val="FFFFFF"/>
-          <w:sz w:val="2"/>
-        </w:rPr>
-        <w:t>_TABLE]</w:t>
+        <w:t>[TABLE:SUMMARY_TABLE]</w:t>
       </w:r>
     </w:p>
     <w:tbl>
@@ -4412,25 +3793,7 @@
           <w:sz w:val="2"/>
           <w:lang w:val="fr-FR"/>
         </w:rPr>
-        <w:t>[</w:t>
-      </w:r>
-      <w:proofErr w:type="gramStart"/>
-      <w:r>
-        <w:rPr>
-          <w:color w:val="FFFFFF"/>
-          <w:sz w:val="2"/>
-          <w:lang w:val="fr-FR"/>
-        </w:rPr>
-        <w:t>TABLE:CONSECUTIVE</w:t>
-      </w:r>
-      <w:proofErr w:type="gramEnd"/>
-      <w:r>
-        <w:rPr>
-          <w:color w:val="FFFFFF"/>
-          <w:sz w:val="2"/>
-          <w:lang w:val="fr-FR"/>
-        </w:rPr>
-        <w:t>_HOURS_TABLE]</w:t>
+        <w:t>[TABLE:CONSECUTIVE_HOURS_TABLE]</w:t>
       </w:r>
     </w:p>
     <w:tbl>
@@ -4440,9 +3803,11 @@
         <w:tblLook w:val="04A0" w:firstRow="1" w:lastRow="0" w:firstColumn="1" w:lastColumn="0" w:noHBand="0" w:noVBand="1"/>
       </w:tblPr>
       <w:tblGrid>
-        <w:gridCol w:w="2880"/>
-        <w:gridCol w:w="2880"/>
-        <w:gridCol w:w="2880"/>
+        <w:gridCol w:w="1757"/>
+        <w:gridCol w:w="1795"/>
+        <w:gridCol w:w="1663"/>
+        <w:gridCol w:w="1703"/>
+        <w:gridCol w:w="1938"/>
       </w:tblGrid>
       <w:tr>
         <w:trPr>
@@ -4451,7 +3816,7 @@
         <w:tc>
           <w:tcPr>
             <w:cnfStyle w:val="001000000000" w:firstRow="0" w:lastRow="0" w:firstColumn="1" w:lastColumn="0" w:oddVBand="0" w:evenVBand="0" w:oddHBand="0" w:evenHBand="0" w:firstRowFirstColumn="0" w:firstRowLastColumn="0" w:lastRowFirstColumn="0" w:lastRowLastColumn="0"/>
-            <w:tcW w:w="2880" w:type="dxa"/>
+            <w:tcW w:w="1757" w:type="dxa"/>
           </w:tcPr>
           <w:p>
             <w:pPr>
@@ -4464,7 +3829,7 @@
         </w:tc>
         <w:tc>
           <w:tcPr>
-            <w:tcW w:w="2880" w:type="dxa"/>
+            <w:tcW w:w="1795" w:type="dxa"/>
           </w:tcPr>
           <w:p>
             <w:pPr>
@@ -4478,7 +3843,35 @@
         </w:tc>
         <w:tc>
           <w:tcPr>
-            <w:tcW w:w="2880" w:type="dxa"/>
+            <w:tcW w:w="1663" w:type="dxa"/>
+          </w:tcPr>
+          <w:p>
+            <w:pPr>
+              <w:jc w:val="center"/>
+              <w:cnfStyle w:val="100000000000" w:firstRow="1" w:lastRow="0" w:firstColumn="0" w:lastColumn="0" w:oddVBand="0" w:evenVBand="0" w:oddHBand="0" w:evenHBand="0" w:firstRowFirstColumn="0" w:firstRowLastColumn="0" w:lastRowFirstColumn="0" w:lastRowLastColumn="0"/>
+            </w:pPr>
+            <w:r>
+              <w:t>Start Date</w:t>
+            </w:r>
+          </w:p>
+        </w:tc>
+        <w:tc>
+          <w:tcPr>
+            <w:tcW w:w="1703" w:type="dxa"/>
+          </w:tcPr>
+          <w:p>
+            <w:pPr>
+              <w:jc w:val="center"/>
+              <w:cnfStyle w:val="100000000000" w:firstRow="1" w:lastRow="0" w:firstColumn="0" w:lastColumn="0" w:oddVBand="0" w:evenVBand="0" w:oddHBand="0" w:evenHBand="0" w:firstRowFirstColumn="0" w:firstRowLastColumn="0" w:lastRowFirstColumn="0" w:lastRowLastColumn="0"/>
+            </w:pPr>
+            <w:r>
+              <w:t>End date</w:t>
+            </w:r>
+          </w:p>
+        </w:tc>
+        <w:tc>
+          <w:tcPr>
+            <w:tcW w:w="1938" w:type="dxa"/>
           </w:tcPr>
           <w:p>
             <w:pPr>
@@ -4627,23 +4020,7 @@
           <w:color w:val="FFFFFF"/>
           <w:sz w:val="2"/>
         </w:rPr>
-        <w:t>[</w:t>
-      </w:r>
-      <w:proofErr w:type="gramStart"/>
-      <w:r>
-        <w:rPr>
-          <w:color w:val="FFFFFF"/>
-          <w:sz w:val="2"/>
-        </w:rPr>
-        <w:t>TABLE:CUT</w:t>
-      </w:r>
-      <w:proofErr w:type="gramEnd"/>
-      <w:r>
-        <w:rPr>
-          <w:color w:val="FFFFFF"/>
-          <w:sz w:val="2"/>
-        </w:rPr>
-        <w:t>_IN_CUT_OUT_TABLE]</w:t>
+        <w:t>[TABLE:CUT_IN_CUT_OUT_TABLE]</w:t>
       </w:r>
     </w:p>
     <w:tbl>
@@ -4751,23 +4128,7 @@
           <w:rFonts w:ascii="Cambria" w:hAnsi="Cambria"/>
           <w:lang w:val="fr-FR"/>
         </w:rPr>
-        <w:t xml:space="preserve">, la durée cumulée de fonctionnement observée </w:t>
-      </w:r>
-      <w:proofErr w:type="spellStart"/>
-      <w:r>
-        <w:rPr>
-          <w:rFonts w:ascii="Cambria" w:hAnsi="Cambria"/>
-          <w:lang w:val="fr-FR"/>
-        </w:rPr>
-        <w:t>étaninférieure</w:t>
-      </w:r>
-      <w:proofErr w:type="spellEnd"/>
-      <w:r>
-        <w:rPr>
-          <w:rFonts w:ascii="Cambria" w:hAnsi="Cambria"/>
-          <w:lang w:val="fr-FR"/>
-        </w:rPr>
-        <w:t xml:space="preserve"> au seuil requis (cas de non-validation).</w:t>
+        <w:t>, la durée cumulée de fonctionnement observée étaninférieure au seuil requis (cas de non-validation).</w:t>
       </w:r>
     </w:p>
     <w:p>
@@ -4846,23 +4207,7 @@
           <w:color w:val="FFFFFF"/>
           <w:sz w:val="2"/>
         </w:rPr>
-        <w:t>[</w:t>
-      </w:r>
-      <w:proofErr w:type="gramStart"/>
-      <w:r>
-        <w:rPr>
-          <w:color w:val="FFFFFF"/>
-          <w:sz w:val="2"/>
-        </w:rPr>
-        <w:t>TABLE:NOMINAL</w:t>
-      </w:r>
-      <w:proofErr w:type="gramEnd"/>
-      <w:r>
-        <w:rPr>
-          <w:color w:val="FFFFFF"/>
-          <w:sz w:val="2"/>
-        </w:rPr>
-        <w:t>_POWER_VALUES_TABLE]</w:t>
+        <w:t>[TABLE:NOMINAL_POWER_VALUES_TABLE]</w:t>
       </w:r>
     </w:p>
     <w:tbl>
@@ -4989,15 +4334,7 @@
           <w:rFonts w:ascii="Cambria" w:hAnsi="Cambria"/>
           <w:lang w:val="fr-FR"/>
         </w:rPr>
-        <w:t xml:space="preserve">L'éolienne doit fonctionner pendant au moins 3 heures à une puissance égale ou supérieure à </w:t>
-      </w:r>
-      <w:proofErr w:type="gramStart"/>
-      <w:r>
-        <w:rPr>
-          <w:rFonts w:ascii="Cambria" w:hAnsi="Cambria"/>
-          <w:lang w:val="fr-FR"/>
-        </w:rPr>
-        <w:t>{{</w:t>
+        <w:t>L'éolienne doit fonctionner pendant au moins 3 heures à une puissance égale ou supérieure à {{</w:t>
       </w:r>
       <w:r>
         <w:rPr>
@@ -5007,45 +4344,12 @@
         </w:rPr>
         <w:t xml:space="preserve"> </w:t>
       </w:r>
-      <w:proofErr w:type="spellStart"/>
       <w:r>
         <w:rPr>
           <w:rFonts w:ascii="Cambria" w:hAnsi="Cambria"/>
           <w:lang w:val="fr-FR"/>
         </w:rPr>
-        <w:t>nominal</w:t>
-      </w:r>
-      <w:proofErr w:type="gramEnd"/>
-      <w:r>
-        <w:rPr>
-          <w:rFonts w:ascii="Cambria" w:hAnsi="Cambria"/>
-          <w:lang w:val="fr-FR"/>
-        </w:rPr>
-        <w:t>_power_pct</w:t>
-      </w:r>
-      <w:proofErr w:type="spellEnd"/>
-      <w:r>
-        <w:rPr>
-          <w:rFonts w:ascii="Cambria" w:hAnsi="Cambria"/>
-          <w:lang w:val="fr-FR"/>
-        </w:rPr>
-        <w:t>}} % de sa puissance nominale, sur la base des données SCADA enregistrées toutes les 10 minutes de la puissance nominale de {{</w:t>
-      </w:r>
-      <w:proofErr w:type="spellStart"/>
-      <w:r>
-        <w:rPr>
-          <w:rFonts w:ascii="Cambria" w:hAnsi="Cambria"/>
-          <w:lang w:val="fr-FR"/>
-        </w:rPr>
-        <w:t>nominal_power_h</w:t>
-      </w:r>
-      <w:proofErr w:type="spellEnd"/>
-      <w:r>
-        <w:rPr>
-          <w:rFonts w:ascii="Cambria" w:hAnsi="Cambria"/>
-          <w:lang w:val="fr-FR"/>
-        </w:rPr>
-        <w:t>}} MW dans l'analyse.</w:t>
+        <w:t>nominal_power_pct}} % de sa puissance nominale, sur la base des données SCADA enregistrées toutes les 10 minutes de la puissance nominale de {{nominal_power_h}} MW dans l'analyse.</w:t>
       </w:r>
     </w:p>
     <w:p>
@@ -5076,39 +4380,7 @@
           <w:rFonts w:ascii="Cambria" w:hAnsi="Cambria"/>
           <w:lang w:val="fr-FR"/>
         </w:rPr>
-        <w:t>Le tableau suivant présente les heures de fonctionnement au-dessus de ({{</w:t>
-      </w:r>
-      <w:proofErr w:type="spellStart"/>
-      <w:r>
-        <w:rPr>
-          <w:rFonts w:ascii="Cambria" w:hAnsi="Cambria"/>
-          <w:lang w:val="fr-FR"/>
-        </w:rPr>
-        <w:t>nominal_power_pct</w:t>
-      </w:r>
-      <w:proofErr w:type="spellEnd"/>
-      <w:r>
-        <w:rPr>
-          <w:rFonts w:ascii="Cambria" w:hAnsi="Cambria"/>
-          <w:lang w:val="fr-FR"/>
-        </w:rPr>
-        <w:t xml:space="preserve">}} % de la puissance nominale) pendant le </w:t>
-      </w:r>
-      <w:proofErr w:type="spellStart"/>
-      <w:r>
-        <w:rPr>
-          <w:rFonts w:ascii="Cambria" w:hAnsi="Cambria"/>
-          <w:lang w:val="fr-FR"/>
-        </w:rPr>
-        <w:t>RunTest</w:t>
-      </w:r>
-      <w:proofErr w:type="spellEnd"/>
-      <w:r>
-        <w:rPr>
-          <w:rFonts w:ascii="Cambria" w:hAnsi="Cambria"/>
-          <w:lang w:val="fr-FR"/>
-        </w:rPr>
-        <w:t xml:space="preserve"> :</w:t>
+        <w:t>Le tableau suivant présente les heures de fonctionnement au-dessus de ({{nominal_power_pct}} % de la puissance nominale) pendant le RunTest :</w:t>
       </w:r>
     </w:p>
     <w:p>
@@ -5117,23 +4389,7 @@
           <w:color w:val="FFFFFF"/>
           <w:sz w:val="2"/>
         </w:rPr>
-        <w:t>[</w:t>
-      </w:r>
-      <w:proofErr w:type="gramStart"/>
-      <w:r>
-        <w:rPr>
-          <w:color w:val="FFFFFF"/>
-          <w:sz w:val="2"/>
-        </w:rPr>
-        <w:t>TABLE:NOMINAL</w:t>
-      </w:r>
-      <w:proofErr w:type="gramEnd"/>
-      <w:r>
-        <w:rPr>
-          <w:color w:val="FFFFFF"/>
-          <w:sz w:val="2"/>
-        </w:rPr>
-        <w:t>_POWER_DURATION_TABLE]</w:t>
+        <w:t>[TABLE:NOMINAL_POWER_DURATION_TABLE]</w:t>
       </w:r>
     </w:p>
     <w:tbl>
@@ -5351,25 +4607,7 @@
           <w:b/>
           <w:lang w:val="fr-FR"/>
         </w:rPr>
-        <w:t>{{</w:t>
-      </w:r>
-      <w:proofErr w:type="spellStart"/>
-      <w:r>
-        <w:rPr>
-          <w:rFonts w:ascii="Cambria" w:hAnsi="Cambria"/>
-          <w:b/>
-          <w:lang w:val="fr-FR"/>
-        </w:rPr>
-        <w:t>local_restarts_max</w:t>
-      </w:r>
-      <w:proofErr w:type="spellEnd"/>
-      <w:r>
-        <w:rPr>
-          <w:rFonts w:ascii="Cambria" w:hAnsi="Cambria"/>
-          <w:b/>
-          <w:lang w:val="fr-FR"/>
-        </w:rPr>
-        <w:t xml:space="preserve">}} défaillance(s) </w:t>
+        <w:t xml:space="preserve">{{local_restarts_max}} défaillance(s) </w:t>
       </w:r>
       <w:r>
         <w:rPr>
@@ -5407,25 +4645,7 @@
           <w:sz w:val="2"/>
           <w:lang w:val="fr-FR"/>
         </w:rPr>
-        <w:t>[</w:t>
-      </w:r>
-      <w:proofErr w:type="gramStart"/>
-      <w:r>
-        <w:rPr>
-          <w:color w:val="FFFFFF"/>
-          <w:sz w:val="2"/>
-          <w:lang w:val="fr-FR"/>
-        </w:rPr>
-        <w:t>TABLE:AUTONOMOUS</w:t>
-      </w:r>
-      <w:proofErr w:type="gramEnd"/>
-      <w:r>
-        <w:rPr>
-          <w:color w:val="FFFFFF"/>
-          <w:sz w:val="2"/>
-          <w:lang w:val="fr-FR"/>
-        </w:rPr>
-        <w:t>_OPERATION_TABLE]</w:t>
+        <w:t>[TABLE:AUTONOMOUS_OPERATION_TABLE]</w:t>
       </w:r>
     </w:p>
     <w:tbl>
@@ -5857,25 +5077,7 @@
           <w:sz w:val="2"/>
           <w:lang w:val="fr-FR"/>
         </w:rPr>
-        <w:t>[</w:t>
-      </w:r>
-      <w:proofErr w:type="gramStart"/>
-      <w:r>
-        <w:rPr>
-          <w:color w:val="FFFFFF"/>
-          <w:sz w:val="2"/>
-          <w:lang w:val="fr-FR"/>
-        </w:rPr>
-        <w:t>TABLE:AVAILABILITY</w:t>
-      </w:r>
-      <w:proofErr w:type="gramEnd"/>
-      <w:r>
-        <w:rPr>
-          <w:color w:val="FFFFFF"/>
-          <w:sz w:val="2"/>
-          <w:lang w:val="fr-FR"/>
-        </w:rPr>
-        <w:t>_TABLE]</w:t>
+        <w:t>[TABLE:AVAILABILITY_TABLE]</w:t>
       </w:r>
     </w:p>
     <w:tbl>
@@ -6141,12 +5343,10 @@
         <w:pStyle w:val="Titre1"/>
       </w:pPr>
       <w:bookmarkStart w:id="18" w:name="_Toc228179433"/>
-      <w:proofErr w:type="spellStart"/>
       <w:r>
         <w:t>Annexe</w:t>
       </w:r>
       <w:bookmarkEnd w:id="18"/>
-      <w:proofErr w:type="spellEnd"/>
     </w:p>
     <w:p/>
     <w:sectPr>

</xml_diff>

<commit_message>
[CHANGE] improve the consécutive hours
</commit_message>
<xml_diff>
--- a/assets/templates/template_runtest.docx
+++ b/assets/templates/template_runtest.docx
@@ -394,7 +394,20 @@
                                   <w:sz w:val="32"/>
                                   <w:szCs w:val="32"/>
                                 </w:rPr>
-                                <w:t>Expertise en énergie renouvelable</w:t>
+                                <w:t xml:space="preserve">Expertise </w:t>
+                              </w:r>
+                              <w:r>
+                                <w:rPr>
+                                  <w:rFonts w:asciiTheme="majorHAnsi" w:hAnsiTheme="majorHAnsi" w:cstheme="majorHAnsi"/>
+                                  <w:b/>
+                                  <w:bCs/>
+                                  <w:color w:val="FFFFFF" w:themeColor="background1"/>
+                                  <w:spacing w:val="120"/>
+                                  <w:kern w:val="24"/>
+                                  <w:sz w:val="32"/>
+                                  <w:szCs w:val="32"/>
+                                </w:rPr>
+                                <w:t>en énergie renouvelable</w:t>
                               </w:r>
                             </w:p>
                             <w:p>
@@ -481,7 +494,20 @@
                             <w:sz w:val="32"/>
                             <w:szCs w:val="32"/>
                           </w:rPr>
-                          <w:t>Expertise en énergie renouvelable</w:t>
+                          <w:t xml:space="preserve">Expertise </w:t>
+                        </w:r>
+                        <w:r>
+                          <w:rPr>
+                            <w:rFonts w:asciiTheme="majorHAnsi" w:hAnsiTheme="majorHAnsi" w:cstheme="majorHAnsi"/>
+                            <w:b/>
+                            <w:bCs/>
+                            <w:color w:val="FFFFFF" w:themeColor="background1"/>
+                            <w:spacing w:val="120"/>
+                            <w:kern w:val="24"/>
+                            <w:sz w:val="32"/>
+                            <w:szCs w:val="32"/>
+                          </w:rPr>
+                          <w:t>en énergie renouvelable</w:t>
                         </w:r>
                       </w:p>
                       <w:p>
@@ -647,8 +673,18 @@
                 <w:bCs/>
                 <w:szCs w:val="28"/>
               </w:rPr>
-              <w:t>Date d’émission</w:t>
+              <w:t xml:space="preserve">Date </w:t>
             </w:r>
+            <w:proofErr w:type="spellStart"/>
+            <w:r>
+              <w:rPr>
+                <w:b/>
+                <w:bCs/>
+                <w:szCs w:val="28"/>
+              </w:rPr>
+              <w:t>d’émission</w:t>
+            </w:r>
+            <w:proofErr w:type="spellEnd"/>
           </w:p>
         </w:tc>
         <w:tc>
@@ -689,6 +725,7 @@
                 <w:szCs w:val="28"/>
               </w:rPr>
             </w:pPr>
+            <w:proofErr w:type="spellStart"/>
             <w:r>
               <w:rPr>
                 <w:b/>
@@ -697,6 +734,7 @@
               </w:rPr>
               <w:t>Rédacteur</w:t>
             </w:r>
+            <w:proofErr w:type="spellEnd"/>
           </w:p>
         </w:tc>
         <w:tc>
@@ -713,6 +751,7 @@
                 <w:szCs w:val="28"/>
               </w:rPr>
             </w:pPr>
+            <w:proofErr w:type="spellStart"/>
             <w:r>
               <w:rPr>
                 <w:b/>
@@ -721,6 +760,7 @@
               </w:rPr>
               <w:t>Vérificateur</w:t>
             </w:r>
+            <w:proofErr w:type="spellEnd"/>
           </w:p>
         </w:tc>
         <w:tc>
@@ -737,6 +777,7 @@
                 <w:szCs w:val="28"/>
               </w:rPr>
             </w:pPr>
+            <w:proofErr w:type="spellStart"/>
             <w:r>
               <w:rPr>
                 <w:b/>
@@ -745,6 +786,7 @@
               </w:rPr>
               <w:t>Approbateur</w:t>
             </w:r>
+            <w:proofErr w:type="spellEnd"/>
           </w:p>
         </w:tc>
       </w:tr>
@@ -3174,7 +3216,23 @@
           <w:rFonts w:ascii="Cambria" w:hAnsi="Cambria"/>
           <w:lang w:val="fr-FR"/>
         </w:rPr>
-        <w:t xml:space="preserve">Le présent rapport présente l’analyse des Run Tests réalisée à partir des données SCADA du parc éolien {{Nom_du_parc}}. </w:t>
+        <w:t>Le présent rapport présente l’analyse des Run Tests réalisée à partir des données SCADA du parc éolien {{</w:t>
+      </w:r>
+      <w:proofErr w:type="spellStart"/>
+      <w:r>
+        <w:rPr>
+          <w:rFonts w:ascii="Cambria" w:hAnsi="Cambria"/>
+          <w:lang w:val="fr-FR"/>
+        </w:rPr>
+        <w:t>Nom_du_parc</w:t>
+      </w:r>
+      <w:proofErr w:type="spellEnd"/>
+      <w:r>
+        <w:rPr>
+          <w:rFonts w:ascii="Cambria" w:hAnsi="Cambria"/>
+          <w:lang w:val="fr-FR"/>
+        </w:rPr>
+        <w:t xml:space="preserve">}}. </w:t>
       </w:r>
     </w:p>
     <w:p>
@@ -3197,7 +3255,43 @@
           <w:b/>
           <w:lang w:val="fr-FR"/>
         </w:rPr>
-        <w:t>{{Nombre_WTG}} éoliennes de type {{Modèle_turbine}}</w:t>
+        <w:t>{{</w:t>
+      </w:r>
+      <w:proofErr w:type="spellStart"/>
+      <w:r>
+        <w:rPr>
+          <w:rFonts w:ascii="Cambria" w:hAnsi="Cambria"/>
+          <w:b/>
+          <w:lang w:val="fr-FR"/>
+        </w:rPr>
+        <w:t>Nombre_WTG</w:t>
+      </w:r>
+      <w:proofErr w:type="spellEnd"/>
+      <w:r>
+        <w:rPr>
+          <w:rFonts w:ascii="Cambria" w:hAnsi="Cambria"/>
+          <w:b/>
+          <w:lang w:val="fr-FR"/>
+        </w:rPr>
+        <w:t>}} éoliennes de type {{</w:t>
+      </w:r>
+      <w:proofErr w:type="spellStart"/>
+      <w:r>
+        <w:rPr>
+          <w:rFonts w:ascii="Cambria" w:hAnsi="Cambria"/>
+          <w:b/>
+          <w:lang w:val="fr-FR"/>
+        </w:rPr>
+        <w:t>Modèle_turbine</w:t>
+      </w:r>
+      <w:proofErr w:type="spellEnd"/>
+      <w:r>
+        <w:rPr>
+          <w:rFonts w:ascii="Cambria" w:hAnsi="Cambria"/>
+          <w:b/>
+          <w:lang w:val="fr-FR"/>
+        </w:rPr>
+        <w:t>}}</w:t>
       </w:r>
       <w:r>
         <w:rPr>
@@ -3212,7 +3306,25 @@
           <w:b/>
           <w:lang w:val="fr-FR"/>
         </w:rPr>
-        <w:t>{{Puissance_nominale}}</w:t>
+        <w:t>{{</w:t>
+      </w:r>
+      <w:proofErr w:type="spellStart"/>
+      <w:r>
+        <w:rPr>
+          <w:rFonts w:ascii="Cambria" w:hAnsi="Cambria"/>
+          <w:b/>
+          <w:lang w:val="fr-FR"/>
+        </w:rPr>
+        <w:t>Puissance_nominale</w:t>
+      </w:r>
+      <w:proofErr w:type="spellEnd"/>
+      <w:r>
+        <w:rPr>
+          <w:rFonts w:ascii="Cambria" w:hAnsi="Cambria"/>
+          <w:b/>
+          <w:lang w:val="fr-FR"/>
+        </w:rPr>
+        <w:t>}}</w:t>
       </w:r>
       <w:r>
         <w:rPr>
@@ -3379,7 +3491,25 @@
           <w:b/>
           <w:lang w:val="fr-FR"/>
         </w:rPr>
-        <w:t>Critère 1 - Minimum de {{consecutive_hours_h}} heures consécutives :</w:t>
+        <w:t>Critère 1 - Minimum de {{</w:t>
+      </w:r>
+      <w:proofErr w:type="spellStart"/>
+      <w:r>
+        <w:rPr>
+          <w:rFonts w:ascii="Cambria" w:hAnsi="Cambria"/>
+          <w:b/>
+          <w:lang w:val="fr-FR"/>
+        </w:rPr>
+        <w:t>consecutive_hours_h</w:t>
+      </w:r>
+      <w:proofErr w:type="spellEnd"/>
+      <w:r>
+        <w:rPr>
+          <w:rFonts w:ascii="Cambria" w:hAnsi="Cambria"/>
+          <w:b/>
+          <w:lang w:val="fr-FR"/>
+        </w:rPr>
+        <w:t>}} heures consécutives :</w:t>
       </w:r>
       <w:r>
         <w:rPr>
@@ -3402,14 +3532,132 @@
           <w:b/>
           <w:lang w:val="fr-FR"/>
         </w:rPr>
-        <w:t>Critère 2 – {{cut_in_to_cut_out_h}} heures dans la plage de vitesse du vent comprise entre la vitesse de démarrage et la vitesse d'arrêt ({{cut_in_v_min}}- {{cut_in_v_max}}- m/s) :</w:t>
+        <w:t>Critère 2 – {{</w:t>
+      </w:r>
+      <w:proofErr w:type="spellStart"/>
+      <w:r>
+        <w:rPr>
+          <w:rFonts w:ascii="Cambria" w:hAnsi="Cambria"/>
+          <w:b/>
+          <w:lang w:val="fr-FR"/>
+        </w:rPr>
+        <w:t>cut_in_to_cut_out_h</w:t>
+      </w:r>
+      <w:proofErr w:type="spellEnd"/>
+      <w:r>
+        <w:rPr>
+          <w:rFonts w:ascii="Cambria" w:hAnsi="Cambria"/>
+          <w:b/>
+          <w:lang w:val="fr-FR"/>
+        </w:rPr>
+        <w:t>}} heures dans la plage de vitesse du vent comprise entre la vitesse de démarrage et la vitesse d'arrêt ({{</w:t>
+      </w:r>
+      <w:proofErr w:type="spellStart"/>
+      <w:r>
+        <w:rPr>
+          <w:rFonts w:ascii="Cambria" w:hAnsi="Cambria"/>
+          <w:b/>
+          <w:lang w:val="fr-FR"/>
+        </w:rPr>
+        <w:t>cut_in_v_min</w:t>
+      </w:r>
+      <w:proofErr w:type="spellEnd"/>
+      <w:r>
+        <w:rPr>
+          <w:rFonts w:ascii="Cambria" w:hAnsi="Cambria"/>
+          <w:b/>
+          <w:lang w:val="fr-FR"/>
+        </w:rPr>
+        <w:t>}}- {{</w:t>
+      </w:r>
+      <w:proofErr w:type="spellStart"/>
+      <w:r>
+        <w:rPr>
+          <w:rFonts w:ascii="Cambria" w:hAnsi="Cambria"/>
+          <w:b/>
+          <w:lang w:val="fr-FR"/>
+        </w:rPr>
+        <w:t>cut_in_v_max</w:t>
+      </w:r>
+      <w:proofErr w:type="spellEnd"/>
+      <w:r>
+        <w:rPr>
+          <w:rFonts w:ascii="Cambria" w:hAnsi="Cambria"/>
+          <w:b/>
+          <w:lang w:val="fr-FR"/>
+        </w:rPr>
+        <w:t>}}- m/s) :</w:t>
       </w:r>
       <w:r>
         <w:rPr>
           <w:rFonts w:ascii="Cambria" w:hAnsi="Cambria"/>
           <w:lang w:val="fr-FR"/>
         </w:rPr>
-        <w:t xml:space="preserve"> au cours de la période de {{consecutive_hours_h}} heures, l'éolienne doit fonctionner pendant au moins {{cut_in_to_cut_out_h}} heures avec des vitesses de vent comprises entre la vitesse de démarrage ({{cut_in_v_min}} m/s) et la vitesse d'arrêt ({{cut_in_v_max}} m/s). </w:t>
+        <w:t xml:space="preserve"> au cours de la période de {{</w:t>
+      </w:r>
+      <w:proofErr w:type="spellStart"/>
+      <w:r>
+        <w:rPr>
+          <w:rFonts w:ascii="Cambria" w:hAnsi="Cambria"/>
+          <w:lang w:val="fr-FR"/>
+        </w:rPr>
+        <w:t>consecutive_hours_h</w:t>
+      </w:r>
+      <w:proofErr w:type="spellEnd"/>
+      <w:r>
+        <w:rPr>
+          <w:rFonts w:ascii="Cambria" w:hAnsi="Cambria"/>
+          <w:lang w:val="fr-FR"/>
+        </w:rPr>
+        <w:t>}} heures, l'éolienne doit fonctionner pendant au moins {{</w:t>
+      </w:r>
+      <w:proofErr w:type="spellStart"/>
+      <w:r>
+        <w:rPr>
+          <w:rFonts w:ascii="Cambria" w:hAnsi="Cambria"/>
+          <w:lang w:val="fr-FR"/>
+        </w:rPr>
+        <w:t>cut_in_to_cut_out_h</w:t>
+      </w:r>
+      <w:proofErr w:type="spellEnd"/>
+      <w:r>
+        <w:rPr>
+          <w:rFonts w:ascii="Cambria" w:hAnsi="Cambria"/>
+          <w:lang w:val="fr-FR"/>
+        </w:rPr>
+        <w:t>}} heures avec des vitesses de vent comprises entre la vitesse de démarrage ({{</w:t>
+      </w:r>
+      <w:proofErr w:type="spellStart"/>
+      <w:r>
+        <w:rPr>
+          <w:rFonts w:ascii="Cambria" w:hAnsi="Cambria"/>
+          <w:lang w:val="fr-FR"/>
+        </w:rPr>
+        <w:t>cut_in_v_min</w:t>
+      </w:r>
+      <w:proofErr w:type="spellEnd"/>
+      <w:r>
+        <w:rPr>
+          <w:rFonts w:ascii="Cambria" w:hAnsi="Cambria"/>
+          <w:lang w:val="fr-FR"/>
+        </w:rPr>
+        <w:t>}} m/s) et la vitesse d'arrêt ({{</w:t>
+      </w:r>
+      <w:proofErr w:type="spellStart"/>
+      <w:r>
+        <w:rPr>
+          <w:rFonts w:ascii="Cambria" w:hAnsi="Cambria"/>
+          <w:lang w:val="fr-FR"/>
+        </w:rPr>
+        <w:t>cut_in_v_max</w:t>
+      </w:r>
+      <w:proofErr w:type="spellEnd"/>
+      <w:r>
+        <w:rPr>
+          <w:rFonts w:ascii="Cambria" w:hAnsi="Cambria"/>
+          <w:lang w:val="fr-FR"/>
+        </w:rPr>
+        <w:t xml:space="preserve">}} m/s). </w:t>
       </w:r>
     </w:p>
     <w:p>
@@ -3425,14 +3673,82 @@
           <w:b/>
           <w:lang w:val="fr-FR"/>
         </w:rPr>
-        <w:t>Critère 3 – {{nominal_power_h}} heures à {{nominal_power_pct }} % ou plus de la puissance nominale :</w:t>
+        <w:t>Critère 3 – {{</w:t>
+      </w:r>
+      <w:proofErr w:type="spellStart"/>
+      <w:r>
+        <w:rPr>
+          <w:rFonts w:ascii="Cambria" w:hAnsi="Cambria"/>
+          <w:b/>
+          <w:lang w:val="fr-FR"/>
+        </w:rPr>
+        <w:t>nominal_power_h</w:t>
+      </w:r>
+      <w:proofErr w:type="spellEnd"/>
+      <w:r>
+        <w:rPr>
+          <w:rFonts w:ascii="Cambria" w:hAnsi="Cambria"/>
+          <w:b/>
+          <w:lang w:val="fr-FR"/>
+        </w:rPr>
+        <w:t>}} heures à {{</w:t>
+      </w:r>
+      <w:proofErr w:type="spellStart"/>
+      <w:r>
+        <w:rPr>
+          <w:rFonts w:ascii="Cambria" w:hAnsi="Cambria"/>
+          <w:b/>
+          <w:lang w:val="fr-FR"/>
+        </w:rPr>
+        <w:t>nominal_power_pct</w:t>
+      </w:r>
+      <w:proofErr w:type="spellEnd"/>
+      <w:r>
+        <w:rPr>
+          <w:rFonts w:ascii="Cambria" w:hAnsi="Cambria"/>
+          <w:b/>
+          <w:lang w:val="fr-FR"/>
+        </w:rPr>
+        <w:t xml:space="preserve"> }} % ou plus de la puissance nominale :</w:t>
       </w:r>
       <w:r>
         <w:rPr>
           <w:rFonts w:ascii="Cambria" w:hAnsi="Cambria"/>
           <w:lang w:val="fr-FR"/>
         </w:rPr>
-        <w:t xml:space="preserve"> L'éolienne doit fonctionner pendant au moins {{ nominal_power_h}} heures à {{nominal_power_pct}}% ou plus de sa puissance nominale. </w:t>
+        <w:t xml:space="preserve"> L'éolienne doit fonctionner pendant au moins {{ </w:t>
+      </w:r>
+      <w:proofErr w:type="spellStart"/>
+      <w:r>
+        <w:rPr>
+          <w:rFonts w:ascii="Cambria" w:hAnsi="Cambria"/>
+          <w:lang w:val="fr-FR"/>
+        </w:rPr>
+        <w:t>nominal_power_h</w:t>
+      </w:r>
+      <w:proofErr w:type="spellEnd"/>
+      <w:r>
+        <w:rPr>
+          <w:rFonts w:ascii="Cambria" w:hAnsi="Cambria"/>
+          <w:lang w:val="fr-FR"/>
+        </w:rPr>
+        <w:t>}} heures à {{</w:t>
+      </w:r>
+      <w:proofErr w:type="spellStart"/>
+      <w:r>
+        <w:rPr>
+          <w:rFonts w:ascii="Cambria" w:hAnsi="Cambria"/>
+          <w:lang w:val="fr-FR"/>
+        </w:rPr>
+        <w:t>nominal_power_pct</w:t>
+      </w:r>
+      <w:proofErr w:type="spellEnd"/>
+      <w:r>
+        <w:rPr>
+          <w:rFonts w:ascii="Cambria" w:hAnsi="Cambria"/>
+          <w:lang w:val="fr-FR"/>
+        </w:rPr>
+        <w:t xml:space="preserve">}}% ou plus de sa puissance nominale. </w:t>
       </w:r>
     </w:p>
     <w:p>
@@ -3449,7 +3765,25 @@
           <w:lang w:val="fr-FR"/>
         </w:rPr>
         <w:lastRenderedPageBreak/>
-        <w:t>Critère 4 - Confirmations locales / redémarrages (&lt;={{local_restarts_max }}) :</w:t>
+        <w:t>Critère 4 - Confirmations locales / redémarrages (&lt;={{</w:t>
+      </w:r>
+      <w:proofErr w:type="spellStart"/>
+      <w:r>
+        <w:rPr>
+          <w:rFonts w:ascii="Cambria" w:hAnsi="Cambria"/>
+          <w:b/>
+          <w:lang w:val="fr-FR"/>
+        </w:rPr>
+        <w:t>local_restarts_max</w:t>
+      </w:r>
+      <w:proofErr w:type="spellEnd"/>
+      <w:r>
+        <w:rPr>
+          <w:rFonts w:ascii="Cambria" w:hAnsi="Cambria"/>
+          <w:b/>
+          <w:lang w:val="fr-FR"/>
+        </w:rPr>
+        <w:t xml:space="preserve"> }}) :</w:t>
       </w:r>
       <w:r>
         <w:rPr>
@@ -3472,7 +3806,25 @@
           <w:b/>
           <w:lang w:val="fr-FR"/>
         </w:rPr>
-        <w:t>Critère 5 - Disponibilité (&gt;={{availability_min_pct }} %) :</w:t>
+        <w:t>Critère 5 - Disponibilité (&gt;={{</w:t>
+      </w:r>
+      <w:proofErr w:type="spellStart"/>
+      <w:r>
+        <w:rPr>
+          <w:rFonts w:ascii="Cambria" w:hAnsi="Cambria"/>
+          <w:b/>
+          <w:lang w:val="fr-FR"/>
+        </w:rPr>
+        <w:t>availability_min_pct</w:t>
+      </w:r>
+      <w:proofErr w:type="spellEnd"/>
+      <w:r>
+        <w:rPr>
+          <w:rFonts w:ascii="Cambria" w:hAnsi="Cambria"/>
+          <w:b/>
+          <w:lang w:val="fr-FR"/>
+        </w:rPr>
+        <w:t xml:space="preserve"> }} %) :</w:t>
       </w:r>
       <w:r>
         <w:rPr>
@@ -3751,13 +4103,6 @@
         </w:rPr>
         <w:t>Les périodes de Run Test ont été identifiées pour chaque turbine à partir des données SCADA disponibles. Le tableau suivant présente les périodes de Run Test considérées pour l’analyse :</w:t>
       </w:r>
-    </w:p>
-    <w:p>
-      <w:pPr>
-        <w:rPr>
-          <w:lang w:val="fr-FR"/>
-        </w:rPr>
-      </w:pPr>
       <w:r>
         <w:rPr>
           <w:lang w:val="fr-FR"/>
@@ -3766,32 +4111,10 @@
       </w:r>
     </w:p>
     <w:p>
-      <w:pPr>
-        <w:pStyle w:val="Titre2"/>
-        <w:rPr>
-          <w:lang w:val="fr-FR"/>
-        </w:rPr>
-      </w:pPr>
-      <w:bookmarkStart w:id="7" w:name="_Toc228179422"/>
-      <w:r>
-        <w:rPr>
-          <w:lang w:val="fr-FR"/>
-        </w:rPr>
-        <w:t>Durée cumulée de fonctionnement</w:t>
-      </w:r>
-      <w:bookmarkEnd w:id="7"/>
-    </w:p>
-    <w:p>
-      <w:pPr>
-        <w:rPr>
-          <w:lang w:val="fr-FR"/>
-        </w:rPr>
-      </w:pPr>
       <w:r>
         <w:rPr>
           <w:color w:val="FFFFFF"/>
           <w:sz w:val="2"/>
-          <w:lang w:val="fr-FR"/>
         </w:rPr>
         <w:t>[TABLE:CONSECUTIVE_HOURS_TABLE]</w:t>
       </w:r>
@@ -3913,14 +4236,14 @@
           <w:lang w:val="fr-FR"/>
         </w:rPr>
       </w:pPr>
-      <w:bookmarkStart w:id="8" w:name="_Toc228179423"/>
+      <w:bookmarkStart w:id="7" w:name="_Toc228179423"/>
       <w:r>
         <w:rPr>
           <w:lang w:val="fr-FR"/>
         </w:rPr>
         <w:t>Durée cumulée de fonctionnement</w:t>
       </w:r>
-      <w:bookmarkEnd w:id="8"/>
+      <w:bookmarkEnd w:id="7"/>
     </w:p>
     <w:p>
       <w:pPr>
@@ -3949,7 +4272,6 @@
           <w:rFonts w:ascii="Cambria" w:hAnsi="Cambria"/>
           <w:lang w:val="fr-FR"/>
         </w:rPr>
-        <w:lastRenderedPageBreak/>
         <w:t>Certaines périodes d’arrêt peuvent être associées à des contraintes externes (par exemple bridage environnemental). Ces périodes sont prises en compte conformément aux règles définies pour l’analyse.</w:t>
       </w:r>
     </w:p>
@@ -3965,6 +4287,7 @@
           <w:rFonts w:ascii="Cambria" w:hAnsi="Cambria"/>
           <w:lang w:val="fr-FR"/>
         </w:rPr>
+        <w:lastRenderedPageBreak/>
         <w:t xml:space="preserve">Le tableau suivant montre que </w:t>
       </w:r>
       <w:r>
@@ -3997,22 +4320,6 @@
         </w:rPr>
         <w:t xml:space="preserve"> </w:t>
       </w:r>
-    </w:p>
-    <w:p>
-      <w:pPr>
-        <w:pStyle w:val="Titre2"/>
-        <w:rPr>
-          <w:lang w:val="fr-FR"/>
-        </w:rPr>
-      </w:pPr>
-      <w:bookmarkStart w:id="9" w:name="_Toc228179424"/>
-      <w:r>
-        <w:rPr>
-          <w:lang w:val="fr-FR"/>
-        </w:rPr>
-        <w:t>Fonctionnement dans la plage de vent</w:t>
-      </w:r>
-      <w:bookmarkEnd w:id="9"/>
     </w:p>
     <w:p>
       <w:r>
@@ -4128,7 +4435,23 @@
           <w:rFonts w:ascii="Cambria" w:hAnsi="Cambria"/>
           <w:lang w:val="fr-FR"/>
         </w:rPr>
-        <w:t>, la durée cumulée de fonctionnement observée étaninférieure au seuil requis (cas de non-validation).</w:t>
+        <w:t xml:space="preserve">, la durée cumulée de fonctionnement observée </w:t>
+      </w:r>
+      <w:proofErr w:type="spellStart"/>
+      <w:r>
+        <w:rPr>
+          <w:rFonts w:ascii="Cambria" w:hAnsi="Cambria"/>
+          <w:lang w:val="fr-FR"/>
+        </w:rPr>
+        <w:t>étaninférieure</w:t>
+      </w:r>
+      <w:proofErr w:type="spellEnd"/>
+      <w:r>
+        <w:rPr>
+          <w:rFonts w:ascii="Cambria" w:hAnsi="Cambria"/>
+          <w:lang w:val="fr-FR"/>
+        </w:rPr>
+        <w:t xml:space="preserve"> au seuil requis (cas de non-validation).</w:t>
       </w:r>
     </w:p>
     <w:p>
@@ -4146,14 +4469,14 @@
           <w:lang w:val="fr-FR"/>
         </w:rPr>
       </w:pPr>
-      <w:bookmarkStart w:id="10" w:name="_Toc228179425"/>
+      <w:bookmarkStart w:id="8" w:name="_Toc228179425"/>
       <w:r>
         <w:rPr>
           <w:lang w:val="fr-FR"/>
         </w:rPr>
         <w:t>Atteinte de la puissance nominale</w:t>
       </w:r>
-      <w:bookmarkEnd w:id="10"/>
+      <w:bookmarkEnd w:id="8"/>
     </w:p>
     <w:p>
       <w:pPr>
@@ -4192,14 +4515,14 @@
           <w:lang w:val="fr-FR"/>
         </w:rPr>
       </w:pPr>
-      <w:bookmarkStart w:id="11" w:name="_Toc228179426"/>
+      <w:bookmarkStart w:id="9" w:name="_Toc228179426"/>
       <w:r>
         <w:rPr>
           <w:lang w:val="fr-FR"/>
         </w:rPr>
         <w:t>Puissance maximale atteinte</w:t>
       </w:r>
-      <w:bookmarkEnd w:id="11"/>
+      <w:bookmarkEnd w:id="9"/>
     </w:p>
     <w:p>
       <w:r>
@@ -4344,12 +4667,37 @@
         </w:rPr>
         <w:t xml:space="preserve"> </w:t>
       </w:r>
+      <w:proofErr w:type="spellStart"/>
       <w:r>
         <w:rPr>
           <w:rFonts w:ascii="Cambria" w:hAnsi="Cambria"/>
           <w:lang w:val="fr-FR"/>
         </w:rPr>
-        <w:t>nominal_power_pct}} % de sa puissance nominale, sur la base des données SCADA enregistrées toutes les 10 minutes de la puissance nominale de {{nominal_power_h}} MW dans l'analyse.</w:t>
+        <w:t>nominal_power_pct</w:t>
+      </w:r>
+      <w:proofErr w:type="spellEnd"/>
+      <w:r>
+        <w:rPr>
+          <w:rFonts w:ascii="Cambria" w:hAnsi="Cambria"/>
+          <w:lang w:val="fr-FR"/>
+        </w:rPr>
+        <w:t>}} % de sa puissance nominale, sur la base des données SCADA enregistrées toutes les 10 minutes de la puissance nominale de {{</w:t>
+      </w:r>
+      <w:proofErr w:type="spellStart"/>
+      <w:r>
+        <w:rPr>
+          <w:rFonts w:ascii="Cambria" w:hAnsi="Cambria"/>
+          <w:lang w:val="fr-FR"/>
+        </w:rPr>
+        <w:t>nominal_power_h</w:t>
+      </w:r>
+      <w:proofErr w:type="spellEnd"/>
+      <w:r>
+        <w:rPr>
+          <w:rFonts w:ascii="Cambria" w:hAnsi="Cambria"/>
+          <w:lang w:val="fr-FR"/>
+        </w:rPr>
+        <w:t>}} MW dans l'analyse.</w:t>
       </w:r>
     </w:p>
     <w:p>
@@ -4359,14 +4707,14 @@
           <w:lang w:val="fr-FR"/>
         </w:rPr>
       </w:pPr>
-      <w:bookmarkStart w:id="12" w:name="_Toc228179427"/>
+      <w:bookmarkStart w:id="10" w:name="_Toc228179427"/>
       <w:r>
         <w:rPr>
           <w:lang w:val="fr-FR"/>
         </w:rPr>
         <w:t>Durée de fonctionnement proche de la puissance nominale</w:t>
       </w:r>
-      <w:bookmarkEnd w:id="12"/>
+      <w:bookmarkEnd w:id="10"/>
     </w:p>
     <w:p>
       <w:pPr>
@@ -4380,7 +4728,39 @@
           <w:rFonts w:ascii="Cambria" w:hAnsi="Cambria"/>
           <w:lang w:val="fr-FR"/>
         </w:rPr>
-        <w:t>Le tableau suivant présente les heures de fonctionnement au-dessus de ({{nominal_power_pct}} % de la puissance nominale) pendant le RunTest :</w:t>
+        <w:t>Le tableau suivant présente les heures de fonctionnement au-dessus de ({{</w:t>
+      </w:r>
+      <w:proofErr w:type="spellStart"/>
+      <w:r>
+        <w:rPr>
+          <w:rFonts w:ascii="Cambria" w:hAnsi="Cambria"/>
+          <w:lang w:val="fr-FR"/>
+        </w:rPr>
+        <w:t>nominal_power_pct</w:t>
+      </w:r>
+      <w:proofErr w:type="spellEnd"/>
+      <w:r>
+        <w:rPr>
+          <w:rFonts w:ascii="Cambria" w:hAnsi="Cambria"/>
+          <w:lang w:val="fr-FR"/>
+        </w:rPr>
+        <w:t xml:space="preserve">}} % de la puissance nominale) pendant le </w:t>
+      </w:r>
+      <w:proofErr w:type="spellStart"/>
+      <w:r>
+        <w:rPr>
+          <w:rFonts w:ascii="Cambria" w:hAnsi="Cambria"/>
+          <w:lang w:val="fr-FR"/>
+        </w:rPr>
+        <w:t>RunTest</w:t>
+      </w:r>
+      <w:proofErr w:type="spellEnd"/>
+      <w:r>
+        <w:rPr>
+          <w:rFonts w:ascii="Cambria" w:hAnsi="Cambria"/>
+          <w:lang w:val="fr-FR"/>
+        </w:rPr>
+        <w:t xml:space="preserve"> :</w:t>
       </w:r>
     </w:p>
     <w:p>
@@ -4419,7 +4799,6 @@
               <w:jc w:val="center"/>
             </w:pPr>
             <w:r>
-              <w:lastRenderedPageBreak/>
               <w:t>WTG</w:t>
             </w:r>
           </w:p>
@@ -4546,7 +4925,16 @@
           <w:b/>
           <w:lang w:val="fr-FR"/>
         </w:rPr>
-        <w:t>n’atteignent pas la puissance nominale</w:t>
+        <w:t xml:space="preserve">n’atteignent pas la </w:t>
+      </w:r>
+      <w:r>
+        <w:rPr>
+          <w:rFonts w:ascii="Cambria" w:hAnsi="Cambria"/>
+          <w:b/>
+          <w:lang w:val="fr-FR"/>
+        </w:rPr>
+        <w:lastRenderedPageBreak/>
+        <w:t>puissance nominale</w:t>
       </w:r>
       <w:r>
         <w:rPr>
@@ -4578,14 +4966,14 @@
           <w:lang w:val="fr-FR"/>
         </w:rPr>
       </w:pPr>
-      <w:bookmarkStart w:id="13" w:name="_Toc228179428"/>
+      <w:bookmarkStart w:id="11" w:name="_Toc228179428"/>
       <w:r>
         <w:rPr>
           <w:lang w:val="fr-FR"/>
         </w:rPr>
         <w:t>Fonctionnement en mode automatique</w:t>
       </w:r>
-      <w:bookmarkEnd w:id="13"/>
+      <w:bookmarkEnd w:id="11"/>
     </w:p>
     <w:p>
       <w:pPr>
@@ -4607,7 +4995,25 @@
           <w:b/>
           <w:lang w:val="fr-FR"/>
         </w:rPr>
-        <w:t xml:space="preserve">{{local_restarts_max}} défaillance(s) </w:t>
+        <w:t>{{</w:t>
+      </w:r>
+      <w:proofErr w:type="spellStart"/>
+      <w:r>
+        <w:rPr>
+          <w:rFonts w:ascii="Cambria" w:hAnsi="Cambria"/>
+          <w:b/>
+          <w:lang w:val="fr-FR"/>
+        </w:rPr>
+        <w:t>local_restarts_max</w:t>
+      </w:r>
+      <w:proofErr w:type="spellEnd"/>
+      <w:r>
+        <w:rPr>
+          <w:rFonts w:ascii="Cambria" w:hAnsi="Cambria"/>
+          <w:b/>
+          <w:lang w:val="fr-FR"/>
+        </w:rPr>
+        <w:t xml:space="preserve">}} défaillance(s) </w:t>
       </w:r>
       <w:r>
         <w:rPr>
@@ -4624,14 +5030,14 @@
           <w:lang w:val="fr-FR"/>
         </w:rPr>
       </w:pPr>
-      <w:bookmarkStart w:id="14" w:name="_Toc228179429"/>
+      <w:bookmarkStart w:id="12" w:name="_Toc228179429"/>
       <w:r>
         <w:rPr>
           <w:lang w:val="fr-FR"/>
         </w:rPr>
         <w:t>Fonctionnement en mode automatique</w:t>
       </w:r>
-      <w:bookmarkEnd w:id="14"/>
+      <w:bookmarkEnd w:id="12"/>
     </w:p>
     <w:p>
       <w:pPr>
@@ -4813,14 +5219,14 @@
           <w:lang w:val="fr-FR"/>
         </w:rPr>
       </w:pPr>
-      <w:bookmarkStart w:id="15" w:name="_Toc228179430"/>
+      <w:bookmarkStart w:id="13" w:name="_Toc228179430"/>
       <w:r>
         <w:rPr>
           <w:lang w:val="fr-FR"/>
         </w:rPr>
         <w:t>Disponibilité des turbines</w:t>
       </w:r>
-      <w:bookmarkEnd w:id="15"/>
+      <w:bookmarkEnd w:id="13"/>
     </w:p>
     <w:p>
       <w:pPr>
@@ -4982,7 +5388,6 @@
           <w:rFonts w:ascii="Cambria" w:hAnsi="Cambria"/>
           <w:lang w:val="fr-FR"/>
         </w:rPr>
-        <w:lastRenderedPageBreak/>
         <w:t>La proportion de temps pendant laquelle les turbines étaient en fonctionnement ;</w:t>
       </w:r>
     </w:p>
@@ -5038,6 +5443,7 @@
           <w:rFonts w:ascii="Cambria" w:hAnsi="Cambria"/>
           <w:lang w:val="fr-FR"/>
         </w:rPr>
+        <w:lastRenderedPageBreak/>
         <w:t>Le tableau suivant présente la disponibilité calculée pour chaque turbine pendant sa période de Run Test.</w:t>
       </w:r>
     </w:p>
@@ -5056,14 +5462,14 @@
           <w:lang w:val="fr-FR"/>
         </w:rPr>
       </w:pPr>
-      <w:bookmarkStart w:id="16" w:name="_Toc228179431"/>
+      <w:bookmarkStart w:id="14" w:name="_Toc228179431"/>
       <w:r>
         <w:rPr>
           <w:lang w:val="fr-FR"/>
         </w:rPr>
         <w:t>Disponibilité des turbines</w:t>
       </w:r>
-      <w:bookmarkEnd w:id="16"/>
+      <w:bookmarkEnd w:id="14"/>
     </w:p>
     <w:p>
       <w:pPr>
@@ -5213,14 +5619,14 @@
           <w:lang w:val="fr-FR"/>
         </w:rPr>
       </w:pPr>
-      <w:bookmarkStart w:id="17" w:name="_Toc228179432"/>
+      <w:bookmarkStart w:id="15" w:name="_Toc228179432"/>
       <w:r>
         <w:rPr>
           <w:lang w:val="fr-FR"/>
         </w:rPr>
         <w:t>Conclusion</w:t>
       </w:r>
-      <w:bookmarkEnd w:id="17"/>
+      <w:bookmarkEnd w:id="15"/>
     </w:p>
     <w:p>
       <w:pPr>
@@ -5342,11 +5748,13 @@
       <w:pPr>
         <w:pStyle w:val="Titre1"/>
       </w:pPr>
-      <w:bookmarkStart w:id="18" w:name="_Toc228179433"/>
+      <w:bookmarkStart w:id="16" w:name="_Toc228179433"/>
+      <w:proofErr w:type="spellStart"/>
       <w:r>
         <w:t>Annexe</w:t>
       </w:r>
-      <w:bookmarkEnd w:id="18"/>
+      <w:bookmarkEnd w:id="16"/>
+      <w:proofErr w:type="spellEnd"/>
     </w:p>
     <w:p/>
     <w:sectPr>

</xml_diff>

<commit_message>
[CHANGE] improve the word présented
</commit_message>
<xml_diff>
--- a/assets/templates/template_runtest.docx
+++ b/assets/templates/template_runtest.docx
@@ -396,6 +396,7 @@
                                 </w:rPr>
                                 <w:t xml:space="preserve">Expertise </w:t>
                               </w:r>
+                              <w:proofErr w:type="spellStart"/>
                               <w:r>
                                 <w:rPr>
                                   <w:rFonts w:asciiTheme="majorHAnsi" w:hAnsiTheme="majorHAnsi" w:cstheme="majorHAnsi"/>
@@ -407,8 +408,65 @@
                                   <w:sz w:val="32"/>
                                   <w:szCs w:val="32"/>
                                 </w:rPr>
-                                <w:t>en énergie renouvelable</w:t>
+                                <w:t>en</w:t>
                               </w:r>
+                              <w:proofErr w:type="spellEnd"/>
+                              <w:r>
+                                <w:rPr>
+                                  <w:rFonts w:asciiTheme="majorHAnsi" w:hAnsiTheme="majorHAnsi" w:cstheme="majorHAnsi"/>
+                                  <w:b/>
+                                  <w:bCs/>
+                                  <w:color w:val="FFFFFF" w:themeColor="background1"/>
+                                  <w:spacing w:val="120"/>
+                                  <w:kern w:val="24"/>
+                                  <w:sz w:val="32"/>
+                                  <w:szCs w:val="32"/>
+                                </w:rPr>
+                                <w:t xml:space="preserve"> </w:t>
+                              </w:r>
+                              <w:proofErr w:type="spellStart"/>
+                              <w:r>
+                                <w:rPr>
+                                  <w:rFonts w:asciiTheme="majorHAnsi" w:hAnsiTheme="majorHAnsi" w:cstheme="majorHAnsi"/>
+                                  <w:b/>
+                                  <w:bCs/>
+                                  <w:color w:val="FFFFFF" w:themeColor="background1"/>
+                                  <w:spacing w:val="120"/>
+                                  <w:kern w:val="24"/>
+                                  <w:sz w:val="32"/>
+                                  <w:szCs w:val="32"/>
+                                </w:rPr>
+                                <w:t>énergie</w:t>
+                              </w:r>
+                              <w:proofErr w:type="spellEnd"/>
+                              <w:r>
+                                <w:rPr>
+                                  <w:rFonts w:asciiTheme="majorHAnsi" w:hAnsiTheme="majorHAnsi" w:cstheme="majorHAnsi"/>
+                                  <w:b/>
+                                  <w:bCs/>
+                                  <w:color w:val="FFFFFF" w:themeColor="background1"/>
+                                  <w:spacing w:val="120"/>
+                                  <w:kern w:val="24"/>
+                                  <w:sz w:val="32"/>
+                                  <w:szCs w:val="32"/>
+                                </w:rPr>
+                                <w:t xml:space="preserve"> </w:t>
+                              </w:r>
+                              <w:proofErr w:type="spellStart"/>
+                              <w:r>
+                                <w:rPr>
+                                  <w:rFonts w:asciiTheme="majorHAnsi" w:hAnsiTheme="majorHAnsi" w:cstheme="majorHAnsi"/>
+                                  <w:b/>
+                                  <w:bCs/>
+                                  <w:color w:val="FFFFFF" w:themeColor="background1"/>
+                                  <w:spacing w:val="120"/>
+                                  <w:kern w:val="24"/>
+                                  <w:sz w:val="32"/>
+                                  <w:szCs w:val="32"/>
+                                </w:rPr>
+                                <w:t>renouvelable</w:t>
+                              </w:r>
+                              <w:proofErr w:type="spellEnd"/>
                             </w:p>
                             <w:p>
                               <w:pPr>
@@ -496,6 +554,7 @@
                           </w:rPr>
                           <w:t xml:space="preserve">Expertise </w:t>
                         </w:r>
+                        <w:proofErr w:type="spellStart"/>
                         <w:r>
                           <w:rPr>
                             <w:rFonts w:asciiTheme="majorHAnsi" w:hAnsiTheme="majorHAnsi" w:cstheme="majorHAnsi"/>
@@ -507,8 +566,65 @@
                             <w:sz w:val="32"/>
                             <w:szCs w:val="32"/>
                           </w:rPr>
-                          <w:t>en énergie renouvelable</w:t>
+                          <w:t>en</w:t>
                         </w:r>
+                        <w:proofErr w:type="spellEnd"/>
+                        <w:r>
+                          <w:rPr>
+                            <w:rFonts w:asciiTheme="majorHAnsi" w:hAnsiTheme="majorHAnsi" w:cstheme="majorHAnsi"/>
+                            <w:b/>
+                            <w:bCs/>
+                            <w:color w:val="FFFFFF" w:themeColor="background1"/>
+                            <w:spacing w:val="120"/>
+                            <w:kern w:val="24"/>
+                            <w:sz w:val="32"/>
+                            <w:szCs w:val="32"/>
+                          </w:rPr>
+                          <w:t xml:space="preserve"> </w:t>
+                        </w:r>
+                        <w:proofErr w:type="spellStart"/>
+                        <w:r>
+                          <w:rPr>
+                            <w:rFonts w:asciiTheme="majorHAnsi" w:hAnsiTheme="majorHAnsi" w:cstheme="majorHAnsi"/>
+                            <w:b/>
+                            <w:bCs/>
+                            <w:color w:val="FFFFFF" w:themeColor="background1"/>
+                            <w:spacing w:val="120"/>
+                            <w:kern w:val="24"/>
+                            <w:sz w:val="32"/>
+                            <w:szCs w:val="32"/>
+                          </w:rPr>
+                          <w:t>énergie</w:t>
+                        </w:r>
+                        <w:proofErr w:type="spellEnd"/>
+                        <w:r>
+                          <w:rPr>
+                            <w:rFonts w:asciiTheme="majorHAnsi" w:hAnsiTheme="majorHAnsi" w:cstheme="majorHAnsi"/>
+                            <w:b/>
+                            <w:bCs/>
+                            <w:color w:val="FFFFFF" w:themeColor="background1"/>
+                            <w:spacing w:val="120"/>
+                            <w:kern w:val="24"/>
+                            <w:sz w:val="32"/>
+                            <w:szCs w:val="32"/>
+                          </w:rPr>
+                          <w:t xml:space="preserve"> </w:t>
+                        </w:r>
+                        <w:proofErr w:type="spellStart"/>
+                        <w:r>
+                          <w:rPr>
+                            <w:rFonts w:asciiTheme="majorHAnsi" w:hAnsiTheme="majorHAnsi" w:cstheme="majorHAnsi"/>
+                            <w:b/>
+                            <w:bCs/>
+                            <w:color w:val="FFFFFF" w:themeColor="background1"/>
+                            <w:spacing w:val="120"/>
+                            <w:kern w:val="24"/>
+                            <w:sz w:val="32"/>
+                            <w:szCs w:val="32"/>
+                          </w:rPr>
+                          <w:t>renouvelable</w:t>
+                        </w:r>
+                        <w:proofErr w:type="spellEnd"/>
                       </w:p>
                       <w:p>
                         <w:pPr>
@@ -3562,31 +3678,51 @@
         <w:t>cut_in_v_min</w:t>
       </w:r>
       <w:proofErr w:type="spellEnd"/>
+      <w:proofErr w:type="gramStart"/>
       <w:r>
         <w:rPr>
           <w:rFonts w:ascii="Cambria" w:hAnsi="Cambria"/>
           <w:b/>
           <w:lang w:val="fr-FR"/>
         </w:rPr>
-        <w:t>}}- {{</w:t>
-      </w:r>
-      <w:proofErr w:type="spellStart"/>
+        <w:t>}}-</w:t>
+      </w:r>
+      <w:proofErr w:type="gramEnd"/>
       <w:r>
         <w:rPr>
           <w:rFonts w:ascii="Cambria" w:hAnsi="Cambria"/>
           <w:b/>
           <w:lang w:val="fr-FR"/>
         </w:rPr>
-        <w:t>cut_in_v_max</w:t>
-      </w:r>
-      <w:proofErr w:type="spellEnd"/>
+        <w:t xml:space="preserve"> {{</w:t>
+      </w:r>
+      <w:proofErr w:type="spellStart"/>
       <w:r>
         <w:rPr>
           <w:rFonts w:ascii="Cambria" w:hAnsi="Cambria"/>
           <w:b/>
           <w:lang w:val="fr-FR"/>
         </w:rPr>
-        <w:t>}}- m/s) :</w:t>
+        <w:t>cut_in_v_max</w:t>
+      </w:r>
+      <w:proofErr w:type="spellEnd"/>
+      <w:proofErr w:type="gramStart"/>
+      <w:r>
+        <w:rPr>
+          <w:rFonts w:ascii="Cambria" w:hAnsi="Cambria"/>
+          <w:b/>
+          <w:lang w:val="fr-FR"/>
+        </w:rPr>
+        <w:t>}}-</w:t>
+      </w:r>
+      <w:proofErr w:type="gramEnd"/>
+      <w:r>
+        <w:rPr>
+          <w:rFonts w:ascii="Cambria" w:hAnsi="Cambria"/>
+          <w:b/>
+          <w:lang w:val="fr-FR"/>
+        </w:rPr>
+        <w:t xml:space="preserve"> m/s) :</w:t>
       </w:r>
       <w:r>
         <w:rPr>
@@ -3700,23 +3836,49 @@
           <w:b/>
           <w:lang w:val="fr-FR"/>
         </w:rPr>
-        <w:t>nominal_power_pct</w:t>
-      </w:r>
-      <w:proofErr w:type="spellEnd"/>
+        <w:t>nominal_power_</w:t>
+      </w:r>
+      <w:proofErr w:type="gramStart"/>
       <w:r>
         <w:rPr>
           <w:rFonts w:ascii="Cambria" w:hAnsi="Cambria"/>
           <w:b/>
           <w:lang w:val="fr-FR"/>
         </w:rPr>
-        <w:t xml:space="preserve"> }} % ou plus de la puissance nominale :</w:t>
-      </w:r>
+        <w:t>pct</w:t>
+      </w:r>
+      <w:proofErr w:type="spellEnd"/>
       <w:r>
         <w:rPr>
           <w:rFonts w:ascii="Cambria" w:hAnsi="Cambria"/>
-          <w:lang w:val="fr-FR"/>
-        </w:rPr>
-        <w:t xml:space="preserve"> L'éolienne doit fonctionner pendant au moins {{ </w:t>
+          <w:b/>
+          <w:lang w:val="fr-FR"/>
+        </w:rPr>
+        <w:t xml:space="preserve"> }</w:t>
+      </w:r>
+      <w:proofErr w:type="gramEnd"/>
+      <w:r>
+        <w:rPr>
+          <w:rFonts w:ascii="Cambria" w:hAnsi="Cambria"/>
+          <w:b/>
+          <w:lang w:val="fr-FR"/>
+        </w:rPr>
+        <w:t>} % ou plus de la puissance nominale :</w:t>
+      </w:r>
+      <w:r>
+        <w:rPr>
+          <w:rFonts w:ascii="Cambria" w:hAnsi="Cambria"/>
+          <w:lang w:val="fr-FR"/>
+        </w:rPr>
+        <w:t xml:space="preserve"> L'éolienne doit fonctionner pendant au moins </w:t>
+      </w:r>
+      <w:proofErr w:type="gramStart"/>
+      <w:r>
+        <w:rPr>
+          <w:rFonts w:ascii="Cambria" w:hAnsi="Cambria"/>
+          <w:lang w:val="fr-FR"/>
+        </w:rPr>
+        <w:t xml:space="preserve">{{ </w:t>
       </w:r>
       <w:proofErr w:type="spellStart"/>
       <w:r>
@@ -3724,7 +3886,15 @@
           <w:rFonts w:ascii="Cambria" w:hAnsi="Cambria"/>
           <w:lang w:val="fr-FR"/>
         </w:rPr>
-        <w:t>nominal_power_h</w:t>
+        <w:t>nominal</w:t>
+      </w:r>
+      <w:proofErr w:type="gramEnd"/>
+      <w:r>
+        <w:rPr>
+          <w:rFonts w:ascii="Cambria" w:hAnsi="Cambria"/>
+          <w:lang w:val="fr-FR"/>
+        </w:rPr>
+        <w:t>_power_h</w:t>
       </w:r>
       <w:proofErr w:type="spellEnd"/>
       <w:r>
@@ -3743,12 +3913,21 @@
         <w:t>nominal_power_pct</w:t>
       </w:r>
       <w:proofErr w:type="spellEnd"/>
+      <w:proofErr w:type="gramStart"/>
       <w:r>
         <w:rPr>
           <w:rFonts w:ascii="Cambria" w:hAnsi="Cambria"/>
           <w:lang w:val="fr-FR"/>
         </w:rPr>
-        <w:t xml:space="preserve">}}% ou plus de sa puissance nominale. </w:t>
+        <w:t>}}%</w:t>
+      </w:r>
+      <w:proofErr w:type="gramEnd"/>
+      <w:r>
+        <w:rPr>
+          <w:rFonts w:ascii="Cambria" w:hAnsi="Cambria"/>
+          <w:lang w:val="fr-FR"/>
+        </w:rPr>
+        <w:t xml:space="preserve"> ou plus de sa puissance nominale. </w:t>
       </w:r>
     </w:p>
     <w:p>
@@ -3765,25 +3944,61 @@
           <w:lang w:val="fr-FR"/>
         </w:rPr>
         <w:lastRenderedPageBreak/>
-        <w:t>Critère 4 - Confirmations locales / redémarrages (&lt;={{</w:t>
-      </w:r>
-      <w:proofErr w:type="spellStart"/>
+        <w:t>Critère 4 - Confirmations locales / redémarrages (&lt;</w:t>
+      </w:r>
+      <w:proofErr w:type="gramStart"/>
       <w:r>
         <w:rPr>
           <w:rFonts w:ascii="Cambria" w:hAnsi="Cambria"/>
           <w:b/>
           <w:lang w:val="fr-FR"/>
         </w:rPr>
-        <w:t>local_restarts_max</w:t>
-      </w:r>
-      <w:proofErr w:type="spellEnd"/>
+        <w:t>={</w:t>
+      </w:r>
+      <w:proofErr w:type="gramEnd"/>
       <w:r>
         <w:rPr>
           <w:rFonts w:ascii="Cambria" w:hAnsi="Cambria"/>
           <w:b/>
           <w:lang w:val="fr-FR"/>
         </w:rPr>
-        <w:t xml:space="preserve"> }}) :</w:t>
+        <w:t>{</w:t>
+      </w:r>
+      <w:proofErr w:type="spellStart"/>
+      <w:r>
+        <w:rPr>
+          <w:rFonts w:ascii="Cambria" w:hAnsi="Cambria"/>
+          <w:b/>
+          <w:lang w:val="fr-FR"/>
+        </w:rPr>
+        <w:t>local_restarts_</w:t>
+      </w:r>
+      <w:proofErr w:type="gramStart"/>
+      <w:r>
+        <w:rPr>
+          <w:rFonts w:ascii="Cambria" w:hAnsi="Cambria"/>
+          <w:b/>
+          <w:lang w:val="fr-FR"/>
+        </w:rPr>
+        <w:t>max</w:t>
+      </w:r>
+      <w:proofErr w:type="spellEnd"/>
+      <w:r>
+        <w:rPr>
+          <w:rFonts w:ascii="Cambria" w:hAnsi="Cambria"/>
+          <w:b/>
+          <w:lang w:val="fr-FR"/>
+        </w:rPr>
+        <w:t xml:space="preserve"> }</w:t>
+      </w:r>
+      <w:proofErr w:type="gramEnd"/>
+      <w:r>
+        <w:rPr>
+          <w:rFonts w:ascii="Cambria" w:hAnsi="Cambria"/>
+          <w:b/>
+          <w:lang w:val="fr-FR"/>
+        </w:rPr>
+        <w:t>}) :</w:t>
       </w:r>
       <w:r>
         <w:rPr>
@@ -3806,25 +4021,61 @@
           <w:b/>
           <w:lang w:val="fr-FR"/>
         </w:rPr>
-        <w:t>Critère 5 - Disponibilité (&gt;={{</w:t>
-      </w:r>
-      <w:proofErr w:type="spellStart"/>
+        <w:t>Critère 5 - Disponibilité (&gt;</w:t>
+      </w:r>
+      <w:proofErr w:type="gramStart"/>
       <w:r>
         <w:rPr>
           <w:rFonts w:ascii="Cambria" w:hAnsi="Cambria"/>
           <w:b/>
           <w:lang w:val="fr-FR"/>
         </w:rPr>
-        <w:t>availability_min_pct</w:t>
-      </w:r>
-      <w:proofErr w:type="spellEnd"/>
+        <w:t>={</w:t>
+      </w:r>
+      <w:proofErr w:type="gramEnd"/>
       <w:r>
         <w:rPr>
           <w:rFonts w:ascii="Cambria" w:hAnsi="Cambria"/>
           <w:b/>
           <w:lang w:val="fr-FR"/>
         </w:rPr>
-        <w:t xml:space="preserve"> }} %) :</w:t>
+        <w:t>{</w:t>
+      </w:r>
+      <w:proofErr w:type="spellStart"/>
+      <w:r>
+        <w:rPr>
+          <w:rFonts w:ascii="Cambria" w:hAnsi="Cambria"/>
+          <w:b/>
+          <w:lang w:val="fr-FR"/>
+        </w:rPr>
+        <w:t>availability_min_</w:t>
+      </w:r>
+      <w:proofErr w:type="gramStart"/>
+      <w:r>
+        <w:rPr>
+          <w:rFonts w:ascii="Cambria" w:hAnsi="Cambria"/>
+          <w:b/>
+          <w:lang w:val="fr-FR"/>
+        </w:rPr>
+        <w:t>pct</w:t>
+      </w:r>
+      <w:proofErr w:type="spellEnd"/>
+      <w:r>
+        <w:rPr>
+          <w:rFonts w:ascii="Cambria" w:hAnsi="Cambria"/>
+          <w:b/>
+          <w:lang w:val="fr-FR"/>
+        </w:rPr>
+        <w:t xml:space="preserve"> }</w:t>
+      </w:r>
+      <w:proofErr w:type="gramEnd"/>
+      <w:r>
+        <w:rPr>
+          <w:rFonts w:ascii="Cambria" w:hAnsi="Cambria"/>
+          <w:b/>
+          <w:lang w:val="fr-FR"/>
+        </w:rPr>
+        <w:t>} %) :</w:t>
       </w:r>
       <w:r>
         <w:rPr>
@@ -3886,7 +4137,23 @@
           <w:color w:val="FFFFFF"/>
           <w:sz w:val="2"/>
         </w:rPr>
-        <w:t>[TABLE:SUMMARY_TABLE]</w:t>
+        <w:t>[</w:t>
+      </w:r>
+      <w:proofErr w:type="gramStart"/>
+      <w:r>
+        <w:rPr>
+          <w:color w:val="FFFFFF"/>
+          <w:sz w:val="2"/>
+        </w:rPr>
+        <w:t>TABLE:SUMMARY</w:t>
+      </w:r>
+      <w:proofErr w:type="gramEnd"/>
+      <w:r>
+        <w:rPr>
+          <w:color w:val="FFFFFF"/>
+          <w:sz w:val="2"/>
+        </w:rPr>
+        <w:t>_TABLE]</w:t>
       </w:r>
     </w:p>
     <w:tbl>
@@ -3972,7 +4239,15 @@
             </w:r>
             <w:r>
               <w:br/>
-              <w:t>(≥3h @97%)</w:t>
+              <w:t>(≥3</w:t>
+            </w:r>
+            <w:proofErr w:type="gramStart"/>
+            <w:r>
+              <w:t>h @</w:t>
+            </w:r>
+            <w:proofErr w:type="gramEnd"/>
+            <w:r>
+              <w:t>97%)</w:t>
             </w:r>
           </w:p>
         </w:tc>
@@ -4116,7 +4391,23 @@
           <w:color w:val="FFFFFF"/>
           <w:sz w:val="2"/>
         </w:rPr>
-        <w:t>[TABLE:CONSECUTIVE_HOURS_TABLE]</w:t>
+        <w:t>[</w:t>
+      </w:r>
+      <w:proofErr w:type="gramStart"/>
+      <w:r>
+        <w:rPr>
+          <w:color w:val="FFFFFF"/>
+          <w:sz w:val="2"/>
+        </w:rPr>
+        <w:t>TABLE:CONSECUTIVE</w:t>
+      </w:r>
+      <w:proofErr w:type="gramEnd"/>
+      <w:r>
+        <w:rPr>
+          <w:color w:val="FFFFFF"/>
+          <w:sz w:val="2"/>
+        </w:rPr>
+        <w:t>_HOURS_TABLE]</w:t>
       </w:r>
     </w:p>
     <w:tbl>
@@ -4327,7 +4618,23 @@
           <w:color w:val="FFFFFF"/>
           <w:sz w:val="2"/>
         </w:rPr>
-        <w:t>[TABLE:CUT_IN_CUT_OUT_TABLE]</w:t>
+        <w:t>[</w:t>
+      </w:r>
+      <w:proofErr w:type="gramStart"/>
+      <w:r>
+        <w:rPr>
+          <w:color w:val="FFFFFF"/>
+          <w:sz w:val="2"/>
+        </w:rPr>
+        <w:t>TABLE:CUT</w:t>
+      </w:r>
+      <w:proofErr w:type="gramEnd"/>
+      <w:r>
+        <w:rPr>
+          <w:color w:val="FFFFFF"/>
+          <w:sz w:val="2"/>
+        </w:rPr>
+        <w:t>_IN_CUT_OUT_TABLE]</w:t>
       </w:r>
     </w:p>
     <w:tbl>
@@ -4337,9 +4644,13 @@
         <w:tblLook w:val="04A0" w:firstRow="1" w:lastRow="0" w:firstColumn="1" w:lastColumn="0" w:noHBand="0" w:noVBand="1"/>
       </w:tblPr>
       <w:tblGrid>
-        <w:gridCol w:w="2880"/>
-        <w:gridCol w:w="2880"/>
-        <w:gridCol w:w="2880"/>
+        <w:gridCol w:w="1143"/>
+        <w:gridCol w:w="1162"/>
+        <w:gridCol w:w="1427"/>
+        <w:gridCol w:w="1278"/>
+        <w:gridCol w:w="1255"/>
+        <w:gridCol w:w="1169"/>
+        <w:gridCol w:w="1422"/>
       </w:tblGrid>
       <w:tr>
         <w:trPr>
@@ -4348,7 +4659,7 @@
         <w:tc>
           <w:tcPr>
             <w:cnfStyle w:val="001000000000" w:firstRow="0" w:lastRow="0" w:firstColumn="1" w:lastColumn="0" w:oddVBand="0" w:evenVBand="0" w:oddHBand="0" w:evenHBand="0" w:firstRowFirstColumn="0" w:firstRowLastColumn="0" w:lastRowFirstColumn="0" w:lastRowLastColumn="0"/>
-            <w:tcW w:w="2880" w:type="dxa"/>
+            <w:tcW w:w="1143" w:type="dxa"/>
           </w:tcPr>
           <w:p>
             <w:pPr>
@@ -4361,7 +4672,7 @@
         </w:tc>
         <w:tc>
           <w:tcPr>
-            <w:tcW w:w="2880" w:type="dxa"/>
+            <w:tcW w:w="1162" w:type="dxa"/>
           </w:tcPr>
           <w:p>
             <w:pPr>
@@ -4369,13 +4680,69 @@
               <w:cnfStyle w:val="100000000000" w:firstRow="1" w:lastRow="0" w:firstColumn="0" w:lastColumn="0" w:oddVBand="0" w:evenVBand="0" w:oddHBand="0" w:evenHBand="0" w:firstRowFirstColumn="0" w:firstRowLastColumn="0" w:lastRowFirstColumn="0" w:lastRowLastColumn="0"/>
             </w:pPr>
             <w:r>
-              <w:t>Data hours [h]</w:t>
+              <w:t>Status</w:t>
             </w:r>
           </w:p>
         </w:tc>
         <w:tc>
           <w:tcPr>
-            <w:tcW w:w="2880" w:type="dxa"/>
+            <w:tcW w:w="1427" w:type="dxa"/>
+          </w:tcPr>
+          <w:p>
+            <w:pPr>
+              <w:jc w:val="center"/>
+              <w:cnfStyle w:val="100000000000" w:firstRow="1" w:lastRow="0" w:firstColumn="0" w:lastColumn="0" w:oddVBand="0" w:evenVBand="0" w:oddHBand="0" w:evenHBand="0" w:firstRowFirstColumn="0" w:firstRowLastColumn="0" w:lastRowFirstColumn="0" w:lastRowLastColumn="0"/>
+            </w:pPr>
+            <w:r>
+              <w:t>Duration hours [h]</w:t>
+            </w:r>
+          </w:p>
+        </w:tc>
+        <w:tc>
+          <w:tcPr>
+            <w:tcW w:w="1278" w:type="dxa"/>
+          </w:tcPr>
+          <w:p>
+            <w:pPr>
+              <w:jc w:val="center"/>
+              <w:cnfStyle w:val="100000000000" w:firstRow="1" w:lastRow="0" w:firstColumn="0" w:lastColumn="0" w:oddVBand="0" w:evenVBand="0" w:oddHBand="0" w:evenHBand="0" w:firstRowFirstColumn="0" w:firstRowLastColumn="0" w:lastRowFirstColumn="0" w:lastRowLastColumn="0"/>
+            </w:pPr>
+            <w:r>
+              <w:t>Start running</w:t>
+            </w:r>
+          </w:p>
+        </w:tc>
+        <w:tc>
+          <w:tcPr>
+            <w:tcW w:w="1255" w:type="dxa"/>
+          </w:tcPr>
+          <w:p>
+            <w:pPr>
+              <w:jc w:val="center"/>
+              <w:cnfStyle w:val="100000000000" w:firstRow="1" w:lastRow="0" w:firstColumn="0" w:lastColumn="0" w:oddVBand="0" w:evenVBand="0" w:oddHBand="0" w:evenHBand="0" w:firstRowFirstColumn="0" w:firstRowLastColumn="0" w:lastRowFirstColumn="0" w:lastRowLastColumn="0"/>
+            </w:pPr>
+            <w:r>
+              <w:t>Stop running</w:t>
+            </w:r>
+          </w:p>
+        </w:tc>
+        <w:tc>
+          <w:tcPr>
+            <w:tcW w:w="1169" w:type="dxa"/>
+          </w:tcPr>
+          <w:p>
+            <w:pPr>
+              <w:jc w:val="center"/>
+              <w:cnfStyle w:val="100000000000" w:firstRow="1" w:lastRow="0" w:firstColumn="0" w:lastColumn="0" w:oddVBand="0" w:evenVBand="0" w:oddHBand="0" w:evenHBand="0" w:firstRowFirstColumn="0" w:firstRowLastColumn="0" w:lastRowFirstColumn="0" w:lastRowLastColumn="0"/>
+            </w:pPr>
+            <w:r>
+              <w:t>Alarm Codes</w:t>
+            </w:r>
+          </w:p>
+        </w:tc>
+        <w:tc>
+          <w:tcPr>
+            <w:tcW w:w="1422" w:type="dxa"/>
           </w:tcPr>
           <w:p>
             <w:pPr>
@@ -4530,7 +4897,23 @@
           <w:color w:val="FFFFFF"/>
           <w:sz w:val="2"/>
         </w:rPr>
-        <w:t>[TABLE:NOMINAL_POWER_VALUES_TABLE]</w:t>
+        <w:t>[</w:t>
+      </w:r>
+      <w:proofErr w:type="gramStart"/>
+      <w:r>
+        <w:rPr>
+          <w:color w:val="FFFFFF"/>
+          <w:sz w:val="2"/>
+        </w:rPr>
+        <w:t>TABLE:NOMINAL</w:t>
+      </w:r>
+      <w:proofErr w:type="gramEnd"/>
+      <w:r>
+        <w:rPr>
+          <w:color w:val="FFFFFF"/>
+          <w:sz w:val="2"/>
+        </w:rPr>
+        <w:t>_POWER_VALUES_TABLE]</w:t>
       </w:r>
     </w:p>
     <w:tbl>
@@ -4657,7 +5040,15 @@
           <w:rFonts w:ascii="Cambria" w:hAnsi="Cambria"/>
           <w:lang w:val="fr-FR"/>
         </w:rPr>
-        <w:t>L'éolienne doit fonctionner pendant au moins 3 heures à une puissance égale ou supérieure à {{</w:t>
+        <w:t xml:space="preserve">L'éolienne doit fonctionner pendant au moins 3 heures à une puissance égale ou supérieure à </w:t>
+      </w:r>
+      <w:proofErr w:type="gramStart"/>
+      <w:r>
+        <w:rPr>
+          <w:rFonts w:ascii="Cambria" w:hAnsi="Cambria"/>
+          <w:lang w:val="fr-FR"/>
+        </w:rPr>
+        <w:t>{{</w:t>
       </w:r>
       <w:r>
         <w:rPr>
@@ -4673,7 +5064,15 @@
           <w:rFonts w:ascii="Cambria" w:hAnsi="Cambria"/>
           <w:lang w:val="fr-FR"/>
         </w:rPr>
-        <w:t>nominal_power_pct</w:t>
+        <w:t>nominal</w:t>
+      </w:r>
+      <w:proofErr w:type="gramEnd"/>
+      <w:r>
+        <w:rPr>
+          <w:rFonts w:ascii="Cambria" w:hAnsi="Cambria"/>
+          <w:lang w:val="fr-FR"/>
+        </w:rPr>
+        <w:t>_power_pct</w:t>
       </w:r>
       <w:proofErr w:type="spellEnd"/>
       <w:r>
@@ -4769,7 +5168,23 @@
           <w:color w:val="FFFFFF"/>
           <w:sz w:val="2"/>
         </w:rPr>
-        <w:t>[TABLE:NOMINAL_POWER_DURATION_TABLE]</w:t>
+        <w:t>[</w:t>
+      </w:r>
+      <w:proofErr w:type="gramStart"/>
+      <w:r>
+        <w:rPr>
+          <w:color w:val="FFFFFF"/>
+          <w:sz w:val="2"/>
+        </w:rPr>
+        <w:t>TABLE:NOMINAL</w:t>
+      </w:r>
+      <w:proofErr w:type="gramEnd"/>
+      <w:r>
+        <w:rPr>
+          <w:color w:val="FFFFFF"/>
+          <w:sz w:val="2"/>
+        </w:rPr>
+        <w:t>_POWER_DURATION_TABLE]</w:t>
       </w:r>
     </w:p>
     <w:tbl>
@@ -4887,6 +5302,7 @@
           <w:rFonts w:ascii="Cambria" w:hAnsi="Cambria"/>
           <w:lang w:val="fr-FR"/>
         </w:rPr>
+        <w:lastRenderedPageBreak/>
         <w:t xml:space="preserve">Les turbines </w:t>
       </w:r>
       <w:r>
@@ -4925,16 +5341,7 @@
           <w:b/>
           <w:lang w:val="fr-FR"/>
         </w:rPr>
-        <w:t xml:space="preserve">n’atteignent pas la </w:t>
-      </w:r>
-      <w:r>
-        <w:rPr>
-          <w:rFonts w:ascii="Cambria" w:hAnsi="Cambria"/>
-          <w:b/>
-          <w:lang w:val="fr-FR"/>
-        </w:rPr>
-        <w:lastRenderedPageBreak/>
-        <w:t>puissance nominale</w:t>
+        <w:t>n’atteignent pas la puissance nominale</w:t>
       </w:r>
       <w:r>
         <w:rPr>
@@ -5051,7 +5458,25 @@
           <w:sz w:val="2"/>
           <w:lang w:val="fr-FR"/>
         </w:rPr>
-        <w:t>[TABLE:AUTONOMOUS_OPERATION_TABLE]</w:t>
+        <w:t>[</w:t>
+      </w:r>
+      <w:proofErr w:type="gramStart"/>
+      <w:r>
+        <w:rPr>
+          <w:color w:val="FFFFFF"/>
+          <w:sz w:val="2"/>
+          <w:lang w:val="fr-FR"/>
+        </w:rPr>
+        <w:t>TABLE:AUTONOMOUS</w:t>
+      </w:r>
+      <w:proofErr w:type="gramEnd"/>
+      <w:r>
+        <w:rPr>
+          <w:color w:val="FFFFFF"/>
+          <w:sz w:val="2"/>
+          <w:lang w:val="fr-FR"/>
+        </w:rPr>
+        <w:t>_OPERATION_TABLE]</w:t>
       </w:r>
     </w:p>
     <w:tbl>
@@ -5483,7 +5908,25 @@
           <w:sz w:val="2"/>
           <w:lang w:val="fr-FR"/>
         </w:rPr>
-        <w:t>[TABLE:AVAILABILITY_TABLE]</w:t>
+        <w:t>[</w:t>
+      </w:r>
+      <w:proofErr w:type="gramStart"/>
+      <w:r>
+        <w:rPr>
+          <w:color w:val="FFFFFF"/>
+          <w:sz w:val="2"/>
+          <w:lang w:val="fr-FR"/>
+        </w:rPr>
+        <w:t>TABLE:AVAILABILITY</w:t>
+      </w:r>
+      <w:proofErr w:type="gramEnd"/>
+      <w:r>
+        <w:rPr>
+          <w:color w:val="FFFFFF"/>
+          <w:sz w:val="2"/>
+          <w:lang w:val="fr-FR"/>
+        </w:rPr>
+        <w:t>_TABLE]</w:t>
       </w:r>
     </w:p>
     <w:tbl>

</xml_diff>

<commit_message>
[CHANGE] change the main logic of the code for better peformance
</commit_message>
<xml_diff>
--- a/assets/templates/template_runtest.docx
+++ b/assets/templates/template_runtest.docx
@@ -394,20 +394,7 @@
                                   <w:sz w:val="32"/>
                                   <w:szCs w:val="32"/>
                                 </w:rPr>
-                                <w:t xml:space="preserve">Expertise </w:t>
-                              </w:r>
-                              <w:r>
-                                <w:rPr>
-                                  <w:rFonts w:asciiTheme="majorHAnsi" w:hAnsiTheme="majorHAnsi" w:cstheme="majorHAnsi"/>
-                                  <w:b/>
-                                  <w:bCs/>
-                                  <w:color w:val="FFFFFF" w:themeColor="background1"/>
-                                  <w:spacing w:val="120"/>
-                                  <w:kern w:val="24"/>
-                                  <w:sz w:val="32"/>
-                                  <w:szCs w:val="32"/>
-                                </w:rPr>
-                                <w:t>en énergie renouvelable</w:t>
+                                <w:t>Expertise en énergie renouvelable</w:t>
                               </w:r>
                             </w:p>
                             <w:p>
@@ -494,20 +481,7 @@
                             <w:sz w:val="32"/>
                             <w:szCs w:val="32"/>
                           </w:rPr>
-                          <w:t xml:space="preserve">Expertise </w:t>
-                        </w:r>
-                        <w:r>
-                          <w:rPr>
-                            <w:rFonts w:asciiTheme="majorHAnsi" w:hAnsiTheme="majorHAnsi" w:cstheme="majorHAnsi"/>
-                            <w:b/>
-                            <w:bCs/>
-                            <w:color w:val="FFFFFF" w:themeColor="background1"/>
-                            <w:spacing w:val="120"/>
-                            <w:kern w:val="24"/>
-                            <w:sz w:val="32"/>
-                            <w:szCs w:val="32"/>
-                          </w:rPr>
-                          <w:t>en énergie renouvelable</w:t>
+                          <w:t>Expertise en énergie renouvelable</w:t>
                         </w:r>
                       </w:p>
                       <w:p>
@@ -3418,7 +3392,6 @@
       </w:r>
     </w:p>
     <w:p>
-      <w:pPr/>
       <w:r>
         <w:t>[TABLE:CSV_FILES_TABLE]</w:t>
       </w:r>
@@ -3824,6 +3797,7 @@
           <w:b/>
           <w:lang w:val="fr-FR"/>
         </w:rPr>
+        <w:lastRenderedPageBreak/>
         <w:t>Critère 3 – {{</w:t>
       </w:r>
       <w:proofErr w:type="spellStart"/>
@@ -3958,7 +3932,6 @@
           <w:b/>
           <w:lang w:val="fr-FR"/>
         </w:rPr>
-        <w:lastRenderedPageBreak/>
         <w:t>Critère 4 - Confirmations locales / redémarrages (&lt;</w:t>
       </w:r>
       <w:proofErr w:type="gramStart"/>
@@ -4578,6 +4551,7 @@
           <w:rFonts w:ascii="Cambria" w:hAnsi="Cambria"/>
           <w:lang w:val="fr-FR"/>
         </w:rPr>
+        <w:lastRenderedPageBreak/>
         <w:t>Certaines périodes d’arrêt peuvent être associées à des contraintes externes (par exemple bridage environnemental). Ces périodes sont prises en compte conformément aux règles définies pour l’analyse.</w:t>
       </w:r>
     </w:p>
@@ -4593,7 +4567,6 @@
           <w:rFonts w:ascii="Cambria" w:hAnsi="Cambria"/>
           <w:lang w:val="fr-FR"/>
         </w:rPr>
-        <w:lastRenderedPageBreak/>
         <w:t xml:space="preserve">Le tableau suivant montre que </w:t>
       </w:r>
       <w:r>
@@ -5229,6 +5202,7 @@
               <w:jc w:val="center"/>
             </w:pPr>
             <w:r>
+              <w:lastRenderedPageBreak/>
               <w:t>WTG</w:t>
             </w:r>
           </w:p>
@@ -5317,7 +5291,6 @@
           <w:rFonts w:ascii="Cambria" w:hAnsi="Cambria"/>
           <w:lang w:val="fr-FR"/>
         </w:rPr>
-        <w:lastRenderedPageBreak/>
         <w:t xml:space="preserve">Les turbines </w:t>
       </w:r>
       <w:r>
@@ -5828,6 +5801,7 @@
           <w:rFonts w:ascii="Cambria" w:hAnsi="Cambria"/>
           <w:lang w:val="fr-FR"/>
         </w:rPr>
+        <w:lastRenderedPageBreak/>
         <w:t>La proportion de temps pendant laquelle les turbines étaient en fonctionnement ;</w:t>
       </w:r>
     </w:p>
@@ -5883,7 +5857,6 @@
           <w:rFonts w:ascii="Cambria" w:hAnsi="Cambria"/>
           <w:lang w:val="fr-FR"/>
         </w:rPr>
-        <w:lastRenderedPageBreak/>
         <w:t>Le tableau suivant présente la disponibilité calculée pour chaque turbine pendant sa période de Run Test.</w:t>
       </w:r>
     </w:p>
@@ -6206,15 +6179,51 @@
       <w:pPr>
         <w:pStyle w:val="Titre1"/>
       </w:pPr>
-      <w:bookmarkStart w:id="16" w:name="_Toc228179433"/>
-      <w:proofErr w:type="spellStart"/>
-      <w:r>
-        <w:t>Annexe</w:t>
-      </w:r>
-      <w:bookmarkEnd w:id="16"/>
-      <w:proofErr w:type="spellEnd"/>
+      <w:r>
+        <w:lastRenderedPageBreak/>
+        <w:t>Annex</w:t>
+      </w:r>
     </w:p>
-    <w:p/>
+    <w:p>
+      <w:pPr>
+        <w:pStyle w:val="Titre2"/>
+      </w:pPr>
+      <w:r>
+        <w:t>Wind Rose</w:t>
+      </w:r>
+    </w:p>
+    <w:p>
+      <w:pPr>
+        <w:pStyle w:val="Titre2"/>
+      </w:pPr>
+      <w:r>
+        <w:t>Wind Bin Histogram</w:t>
+      </w:r>
+    </w:p>
+    <w:p>
+      <w:pPr>
+        <w:pStyle w:val="Titre2"/>
+      </w:pPr>
+      <w:r>
+        <w:t>Curve Power</w:t>
+      </w:r>
+    </w:p>
+    <w:p>
+      <w:pPr>
+        <w:pStyle w:val="Titre2"/>
+      </w:pPr>
+      <w:r>
+        <w:t>Data Heatmap</w:t>
+      </w:r>
+    </w:p>
+    <w:p>
+      <w:pPr>
+        <w:pStyle w:val="Titre2"/>
+      </w:pPr>
+      <w:r>
+        <w:t>Timeline</w:t>
+      </w:r>
+    </w:p>
     <w:sectPr>
       <w:headerReference w:type="default" r:id="rId13"/>
       <w:pgSz w:w="12240" w:h="15840"/>

</xml_diff>

<commit_message>
[CGANGE] change the logic of the code of the visualizer
</commit_message>
<xml_diff>
--- a/assets/templates/template_runtest.docx
+++ b/assets/templates/template_runtest.docx
@@ -647,18 +647,8 @@
                 <w:bCs/>
                 <w:szCs w:val="28"/>
               </w:rPr>
-              <w:t xml:space="preserve">Date </w:t>
+              <w:t>Date d’émission</w:t>
             </w:r>
-            <w:proofErr w:type="spellStart"/>
-            <w:r>
-              <w:rPr>
-                <w:b/>
-                <w:bCs/>
-                <w:szCs w:val="28"/>
-              </w:rPr>
-              <w:t>d’émission</w:t>
-            </w:r>
-            <w:proofErr w:type="spellEnd"/>
           </w:p>
         </w:tc>
         <w:tc>
@@ -699,7 +689,6 @@
                 <w:szCs w:val="28"/>
               </w:rPr>
             </w:pPr>
-            <w:proofErr w:type="spellStart"/>
             <w:r>
               <w:rPr>
                 <w:b/>
@@ -708,7 +697,6 @@
               </w:rPr>
               <w:t>Rédacteur</w:t>
             </w:r>
-            <w:proofErr w:type="spellEnd"/>
           </w:p>
         </w:tc>
         <w:tc>
@@ -725,7 +713,6 @@
                 <w:szCs w:val="28"/>
               </w:rPr>
             </w:pPr>
-            <w:proofErr w:type="spellStart"/>
             <w:r>
               <w:rPr>
                 <w:b/>
@@ -734,7 +721,6 @@
               </w:rPr>
               <w:t>Vérificateur</w:t>
             </w:r>
-            <w:proofErr w:type="spellEnd"/>
           </w:p>
         </w:tc>
         <w:tc>
@@ -751,7 +737,6 @@
                 <w:szCs w:val="28"/>
               </w:rPr>
             </w:pPr>
-            <w:proofErr w:type="spellStart"/>
             <w:r>
               <w:rPr>
                 <w:b/>
@@ -760,7 +745,6 @@
               </w:rPr>
               <w:t>Approbateur</w:t>
             </w:r>
-            <w:proofErr w:type="spellEnd"/>
           </w:p>
         </w:tc>
       </w:tr>
@@ -3190,23 +3174,7 @@
           <w:rFonts w:ascii="Cambria" w:hAnsi="Cambria"/>
           <w:lang w:val="fr-FR"/>
         </w:rPr>
-        <w:t>Le présent rapport présente l’analyse des Run Tests réalisée à partir des données SCADA du parc éolien {{</w:t>
-      </w:r>
-      <w:proofErr w:type="spellStart"/>
-      <w:r>
-        <w:rPr>
-          <w:rFonts w:ascii="Cambria" w:hAnsi="Cambria"/>
-          <w:lang w:val="fr-FR"/>
-        </w:rPr>
-        <w:t>Nom_du_parc</w:t>
-      </w:r>
-      <w:proofErr w:type="spellEnd"/>
-      <w:r>
-        <w:rPr>
-          <w:rFonts w:ascii="Cambria" w:hAnsi="Cambria"/>
-          <w:lang w:val="fr-FR"/>
-        </w:rPr>
-        <w:t xml:space="preserve">}}. </w:t>
+        <w:t xml:space="preserve">Le présent rapport présente l’analyse des Run Tests réalisée à partir des données SCADA du parc éolien {{Nom_du_parc}}. </w:t>
       </w:r>
     </w:p>
     <w:p>
@@ -3229,43 +3197,7 @@
           <w:b/>
           <w:lang w:val="fr-FR"/>
         </w:rPr>
-        <w:t>{{</w:t>
-      </w:r>
-      <w:proofErr w:type="spellStart"/>
-      <w:r>
-        <w:rPr>
-          <w:rFonts w:ascii="Cambria" w:hAnsi="Cambria"/>
-          <w:b/>
-          <w:lang w:val="fr-FR"/>
-        </w:rPr>
-        <w:t>Nombre_WTG</w:t>
-      </w:r>
-      <w:proofErr w:type="spellEnd"/>
-      <w:r>
-        <w:rPr>
-          <w:rFonts w:ascii="Cambria" w:hAnsi="Cambria"/>
-          <w:b/>
-          <w:lang w:val="fr-FR"/>
-        </w:rPr>
-        <w:t>}} éoliennes de type {{</w:t>
-      </w:r>
-      <w:proofErr w:type="spellStart"/>
-      <w:r>
-        <w:rPr>
-          <w:rFonts w:ascii="Cambria" w:hAnsi="Cambria"/>
-          <w:b/>
-          <w:lang w:val="fr-FR"/>
-        </w:rPr>
-        <w:t>Modèle_turbine</w:t>
-      </w:r>
-      <w:proofErr w:type="spellEnd"/>
-      <w:r>
-        <w:rPr>
-          <w:rFonts w:ascii="Cambria" w:hAnsi="Cambria"/>
-          <w:b/>
-          <w:lang w:val="fr-FR"/>
-        </w:rPr>
-        <w:t>}}</w:t>
+        <w:t>{{Nombre_WTG}} éoliennes de type {{Modèle_turbine}}</w:t>
       </w:r>
       <w:r>
         <w:rPr>
@@ -3280,25 +3212,7 @@
           <w:b/>
           <w:lang w:val="fr-FR"/>
         </w:rPr>
-        <w:t>{{</w:t>
-      </w:r>
-      <w:proofErr w:type="spellStart"/>
-      <w:r>
-        <w:rPr>
-          <w:rFonts w:ascii="Cambria" w:hAnsi="Cambria"/>
-          <w:b/>
-          <w:lang w:val="fr-FR"/>
-        </w:rPr>
-        <w:t>Puissance_nominale</w:t>
-      </w:r>
-      <w:proofErr w:type="spellEnd"/>
-      <w:r>
-        <w:rPr>
-          <w:rFonts w:ascii="Cambria" w:hAnsi="Cambria"/>
-          <w:b/>
-          <w:lang w:val="fr-FR"/>
-        </w:rPr>
-        <w:t>}}</w:t>
+        <w:t>{{Puissance_nominale}}</w:t>
       </w:r>
       <w:r>
         <w:rPr>
@@ -3455,25 +3369,7 @@
                 <w:color w:val="auto"/>
                 <w:lang w:val="fr-FR"/>
               </w:rPr>
-              <w:t xml:space="preserve">Path </w:t>
-            </w:r>
-            <w:proofErr w:type="spellStart"/>
-            <w:r>
-              <w:rPr>
-                <w:rFonts w:asciiTheme="majorHAnsi" w:hAnsiTheme="majorHAnsi" w:cstheme="majorHAnsi"/>
-                <w:color w:val="auto"/>
-                <w:lang w:val="fr-FR"/>
-              </w:rPr>
-              <w:t>Operation</w:t>
-            </w:r>
-            <w:proofErr w:type="spellEnd"/>
-            <w:r>
-              <w:rPr>
-                <w:rFonts w:asciiTheme="majorHAnsi" w:hAnsiTheme="majorHAnsi" w:cstheme="majorHAnsi"/>
-                <w:color w:val="auto"/>
-                <w:lang w:val="fr-FR"/>
-              </w:rPr>
-              <w:t xml:space="preserve"> Date</w:t>
+              <w:t>Path Operation Date</w:t>
             </w:r>
           </w:p>
         </w:tc>
@@ -3497,25 +3393,7 @@
                 <w:color w:val="auto"/>
                 <w:lang w:val="fr-FR"/>
               </w:rPr>
-              <w:t xml:space="preserve">Path </w:t>
-            </w:r>
-            <w:proofErr w:type="spellStart"/>
-            <w:r>
-              <w:rPr>
-                <w:rFonts w:asciiTheme="majorHAnsi" w:hAnsiTheme="majorHAnsi" w:cstheme="majorHAnsi"/>
-                <w:color w:val="auto"/>
-                <w:lang w:val="fr-FR"/>
-              </w:rPr>
-              <w:t>Alarm</w:t>
-            </w:r>
-            <w:proofErr w:type="spellEnd"/>
-            <w:r>
-              <w:rPr>
-                <w:rFonts w:asciiTheme="majorHAnsi" w:hAnsiTheme="majorHAnsi" w:cstheme="majorHAnsi"/>
-                <w:color w:val="auto"/>
-                <w:lang w:val="fr-FR"/>
-              </w:rPr>
-              <w:t xml:space="preserve"> Log</w:t>
+              <w:t>Path Alarm Log</w:t>
             </w:r>
           </w:p>
         </w:tc>
@@ -3595,25 +3473,7 @@
           <w:b/>
           <w:lang w:val="fr-FR"/>
         </w:rPr>
-        <w:t>Critère 1 - Minimum de {{</w:t>
-      </w:r>
-      <w:proofErr w:type="spellStart"/>
-      <w:r>
-        <w:rPr>
-          <w:rFonts w:ascii="Cambria" w:hAnsi="Cambria"/>
-          <w:b/>
-          <w:lang w:val="fr-FR"/>
-        </w:rPr>
-        <w:t>consecutive_hours_h</w:t>
-      </w:r>
-      <w:proofErr w:type="spellEnd"/>
-      <w:r>
-        <w:rPr>
-          <w:rFonts w:ascii="Cambria" w:hAnsi="Cambria"/>
-          <w:b/>
-          <w:lang w:val="fr-FR"/>
-        </w:rPr>
-        <w:t>}} heures consécutives :</w:t>
+        <w:t>Critère 1 - Minimum de {{consecutive_hours_h}} heures consécutives :</w:t>
       </w:r>
       <w:r>
         <w:rPr>
@@ -3636,152 +3496,14 @@
           <w:b/>
           <w:lang w:val="fr-FR"/>
         </w:rPr>
-        <w:t>Critère 2 – {{</w:t>
-      </w:r>
-      <w:proofErr w:type="spellStart"/>
-      <w:r>
-        <w:rPr>
-          <w:rFonts w:ascii="Cambria" w:hAnsi="Cambria"/>
-          <w:b/>
-          <w:lang w:val="fr-FR"/>
-        </w:rPr>
-        <w:t>cut_in_to_cut_out_h</w:t>
-      </w:r>
-      <w:proofErr w:type="spellEnd"/>
-      <w:r>
-        <w:rPr>
-          <w:rFonts w:ascii="Cambria" w:hAnsi="Cambria"/>
-          <w:b/>
-          <w:lang w:val="fr-FR"/>
-        </w:rPr>
-        <w:t>}} heures dans la plage de vitesse du vent comprise entre la vitesse de démarrage et la vitesse d'arrêt ({{</w:t>
-      </w:r>
-      <w:proofErr w:type="spellStart"/>
-      <w:r>
-        <w:rPr>
-          <w:rFonts w:ascii="Cambria" w:hAnsi="Cambria"/>
-          <w:b/>
-          <w:lang w:val="fr-FR"/>
-        </w:rPr>
-        <w:t>cut_in_v_min</w:t>
-      </w:r>
-      <w:proofErr w:type="spellEnd"/>
-      <w:proofErr w:type="gramStart"/>
-      <w:r>
-        <w:rPr>
-          <w:rFonts w:ascii="Cambria" w:hAnsi="Cambria"/>
-          <w:b/>
-          <w:lang w:val="fr-FR"/>
-        </w:rPr>
-        <w:t>}}-</w:t>
-      </w:r>
-      <w:proofErr w:type="gramEnd"/>
-      <w:r>
-        <w:rPr>
-          <w:rFonts w:ascii="Cambria" w:hAnsi="Cambria"/>
-          <w:b/>
-          <w:lang w:val="fr-FR"/>
-        </w:rPr>
-        <w:t xml:space="preserve"> {{</w:t>
-      </w:r>
-      <w:proofErr w:type="spellStart"/>
-      <w:r>
-        <w:rPr>
-          <w:rFonts w:ascii="Cambria" w:hAnsi="Cambria"/>
-          <w:b/>
-          <w:lang w:val="fr-FR"/>
-        </w:rPr>
-        <w:t>cut_in_v_max</w:t>
-      </w:r>
-      <w:proofErr w:type="spellEnd"/>
-      <w:proofErr w:type="gramStart"/>
-      <w:r>
-        <w:rPr>
-          <w:rFonts w:ascii="Cambria" w:hAnsi="Cambria"/>
-          <w:b/>
-          <w:lang w:val="fr-FR"/>
-        </w:rPr>
-        <w:t>}}-</w:t>
-      </w:r>
-      <w:proofErr w:type="gramEnd"/>
-      <w:r>
-        <w:rPr>
-          <w:rFonts w:ascii="Cambria" w:hAnsi="Cambria"/>
-          <w:b/>
-          <w:lang w:val="fr-FR"/>
-        </w:rPr>
-        <w:t xml:space="preserve"> m/s) :</w:t>
+        <w:t>Critère 2 – {{cut_in_to_cut_out_h}} heures dans la plage de vitesse du vent comprise entre la vitesse de démarrage et la vitesse d'arrêt ({{cut_in_v_min}}- {{cut_in_v_max}}- m/s) :</w:t>
       </w:r>
       <w:r>
         <w:rPr>
           <w:rFonts w:ascii="Cambria" w:hAnsi="Cambria"/>
           <w:lang w:val="fr-FR"/>
         </w:rPr>
-        <w:t xml:space="preserve"> au cours de la période de {{</w:t>
-      </w:r>
-      <w:proofErr w:type="spellStart"/>
-      <w:r>
-        <w:rPr>
-          <w:rFonts w:ascii="Cambria" w:hAnsi="Cambria"/>
-          <w:lang w:val="fr-FR"/>
-        </w:rPr>
-        <w:t>consecutive_hours_h</w:t>
-      </w:r>
-      <w:proofErr w:type="spellEnd"/>
-      <w:r>
-        <w:rPr>
-          <w:rFonts w:ascii="Cambria" w:hAnsi="Cambria"/>
-          <w:lang w:val="fr-FR"/>
-        </w:rPr>
-        <w:t>}} heures, l'éolienne doit fonctionner pendant au moins {{</w:t>
-      </w:r>
-      <w:proofErr w:type="spellStart"/>
-      <w:r>
-        <w:rPr>
-          <w:rFonts w:ascii="Cambria" w:hAnsi="Cambria"/>
-          <w:lang w:val="fr-FR"/>
-        </w:rPr>
-        <w:t>cut_in_to_cut_out_h</w:t>
-      </w:r>
-      <w:proofErr w:type="spellEnd"/>
-      <w:r>
-        <w:rPr>
-          <w:rFonts w:ascii="Cambria" w:hAnsi="Cambria"/>
-          <w:lang w:val="fr-FR"/>
-        </w:rPr>
-        <w:t>}} heures avec des vitesses de vent comprises entre la vitesse de démarrage ({{</w:t>
-      </w:r>
-      <w:proofErr w:type="spellStart"/>
-      <w:r>
-        <w:rPr>
-          <w:rFonts w:ascii="Cambria" w:hAnsi="Cambria"/>
-          <w:lang w:val="fr-FR"/>
-        </w:rPr>
-        <w:t>cut_in_v_min</w:t>
-      </w:r>
-      <w:proofErr w:type="spellEnd"/>
-      <w:r>
-        <w:rPr>
-          <w:rFonts w:ascii="Cambria" w:hAnsi="Cambria"/>
-          <w:lang w:val="fr-FR"/>
-        </w:rPr>
-        <w:t>}} m/s) et la vitesse d'arrêt ({{</w:t>
-      </w:r>
-      <w:proofErr w:type="spellStart"/>
-      <w:r>
-        <w:rPr>
-          <w:rFonts w:ascii="Cambria" w:hAnsi="Cambria"/>
-          <w:lang w:val="fr-FR"/>
-        </w:rPr>
-        <w:t>cut_in_v_max</w:t>
-      </w:r>
-      <w:proofErr w:type="spellEnd"/>
-      <w:r>
-        <w:rPr>
-          <w:rFonts w:ascii="Cambria" w:hAnsi="Cambria"/>
-          <w:lang w:val="fr-FR"/>
-        </w:rPr>
-        <w:t xml:space="preserve">}} m/s). </w:t>
+        <w:t xml:space="preserve"> au cours de la période de {{consecutive_hours_h}} heures, l'éolienne doit fonctionner pendant au moins {{cut_in_to_cut_out_h}} heures avec des vitesses de vent comprises entre la vitesse de démarrage ({{cut_in_v_min}} m/s) et la vitesse d'arrêt ({{cut_in_v_max}} m/s). </w:t>
       </w:r>
     </w:p>
     <w:p>
@@ -3798,125 +3520,14 @@
           <w:lang w:val="fr-FR"/>
         </w:rPr>
         <w:lastRenderedPageBreak/>
-        <w:t>Critère 3 – {{</w:t>
-      </w:r>
-      <w:proofErr w:type="spellStart"/>
-      <w:r>
-        <w:rPr>
-          <w:rFonts w:ascii="Cambria" w:hAnsi="Cambria"/>
-          <w:b/>
-          <w:lang w:val="fr-FR"/>
-        </w:rPr>
-        <w:t>nominal_power_h</w:t>
-      </w:r>
-      <w:proofErr w:type="spellEnd"/>
-      <w:r>
-        <w:rPr>
-          <w:rFonts w:ascii="Cambria" w:hAnsi="Cambria"/>
-          <w:b/>
-          <w:lang w:val="fr-FR"/>
-        </w:rPr>
-        <w:t>}} heures à {{</w:t>
-      </w:r>
-      <w:proofErr w:type="spellStart"/>
-      <w:r>
-        <w:rPr>
-          <w:rFonts w:ascii="Cambria" w:hAnsi="Cambria"/>
-          <w:b/>
-          <w:lang w:val="fr-FR"/>
-        </w:rPr>
-        <w:t>nominal_power_</w:t>
-      </w:r>
-      <w:proofErr w:type="gramStart"/>
-      <w:r>
-        <w:rPr>
-          <w:rFonts w:ascii="Cambria" w:hAnsi="Cambria"/>
-          <w:b/>
-          <w:lang w:val="fr-FR"/>
-        </w:rPr>
-        <w:t>pct</w:t>
-      </w:r>
-      <w:proofErr w:type="spellEnd"/>
-      <w:r>
-        <w:rPr>
-          <w:rFonts w:ascii="Cambria" w:hAnsi="Cambria"/>
-          <w:b/>
-          <w:lang w:val="fr-FR"/>
-        </w:rPr>
-        <w:t xml:space="preserve"> }</w:t>
-      </w:r>
-      <w:proofErr w:type="gramEnd"/>
-      <w:r>
-        <w:rPr>
-          <w:rFonts w:ascii="Cambria" w:hAnsi="Cambria"/>
-          <w:b/>
-          <w:lang w:val="fr-FR"/>
-        </w:rPr>
-        <w:t>} % ou plus de la puissance nominale :</w:t>
+        <w:t>Critère 3 – {{nominal_power_h}} heures à {{nominal_power_pct }} % ou plus de la puissance nominale :</w:t>
       </w:r>
       <w:r>
         <w:rPr>
           <w:rFonts w:ascii="Cambria" w:hAnsi="Cambria"/>
           <w:lang w:val="fr-FR"/>
         </w:rPr>
-        <w:t xml:space="preserve"> L'éolienne doit fonctionner pendant au moins </w:t>
-      </w:r>
-      <w:proofErr w:type="gramStart"/>
-      <w:r>
-        <w:rPr>
-          <w:rFonts w:ascii="Cambria" w:hAnsi="Cambria"/>
-          <w:lang w:val="fr-FR"/>
-        </w:rPr>
-        <w:t xml:space="preserve">{{ </w:t>
-      </w:r>
-      <w:proofErr w:type="spellStart"/>
-      <w:r>
-        <w:rPr>
-          <w:rFonts w:ascii="Cambria" w:hAnsi="Cambria"/>
-          <w:lang w:val="fr-FR"/>
-        </w:rPr>
-        <w:t>nominal</w:t>
-      </w:r>
-      <w:proofErr w:type="gramEnd"/>
-      <w:r>
-        <w:rPr>
-          <w:rFonts w:ascii="Cambria" w:hAnsi="Cambria"/>
-          <w:lang w:val="fr-FR"/>
-        </w:rPr>
-        <w:t>_power_h</w:t>
-      </w:r>
-      <w:proofErr w:type="spellEnd"/>
-      <w:r>
-        <w:rPr>
-          <w:rFonts w:ascii="Cambria" w:hAnsi="Cambria"/>
-          <w:lang w:val="fr-FR"/>
-        </w:rPr>
-        <w:t>}} heures à {{</w:t>
-      </w:r>
-      <w:proofErr w:type="spellStart"/>
-      <w:r>
-        <w:rPr>
-          <w:rFonts w:ascii="Cambria" w:hAnsi="Cambria"/>
-          <w:lang w:val="fr-FR"/>
-        </w:rPr>
-        <w:t>nominal_power_pct</w:t>
-      </w:r>
-      <w:proofErr w:type="spellEnd"/>
-      <w:proofErr w:type="gramStart"/>
-      <w:r>
-        <w:rPr>
-          <w:rFonts w:ascii="Cambria" w:hAnsi="Cambria"/>
-          <w:lang w:val="fr-FR"/>
-        </w:rPr>
-        <w:t>}}%</w:t>
-      </w:r>
-      <w:proofErr w:type="gramEnd"/>
-      <w:r>
-        <w:rPr>
-          <w:rFonts w:ascii="Cambria" w:hAnsi="Cambria"/>
-          <w:lang w:val="fr-FR"/>
-        </w:rPr>
-        <w:t xml:space="preserve"> ou plus de sa puissance nominale. </w:t>
+        <w:t xml:space="preserve"> L'éolienne doit fonctionner pendant au moins {{ nominal_power_h}} heures à {{nominal_power_pct}}% ou plus de sa puissance nominale. </w:t>
       </w:r>
     </w:p>
     <w:p>
@@ -3932,61 +3543,7 @@
           <w:b/>
           <w:lang w:val="fr-FR"/>
         </w:rPr>
-        <w:t>Critère 4 - Confirmations locales / redémarrages (&lt;</w:t>
-      </w:r>
-      <w:proofErr w:type="gramStart"/>
-      <w:r>
-        <w:rPr>
-          <w:rFonts w:ascii="Cambria" w:hAnsi="Cambria"/>
-          <w:b/>
-          <w:lang w:val="fr-FR"/>
-        </w:rPr>
-        <w:t>={</w:t>
-      </w:r>
-      <w:proofErr w:type="gramEnd"/>
-      <w:r>
-        <w:rPr>
-          <w:rFonts w:ascii="Cambria" w:hAnsi="Cambria"/>
-          <w:b/>
-          <w:lang w:val="fr-FR"/>
-        </w:rPr>
-        <w:t>{</w:t>
-      </w:r>
-      <w:proofErr w:type="spellStart"/>
-      <w:r>
-        <w:rPr>
-          <w:rFonts w:ascii="Cambria" w:hAnsi="Cambria"/>
-          <w:b/>
-          <w:lang w:val="fr-FR"/>
-        </w:rPr>
-        <w:t>local_restarts_</w:t>
-      </w:r>
-      <w:proofErr w:type="gramStart"/>
-      <w:r>
-        <w:rPr>
-          <w:rFonts w:ascii="Cambria" w:hAnsi="Cambria"/>
-          <w:b/>
-          <w:lang w:val="fr-FR"/>
-        </w:rPr>
-        <w:t>max</w:t>
-      </w:r>
-      <w:proofErr w:type="spellEnd"/>
-      <w:r>
-        <w:rPr>
-          <w:rFonts w:ascii="Cambria" w:hAnsi="Cambria"/>
-          <w:b/>
-          <w:lang w:val="fr-FR"/>
-        </w:rPr>
-        <w:t xml:space="preserve"> }</w:t>
-      </w:r>
-      <w:proofErr w:type="gramEnd"/>
-      <w:r>
-        <w:rPr>
-          <w:rFonts w:ascii="Cambria" w:hAnsi="Cambria"/>
-          <w:b/>
-          <w:lang w:val="fr-FR"/>
-        </w:rPr>
-        <w:t>}) :</w:t>
+        <w:t>Critère 4 - Confirmations locales / redémarrages (&lt;={{local_restarts_max }}) :</w:t>
       </w:r>
       <w:r>
         <w:rPr>
@@ -4009,61 +3566,7 @@
           <w:b/>
           <w:lang w:val="fr-FR"/>
         </w:rPr>
-        <w:t>Critère 5 - Disponibilité (&gt;</w:t>
-      </w:r>
-      <w:proofErr w:type="gramStart"/>
-      <w:r>
-        <w:rPr>
-          <w:rFonts w:ascii="Cambria" w:hAnsi="Cambria"/>
-          <w:b/>
-          <w:lang w:val="fr-FR"/>
-        </w:rPr>
-        <w:t>={</w:t>
-      </w:r>
-      <w:proofErr w:type="gramEnd"/>
-      <w:r>
-        <w:rPr>
-          <w:rFonts w:ascii="Cambria" w:hAnsi="Cambria"/>
-          <w:b/>
-          <w:lang w:val="fr-FR"/>
-        </w:rPr>
-        <w:t>{</w:t>
-      </w:r>
-      <w:proofErr w:type="spellStart"/>
-      <w:r>
-        <w:rPr>
-          <w:rFonts w:ascii="Cambria" w:hAnsi="Cambria"/>
-          <w:b/>
-          <w:lang w:val="fr-FR"/>
-        </w:rPr>
-        <w:t>availability_min_</w:t>
-      </w:r>
-      <w:proofErr w:type="gramStart"/>
-      <w:r>
-        <w:rPr>
-          <w:rFonts w:ascii="Cambria" w:hAnsi="Cambria"/>
-          <w:b/>
-          <w:lang w:val="fr-FR"/>
-        </w:rPr>
-        <w:t>pct</w:t>
-      </w:r>
-      <w:proofErr w:type="spellEnd"/>
-      <w:r>
-        <w:rPr>
-          <w:rFonts w:ascii="Cambria" w:hAnsi="Cambria"/>
-          <w:b/>
-          <w:lang w:val="fr-FR"/>
-        </w:rPr>
-        <w:t xml:space="preserve"> }</w:t>
-      </w:r>
-      <w:proofErr w:type="gramEnd"/>
-      <w:r>
-        <w:rPr>
-          <w:rFonts w:ascii="Cambria" w:hAnsi="Cambria"/>
-          <w:b/>
-          <w:lang w:val="fr-FR"/>
-        </w:rPr>
-        <w:t>} %) :</w:t>
+        <w:t>Critère 5 - Disponibilité (&gt;={{availability_min_pct }} %) :</w:t>
       </w:r>
       <w:r>
         <w:rPr>
@@ -4125,23 +3628,7 @@
           <w:color w:val="FFFFFF"/>
           <w:sz w:val="2"/>
         </w:rPr>
-        <w:t>[</w:t>
-      </w:r>
-      <w:proofErr w:type="gramStart"/>
-      <w:r>
-        <w:rPr>
-          <w:color w:val="FFFFFF"/>
-          <w:sz w:val="2"/>
-        </w:rPr>
-        <w:t>TABLE:SUMMARY</w:t>
-      </w:r>
-      <w:proofErr w:type="gramEnd"/>
-      <w:r>
-        <w:rPr>
-          <w:color w:val="FFFFFF"/>
-          <w:sz w:val="2"/>
-        </w:rPr>
-        <w:t>_TABLE]</w:t>
+        <w:t>[TABLE:SUMMARY_TABLE]</w:t>
       </w:r>
     </w:p>
     <w:tbl>
@@ -4227,15 +3714,7 @@
             </w:r>
             <w:r>
               <w:br/>
-              <w:t>(≥3</w:t>
-            </w:r>
-            <w:proofErr w:type="gramStart"/>
-            <w:r>
-              <w:t>h @</w:t>
-            </w:r>
-            <w:proofErr w:type="gramEnd"/>
-            <w:r>
-              <w:t>97%)</w:t>
+              <w:t>(≥3h @97%)</w:t>
             </w:r>
           </w:p>
         </w:tc>
@@ -4379,23 +3858,7 @@
           <w:color w:val="FFFFFF"/>
           <w:sz w:val="2"/>
         </w:rPr>
-        <w:t>[</w:t>
-      </w:r>
-      <w:proofErr w:type="gramStart"/>
-      <w:r>
-        <w:rPr>
-          <w:color w:val="FFFFFF"/>
-          <w:sz w:val="2"/>
-        </w:rPr>
-        <w:t>TABLE:CONSECUTIVE</w:t>
-      </w:r>
-      <w:proofErr w:type="gramEnd"/>
-      <w:r>
-        <w:rPr>
-          <w:color w:val="FFFFFF"/>
-          <w:sz w:val="2"/>
-        </w:rPr>
-        <w:t>_HOURS_TABLE]</w:t>
+        <w:t>[TABLE:CONSECUTIVE_HOURS_TABLE]</w:t>
       </w:r>
     </w:p>
     <w:tbl>
@@ -4606,23 +4069,7 @@
           <w:color w:val="FFFFFF"/>
           <w:sz w:val="2"/>
         </w:rPr>
-        <w:t>[</w:t>
-      </w:r>
-      <w:proofErr w:type="gramStart"/>
-      <w:r>
-        <w:rPr>
-          <w:color w:val="FFFFFF"/>
-          <w:sz w:val="2"/>
-        </w:rPr>
-        <w:t>TABLE:CUT</w:t>
-      </w:r>
-      <w:proofErr w:type="gramEnd"/>
-      <w:r>
-        <w:rPr>
-          <w:color w:val="FFFFFF"/>
-          <w:sz w:val="2"/>
-        </w:rPr>
-        <w:t>_IN_CUT_OUT_TABLE]</w:t>
+        <w:t>[TABLE:CUT_IN_CUT_OUT_TABLE]</w:t>
       </w:r>
     </w:p>
     <w:tbl>
@@ -4790,23 +4237,7 @@
           <w:rFonts w:ascii="Cambria" w:hAnsi="Cambria"/>
           <w:lang w:val="fr-FR"/>
         </w:rPr>
-        <w:t xml:space="preserve">, la durée cumulée de fonctionnement observée </w:t>
-      </w:r>
-      <w:proofErr w:type="spellStart"/>
-      <w:r>
-        <w:rPr>
-          <w:rFonts w:ascii="Cambria" w:hAnsi="Cambria"/>
-          <w:lang w:val="fr-FR"/>
-        </w:rPr>
-        <w:t>étaninférieure</w:t>
-      </w:r>
-      <w:proofErr w:type="spellEnd"/>
-      <w:r>
-        <w:rPr>
-          <w:rFonts w:ascii="Cambria" w:hAnsi="Cambria"/>
-          <w:lang w:val="fr-FR"/>
-        </w:rPr>
-        <w:t xml:space="preserve"> au seuil requis (cas de non-validation).</w:t>
+        <w:t>, la durée cumulée de fonctionnement observée étaninférieure au seuil requis (cas de non-validation).</w:t>
       </w:r>
     </w:p>
     <w:p>
@@ -4885,23 +4316,7 @@
           <w:color w:val="FFFFFF"/>
           <w:sz w:val="2"/>
         </w:rPr>
-        <w:t>[</w:t>
-      </w:r>
-      <w:proofErr w:type="gramStart"/>
-      <w:r>
-        <w:rPr>
-          <w:color w:val="FFFFFF"/>
-          <w:sz w:val="2"/>
-        </w:rPr>
-        <w:t>TABLE:NOMINAL</w:t>
-      </w:r>
-      <w:proofErr w:type="gramEnd"/>
-      <w:r>
-        <w:rPr>
-          <w:color w:val="FFFFFF"/>
-          <w:sz w:val="2"/>
-        </w:rPr>
-        <w:t>_POWER_VALUES_TABLE]</w:t>
+        <w:t>[TABLE:NOMINAL_POWER_VALUES_TABLE]</w:t>
       </w:r>
     </w:p>
     <w:tbl>
@@ -5028,15 +4443,7 @@
           <w:rFonts w:ascii="Cambria" w:hAnsi="Cambria"/>
           <w:lang w:val="fr-FR"/>
         </w:rPr>
-        <w:t xml:space="preserve">L'éolienne doit fonctionner pendant au moins 3 heures à une puissance égale ou supérieure à </w:t>
-      </w:r>
-      <w:proofErr w:type="gramStart"/>
-      <w:r>
-        <w:rPr>
-          <w:rFonts w:ascii="Cambria" w:hAnsi="Cambria"/>
-          <w:lang w:val="fr-FR"/>
-        </w:rPr>
-        <w:t>{{</w:t>
+        <w:t>L'éolienne doit fonctionner pendant au moins 3 heures à une puissance égale ou supérieure à {{</w:t>
       </w:r>
       <w:r>
         <w:rPr>
@@ -5046,45 +4453,12 @@
         </w:rPr>
         <w:t xml:space="preserve"> </w:t>
       </w:r>
-      <w:proofErr w:type="spellStart"/>
       <w:r>
         <w:rPr>
           <w:rFonts w:ascii="Cambria" w:hAnsi="Cambria"/>
           <w:lang w:val="fr-FR"/>
         </w:rPr>
-        <w:t>nominal</w:t>
-      </w:r>
-      <w:proofErr w:type="gramEnd"/>
-      <w:r>
-        <w:rPr>
-          <w:rFonts w:ascii="Cambria" w:hAnsi="Cambria"/>
-          <w:lang w:val="fr-FR"/>
-        </w:rPr>
-        <w:t>_power_pct</w:t>
-      </w:r>
-      <w:proofErr w:type="spellEnd"/>
-      <w:r>
-        <w:rPr>
-          <w:rFonts w:ascii="Cambria" w:hAnsi="Cambria"/>
-          <w:lang w:val="fr-FR"/>
-        </w:rPr>
-        <w:t>}} % de sa puissance nominale, sur la base des données SCADA enregistrées toutes les 10 minutes de la puissance nominale de {{</w:t>
-      </w:r>
-      <w:proofErr w:type="spellStart"/>
-      <w:r>
-        <w:rPr>
-          <w:rFonts w:ascii="Cambria" w:hAnsi="Cambria"/>
-          <w:lang w:val="fr-FR"/>
-        </w:rPr>
-        <w:t>nominal_power_h</w:t>
-      </w:r>
-      <w:proofErr w:type="spellEnd"/>
-      <w:r>
-        <w:rPr>
-          <w:rFonts w:ascii="Cambria" w:hAnsi="Cambria"/>
-          <w:lang w:val="fr-FR"/>
-        </w:rPr>
-        <w:t>}} MW dans l'analyse.</w:t>
+        <w:t>nominal_power_pct}} % de sa puissance nominale, sur la base des données SCADA enregistrées toutes les 10 minutes de la puissance nominale de {{nominal_power_h}} MW dans l'analyse.</w:t>
       </w:r>
     </w:p>
     <w:p>
@@ -5115,39 +4489,7 @@
           <w:rFonts w:ascii="Cambria" w:hAnsi="Cambria"/>
           <w:lang w:val="fr-FR"/>
         </w:rPr>
-        <w:t>Le tableau suivant présente les heures de fonctionnement au-dessus de ({{</w:t>
-      </w:r>
-      <w:proofErr w:type="spellStart"/>
-      <w:r>
-        <w:rPr>
-          <w:rFonts w:ascii="Cambria" w:hAnsi="Cambria"/>
-          <w:lang w:val="fr-FR"/>
-        </w:rPr>
-        <w:t>nominal_power_pct</w:t>
-      </w:r>
-      <w:proofErr w:type="spellEnd"/>
-      <w:r>
-        <w:rPr>
-          <w:rFonts w:ascii="Cambria" w:hAnsi="Cambria"/>
-          <w:lang w:val="fr-FR"/>
-        </w:rPr>
-        <w:t xml:space="preserve">}} % de la puissance nominale) pendant le </w:t>
-      </w:r>
-      <w:proofErr w:type="spellStart"/>
-      <w:r>
-        <w:rPr>
-          <w:rFonts w:ascii="Cambria" w:hAnsi="Cambria"/>
-          <w:lang w:val="fr-FR"/>
-        </w:rPr>
-        <w:t>RunTest</w:t>
-      </w:r>
-      <w:proofErr w:type="spellEnd"/>
-      <w:r>
-        <w:rPr>
-          <w:rFonts w:ascii="Cambria" w:hAnsi="Cambria"/>
-          <w:lang w:val="fr-FR"/>
-        </w:rPr>
-        <w:t xml:space="preserve"> :</w:t>
+        <w:t>Le tableau suivant présente les heures de fonctionnement au-dessus de ({{nominal_power_pct}} % de la puissance nominale) pendant le RunTest :</w:t>
       </w:r>
     </w:p>
     <w:p>
@@ -5156,23 +4498,7 @@
           <w:color w:val="FFFFFF"/>
           <w:sz w:val="2"/>
         </w:rPr>
-        <w:t>[</w:t>
-      </w:r>
-      <w:proofErr w:type="gramStart"/>
-      <w:r>
-        <w:rPr>
-          <w:color w:val="FFFFFF"/>
-          <w:sz w:val="2"/>
-        </w:rPr>
-        <w:t>TABLE:NOMINAL</w:t>
-      </w:r>
-      <w:proofErr w:type="gramEnd"/>
-      <w:r>
-        <w:rPr>
-          <w:color w:val="FFFFFF"/>
-          <w:sz w:val="2"/>
-        </w:rPr>
-        <w:t>_POWER_DURATION_TABLE]</w:t>
+        <w:t>[TABLE:NOMINAL_POWER_DURATION_TABLE]</w:t>
       </w:r>
     </w:p>
     <w:tbl>
@@ -5390,25 +4716,7 @@
           <w:b/>
           <w:lang w:val="fr-FR"/>
         </w:rPr>
-        <w:t>{{</w:t>
-      </w:r>
-      <w:proofErr w:type="spellStart"/>
-      <w:r>
-        <w:rPr>
-          <w:rFonts w:ascii="Cambria" w:hAnsi="Cambria"/>
-          <w:b/>
-          <w:lang w:val="fr-FR"/>
-        </w:rPr>
-        <w:t>local_restarts_max</w:t>
-      </w:r>
-      <w:proofErr w:type="spellEnd"/>
-      <w:r>
-        <w:rPr>
-          <w:rFonts w:ascii="Cambria" w:hAnsi="Cambria"/>
-          <w:b/>
-          <w:lang w:val="fr-FR"/>
-        </w:rPr>
-        <w:t xml:space="preserve">}} défaillance(s) </w:t>
+        <w:t xml:space="preserve">{{local_restarts_max}} défaillance(s) </w:t>
       </w:r>
       <w:r>
         <w:rPr>
@@ -5446,25 +4754,7 @@
           <w:sz w:val="2"/>
           <w:lang w:val="fr-FR"/>
         </w:rPr>
-        <w:t>[</w:t>
-      </w:r>
-      <w:proofErr w:type="gramStart"/>
-      <w:r>
-        <w:rPr>
-          <w:color w:val="FFFFFF"/>
-          <w:sz w:val="2"/>
-          <w:lang w:val="fr-FR"/>
-        </w:rPr>
-        <w:t>TABLE:AUTONOMOUS</w:t>
-      </w:r>
-      <w:proofErr w:type="gramEnd"/>
-      <w:r>
-        <w:rPr>
-          <w:color w:val="FFFFFF"/>
-          <w:sz w:val="2"/>
-          <w:lang w:val="fr-FR"/>
-        </w:rPr>
-        <w:t>_OPERATION_TABLE]</w:t>
+        <w:t>[TABLE:AUTONOMOUS_OPERATION_TABLE]</w:t>
       </w:r>
     </w:p>
     <w:tbl>
@@ -5896,25 +5186,7 @@
           <w:sz w:val="2"/>
           <w:lang w:val="fr-FR"/>
         </w:rPr>
-        <w:t>[</w:t>
-      </w:r>
-      <w:proofErr w:type="gramStart"/>
-      <w:r>
-        <w:rPr>
-          <w:color w:val="FFFFFF"/>
-          <w:sz w:val="2"/>
-          <w:lang w:val="fr-FR"/>
-        </w:rPr>
-        <w:t>TABLE:AVAILABILITY</w:t>
-      </w:r>
-      <w:proofErr w:type="gramEnd"/>
-      <w:r>
-        <w:rPr>
-          <w:color w:val="FFFFFF"/>
-          <w:sz w:val="2"/>
-          <w:lang w:val="fr-FR"/>
-        </w:rPr>
-        <w:t>_TABLE]</w:t>
+        <w:t>[TABLE:AVAILABILITY_TABLE]</w:t>
       </w:r>
     </w:p>
     <w:tbl>
@@ -6180,7 +5452,6 @@
         <w:pStyle w:val="Titre1"/>
       </w:pPr>
       <w:r>
-        <w:lastRenderedPageBreak/>
         <w:t>Annex</w:t>
       </w:r>
     </w:p>
@@ -6193,6 +5464,11 @@
       </w:r>
     </w:p>
     <w:p>
+      <w:r>
+        <w:t>{{wind_rose_visualizer}}</w:t>
+      </w:r>
+    </w:p>
+    <w:p>
       <w:pPr>
         <w:pStyle w:val="Titre2"/>
       </w:pPr>
@@ -6201,6 +5477,11 @@
       </w:r>
     </w:p>
     <w:p>
+      <w:r>
+        <w:t>{{wind_bin_visualizer}}</w:t>
+      </w:r>
+    </w:p>
+    <w:p>
       <w:pPr>
         <w:pStyle w:val="Titre2"/>
       </w:pPr>
@@ -6209,19 +5490,35 @@
       </w:r>
     </w:p>
     <w:p>
+      <w:r>
+        <w:t>{{power_curve_visualizer}}</w:t>
+      </w:r>
+    </w:p>
+    <w:p>
       <w:pPr>
         <w:pStyle w:val="Titre2"/>
       </w:pPr>
       <w:r>
+        <w:lastRenderedPageBreak/>
         <w:t>Data Heatmap</w:t>
       </w:r>
     </w:p>
     <w:p>
+      <w:r>
+        <w:t>{{heat_map_visualizer}}</w:t>
+      </w:r>
+    </w:p>
+    <w:p>
       <w:pPr>
         <w:pStyle w:val="Titre2"/>
       </w:pPr>
       <w:r>
         <w:t>Timeline</w:t>
+      </w:r>
+    </w:p>
+    <w:p>
+      <w:r>
+        <w:t>{{cut_in_cut_out_timeline_visualizer}}</w:t>
       </w:r>
     </w:p>
     <w:sectPr>

</xml_diff>

<commit_message>
[CHANGE] implement the content of the code to handle to runtest of the text
</commit_message>
<xml_diff>
--- a/assets/templates/template_runtest.docx
+++ b/assets/templates/template_runtest.docx
@@ -5500,19 +5500,6 @@
       </w:pPr>
       <w:r>
         <w:lastRenderedPageBreak/>
-        <w:t>Data Heatmap</w:t>
-      </w:r>
-    </w:p>
-    <w:p>
-      <w:r>
-        <w:t>{{heat_map_visualizer}}</w:t>
-      </w:r>
-    </w:p>
-    <w:p>
-      <w:pPr>
-        <w:pStyle w:val="Titre2"/>
-      </w:pPr>
-      <w:r>
         <w:t>Timeline</w:t>
       </w:r>
     </w:p>

</xml_diff>